<commit_message>
docs: mega-purificación legal, tipificación estricta Art 56b e idoneidad subsumida
</commit_message>
<xml_diff>
--- a/productos (resoluciones) elaborada por google antigravity/ADM 2142-2026 R2.docx
+++ b/productos (resoluciones) elaborada por google antigravity/ADM 2142-2026 R2.docx
@@ -8,7 +8,7 @@
           <w:tab w:val="left" w:pos="1701"/>
           <w:tab w:val="left" w:pos="2132"/>
         </w:tabs>
-        <w:spacing w:line="240" w:lineRule="auto"/>
+        <w:spacing w:after="0" w:line="240" w:lineRule="auto"/>
         <w:ind w:left="2132" w:hanging="2132"/>
         <w:rPr>
           <w:rFonts w:ascii="Arial Narrow" w:hAnsi="Arial Narrow"/>
@@ -97,7 +97,7 @@
           <w:tab w:val="left" w:pos="1701"/>
           <w:tab w:val="left" w:pos="2132"/>
         </w:tabs>
-        <w:spacing w:line="240" w:lineRule="auto"/>
+        <w:spacing w:after="0" w:line="240" w:lineRule="auto"/>
         <w:ind w:left="2132" w:hanging="2132"/>
         <w:rPr>
           <w:rFonts w:ascii="Arial Narrow" w:hAnsi="Arial Narrow"/>
@@ -116,7 +116,7 @@
           <w:tab w:val="left" w:pos="1701"/>
           <w:tab w:val="left" w:pos="2132"/>
         </w:tabs>
-        <w:spacing w:line="240" w:lineRule="auto"/>
+        <w:spacing w:after="0" w:line="240" w:lineRule="auto"/>
         <w:ind w:left="2132" w:hanging="2132"/>
         <w:rPr>
           <w:rFonts w:ascii="Arial Narrow" w:hAnsi="Arial Narrow"/>
@@ -135,7 +135,7 @@
           <w:tab w:val="left" w:pos="1701"/>
           <w:tab w:val="left" w:pos="2132"/>
         </w:tabs>
-        <w:spacing w:line="240" w:lineRule="auto"/>
+        <w:spacing w:after="0" w:line="240" w:lineRule="auto"/>
         <w:ind w:left="2132" w:hanging="2132"/>
         <w:rPr>
           <w:rFonts w:ascii="Arial Narrow" w:hAnsi="Arial Narrow"/>
@@ -154,7 +154,7 @@
           <w:tab w:val="left" w:pos="1701"/>
           <w:tab w:val="left" w:pos="2132"/>
         </w:tabs>
-        <w:spacing w:line="240" w:lineRule="auto"/>
+        <w:spacing w:after="0" w:line="240" w:lineRule="auto"/>
         <w:ind w:left="2132" w:hanging="2132"/>
         <w:rPr>
           <w:rFonts w:ascii="Arial Narrow" w:hAnsi="Arial Narrow"/>
@@ -180,7 +180,7 @@
           <w:tab w:val="left" w:pos="1701"/>
           <w:tab w:val="left" w:pos="2132"/>
         </w:tabs>
-        <w:spacing w:line="240" w:lineRule="auto"/>
+        <w:spacing w:after="0" w:line="240" w:lineRule="auto"/>
         <w:ind w:left="2132" w:hanging="2132"/>
         <w:rPr>
           <w:rFonts w:ascii="Arial Narrow" w:hAnsi="Arial Narrow"/>
@@ -199,7 +199,7 @@
           <w:tab w:val="left" w:pos="1701"/>
           <w:tab w:val="left" w:pos="2132"/>
         </w:tabs>
-        <w:spacing w:line="240" w:lineRule="auto"/>
+        <w:spacing w:after="0" w:line="240" w:lineRule="auto"/>
         <w:ind w:left="2132" w:hanging="2132"/>
         <w:rPr>
           <w:rFonts w:ascii="Arial Narrow" w:hAnsi="Arial Narrow"/>
@@ -208,11 +208,7 @@
     </w:p>
     <w:p>
       <w:pPr>
-        <w:tabs>
-          <w:tab w:val="left" w:pos="1701"/>
-          <w:tab w:val="left" w:pos="2132"/>
-        </w:tabs>
-        <w:spacing w:line="240" w:lineRule="auto"/>
+        <w:spacing w:after="0" w:line="240" w:lineRule="auto"/>
         <w:rPr>
           <w:rFonts w:ascii="Arial Narrow" w:hAnsi="Arial Narrow"/>
         </w:rPr>
@@ -226,23 +222,18 @@
     </w:p>
     <w:p>
       <w:pPr>
-        <w:tabs>
-          <w:tab w:val="left" w:pos="1701"/>
-          <w:tab w:val="left" w:pos="2132"/>
-        </w:tabs>
-        <w:spacing w:line="240" w:lineRule="auto"/>
-        <w:rPr>
-          <w:rFonts w:ascii="Arial Narrow" w:hAnsi="Arial Narrow"/>
-        </w:rPr>
-      </w:pPr>
-    </w:p>
-    <w:p>
-      <w:pPr>
-        <w:tabs>
-          <w:tab w:val="left" w:pos="1701"/>
-          <w:tab w:val="left" w:pos="2132"/>
-        </w:tabs>
-        <w:spacing w:line="240" w:lineRule="auto"/>
+        <w:spacing w:after="0" w:line="240" w:lineRule="auto"/>
+        <w:rPr>
+          <w:rFonts w:ascii="Arial Narrow" w:hAnsi="Arial Narrow"/>
+        </w:rPr>
+      </w:pPr>
+    </w:p>
+    <w:p>
+      <w:pPr>
+        <w:tabs>
+          <w:tab w:val="left" w:pos="567"/>
+        </w:tabs>
+        <w:spacing w:after="0" w:line="240" w:lineRule="auto"/>
         <w:ind w:left="567" w:hanging="567"/>
         <w:rPr>
           <w:rFonts w:ascii="Arial Narrow" w:hAnsi="Arial Narrow"/>
@@ -265,10 +256,11 @@
     <w:p>
       <w:pPr>
         <w:tabs>
-          <w:tab w:val="left" w:pos="1701"/>
-          <w:tab w:val="left" w:pos="2132"/>
-        </w:tabs>
-        <w:spacing w:line="240" w:lineRule="auto"/>
+          <w:tab w:val="left" w:pos="567"/>
+        </w:tabs>
+        <w:spacing w:after="0" w:line="240" w:lineRule="auto"/>
+        <w:ind w:left="567" w:hanging="567"/>
+        <w:jc w:val="both"/>
         <w:rPr>
           <w:rFonts w:ascii="Arial Narrow" w:hAnsi="Arial Narrow"/>
         </w:rPr>
@@ -284,7 +276,7 @@
           <w:rFonts w:ascii="Arial Narrow" w:hAnsi="Arial Narrow"/>
         </w:rPr>
         <w:tab/>
-        <w:t>Mediante la denuncia del 22 de abril de 2026</w:t>
+        <w:t>Mediante la denuncia</w:t>
       </w:r>
       <w:r>
         <w:rPr>
@@ -296,7 +288,7 @@
         <w:rPr>
           <w:rFonts w:ascii="Arial Narrow" w:hAnsi="Arial Narrow"/>
         </w:rPr>
-        <w:t xml:space="preserve"> y el escrito de subsanación del 26 de junio de 2026, el señor Coronel denunció a La Positiva por presunta infracción a la Ley N° 29571, Código de Protección y Defensa del Consumidor (en adelante, Código)</w:t>
+        <w:t xml:space="preserve"> del 22 de abril de 2026, el señor Efraín Coronel Quispe (en adelante, el señor Coronel) denunció a La Positiva Seguros y Reaseguros S.A.A. (en adelante, la compañía aseguradora) por presuntas infracciones a la Ley N° 29571, Código de Protección y Defensa del Consumidor</w:t>
       </w:r>
       <w:r>
         <w:rPr>
@@ -308,16 +300,15 @@
         <w:rPr>
           <w:rFonts w:ascii="Arial Narrow" w:hAnsi="Arial Narrow"/>
         </w:rPr>
-        <w:t>, señalando lo siguiente:</w:t>
-      </w:r>
-    </w:p>
-    <w:p>
-      <w:pPr>
-        <w:tabs>
-          <w:tab w:val="left" w:pos="1701"/>
-          <w:tab w:val="left" w:pos="2132"/>
-        </w:tabs>
-        <w:spacing w:line="240" w:lineRule="auto"/>
+        <w:t xml:space="preserve"> (en adelante, el Código), señalando lo siguiente:</w:t>
+      </w:r>
+    </w:p>
+    <w:p>
+      <w:pPr>
+        <w:tabs>
+          <w:tab w:val="left" w:pos="1134"/>
+        </w:tabs>
+        <w:spacing w:after="0" w:line="240" w:lineRule="auto"/>
         <w:ind w:left="1134" w:hanging="567"/>
         <w:jc w:val="both"/>
         <w:rPr>
@@ -335,16 +326,15 @@
           <w:rFonts w:ascii="Arial Narrow" w:hAnsi="Arial Narrow"/>
         </w:rPr>
         <w:tab/>
-        <w:t>El 06 de julio de 2023, contrató un seguro vehicular con la compañía aseguradora, respecto del vehículo de placa de rodaje BVO-787; sin embargo, al momento de la contratación, no le habrían brindado información clara y suficiente sobre las alternativas contractuales y las exclusiones del seguro vehicular.</w:t>
-      </w:r>
-    </w:p>
-    <w:p>
-      <w:pPr>
-        <w:tabs>
-          <w:tab w:val="left" w:pos="1701"/>
-          <w:tab w:val="left" w:pos="2132"/>
-        </w:tabs>
-        <w:spacing w:line="240" w:lineRule="auto"/>
+        <w:t>El 06 de julio de 2023, el señor Coronel contrató un seguro vehicular con la compañía aseguradora, respecto del vehículo de placa de rodaje BVO-787.</w:t>
+      </w:r>
+    </w:p>
+    <w:p>
+      <w:pPr>
+        <w:tabs>
+          <w:tab w:val="left" w:pos="1134"/>
+        </w:tabs>
+        <w:spacing w:after="0" w:line="240" w:lineRule="auto"/>
         <w:ind w:left="1134" w:hanging="567"/>
         <w:jc w:val="both"/>
         <w:rPr>
@@ -362,16 +352,15 @@
           <w:rFonts w:ascii="Arial Narrow" w:hAnsi="Arial Narrow"/>
         </w:rPr>
         <w:tab/>
-        <w:t>El 22 de mayo de 2024, el vehículo fue objeto de robo total; no obstante, la compañía aseguradora se habría negado a otorgar al denunciante la cobertura del siniestro de robo total de la póliza del seguro vehicular, argumentando que el vehículo era utilizado para alquiler.</w:t>
-      </w:r>
-    </w:p>
-    <w:p>
-      <w:pPr>
-        <w:tabs>
-          <w:tab w:val="left" w:pos="1701"/>
-          <w:tab w:val="left" w:pos="2132"/>
-        </w:tabs>
-        <w:spacing w:line="240" w:lineRule="auto"/>
+        <w:t>El 22 de mayo de 2024, el vehículo fue objeto de robo total; no obstante, la compañía aseguradora se habría negado a otorgar al denunciante la cobertura del siniestro de robo total de la póliza del seguro vehicular, argumentando que el vehículo era utilizado para alquiler, basándose en una exclusión sobre la cual, según señala el denunciante, no se le habría brindado información clara y suficiente al momento de la contratación.</w:t>
+      </w:r>
+    </w:p>
+    <w:p>
+      <w:pPr>
+        <w:tabs>
+          <w:tab w:val="left" w:pos="1134"/>
+        </w:tabs>
+        <w:spacing w:after="0" w:line="240" w:lineRule="auto"/>
         <w:ind w:left="1134" w:hanging="567"/>
         <w:jc w:val="both"/>
         <w:rPr>
@@ -395,245 +384,656 @@
     <w:p>
       <w:pPr>
         <w:tabs>
-          <w:tab w:val="left" w:pos="1701"/>
-          <w:tab w:val="left" w:pos="2132"/>
-        </w:tabs>
-        <w:spacing w:line="240" w:lineRule="auto"/>
+          <w:tab w:val="left" w:pos="567"/>
+        </w:tabs>
+        <w:spacing w:after="0" w:line="240" w:lineRule="auto"/>
+        <w:ind w:left="567" w:hanging="567"/>
+        <w:jc w:val="both"/>
+        <w:rPr>
+          <w:rFonts w:ascii="Arial Narrow" w:hAnsi="Arial Narrow"/>
+        </w:rPr>
+      </w:pPr>
+      <w:r>
+        <w:rPr>
+          <w:rFonts w:ascii="Arial Narrow" w:hAnsi="Arial Narrow"/>
+        </w:rPr>
+        <w:t>2.</w:t>
+      </w:r>
+      <w:r>
+        <w:rPr>
+          <w:rFonts w:ascii="Arial Narrow" w:hAnsi="Arial Narrow"/>
+        </w:rPr>
+        <w:tab/>
+        <w:t>El señor Coronel solicitó en calidad de medida correctiva que la compañía aseguradora cumpla con otorgar la cobertura del siniestro por robo total; y, consecuentemente, devolver los importes cobrados por la renovación del seguro vehicular. Asimismo, solicitó el reembolso de costos y costas del presente procedimiento.</w:t>
+      </w:r>
+    </w:p>
+    <w:p>
+      <w:pPr>
+        <w:tabs>
+          <w:tab w:val="left" w:pos="567"/>
+        </w:tabs>
+        <w:spacing w:after="0" w:line="240" w:lineRule="auto"/>
+        <w:ind w:left="567" w:hanging="567"/>
+        <w:jc w:val="both"/>
+        <w:rPr>
+          <w:rFonts w:ascii="Arial Narrow" w:hAnsi="Arial Narrow"/>
+        </w:rPr>
+      </w:pPr>
+    </w:p>
+    <w:p>
+      <w:pPr>
+        <w:tabs>
+          <w:tab w:val="left" w:pos="567"/>
+        </w:tabs>
+        <w:spacing w:after="0" w:line="240" w:lineRule="auto"/>
+        <w:ind w:left="567" w:hanging="567"/>
+        <w:rPr>
+          <w:rFonts w:ascii="Arial Narrow" w:hAnsi="Arial Narrow"/>
+        </w:rPr>
+      </w:pPr>
+      <w:r>
+        <w:rPr>
+          <w:rFonts w:ascii="Arial Narrow" w:hAnsi="Arial Narrow"/>
+        </w:rPr>
+        <w:t>II.</w:t>
+      </w:r>
+      <w:r>
+        <w:rPr>
+          <w:rFonts w:ascii="Arial Narrow" w:hAnsi="Arial Narrow"/>
+        </w:rPr>
+        <w:tab/>
+        <w:t>DE LA ADMISIÓN A TRÁMITE DE LA DENUNCIA</w:t>
+      </w:r>
+    </w:p>
+    <w:p>
+      <w:pPr>
+        <w:tabs>
+          <w:tab w:val="left" w:pos="567"/>
+        </w:tabs>
+        <w:spacing w:after="0" w:line="240" w:lineRule="auto"/>
+        <w:ind w:left="567" w:hanging="567"/>
+        <w:jc w:val="both"/>
+        <w:rPr>
+          <w:rFonts w:ascii="Arial Narrow" w:hAnsi="Arial Narrow"/>
+        </w:rPr>
+      </w:pPr>
+      <w:r>
+        <w:rPr>
+          <w:rFonts w:ascii="Arial Narrow" w:hAnsi="Arial Narrow"/>
+        </w:rPr>
+        <w:t>3.</w:t>
+      </w:r>
+      <w:r>
+        <w:rPr>
+          <w:rFonts w:ascii="Arial Narrow" w:hAnsi="Arial Narrow"/>
+        </w:rPr>
+        <w:tab/>
+        <w:t>La Secretaría Técnica de la Comisión de Protección al Consumidor N°1 (en adelante, la Secretaría Técnica), en ejercicio de sus facultades</w:t>
+      </w:r>
+      <w:r>
+        <w:rPr>
+          <w:rStyle w:val="Refdenotaalpie"/>
+        </w:rPr>
+        <w:footnoteReference w:id="3"/>
+      </w:r>
+      <w:r>
+        <w:rPr>
+          <w:rFonts w:ascii="Arial Narrow" w:hAnsi="Arial Narrow"/>
+        </w:rPr>
+        <w:t xml:space="preserve">, considera que el hecho denunciado, consistente en que la </w:t>
+      </w:r>
+      <w:r>
+        <w:rPr>
+          <w:rFonts w:ascii="Arial Narrow" w:hAnsi="Arial Narrow"/>
+        </w:rPr>
+        <w:lastRenderedPageBreak/>
+        <w:t>compañía aseguradora se habría negado a otorgar al denunciante la cobertura del siniestro de robo total de la póliza del seguro vehicular, argumentando que el vehículo era utilizado para alquiler; involucraría una presunta afectación a sus expectativas, quien no habría encontrado una correspondencia entre lo que esperaba recibir de parte del proveedor y lo que realmente recibió. Por consiguiente, corresponde calificar el hecho como una presunta infracción al deber de idoneidad, tipificado en los artículos 18° y 19° del Código.</w:t>
+      </w:r>
+    </w:p>
+    <w:p>
+      <w:pPr>
+        <w:tabs>
+          <w:tab w:val="left" w:pos="567"/>
+        </w:tabs>
+        <w:spacing w:after="0" w:line="240" w:lineRule="auto"/>
+        <w:ind w:left="567" w:hanging="567"/>
+        <w:jc w:val="both"/>
+        <w:rPr>
+          <w:rFonts w:ascii="Arial Narrow" w:hAnsi="Arial Narrow"/>
+        </w:rPr>
+      </w:pPr>
+      <w:r>
+        <w:rPr>
+          <w:rFonts w:ascii="Arial Narrow" w:hAnsi="Arial Narrow"/>
+        </w:rPr>
+        <w:t>4.</w:t>
+      </w:r>
+      <w:r>
+        <w:rPr>
+          <w:rFonts w:ascii="Arial Narrow" w:hAnsi="Arial Narrow"/>
+        </w:rPr>
+        <w:tab/>
+        <w:t>Además, considera que el hecho denunciado, consistente en que la compañía aseguradora habría continuado realizando cobros en la tarjeta CMR del señor Coronel por concepto de la renovación automática no solicitada de la póliza de seguro vehicular, por el periodo hasta julio de 2025. Por consiguiente, corresponde calificar el hecho como una presunta infracción al deber de protección contra los métodos comerciales coercitivos, tipificado en el literal b) del artículo 56° del Código</w:t>
+      </w:r>
+      <w:r>
+        <w:rPr>
+          <w:rStyle w:val="Refdenotaalpie"/>
+        </w:rPr>
+        <w:footnoteReference w:id="4"/>
+      </w:r>
+      <w:r>
+        <w:rPr>
+          <w:rFonts w:ascii="Arial Narrow" w:hAnsi="Arial Narrow"/>
+        </w:rPr>
+        <w:t>.</w:t>
+      </w:r>
+    </w:p>
+    <w:p>
+      <w:pPr>
+        <w:tabs>
+          <w:tab w:val="left" w:pos="567"/>
+        </w:tabs>
+        <w:spacing w:after="0" w:line="240" w:lineRule="auto"/>
+        <w:ind w:left="567" w:hanging="567"/>
+        <w:jc w:val="both"/>
+        <w:rPr>
+          <w:rFonts w:ascii="Arial Narrow" w:hAnsi="Arial Narrow"/>
+        </w:rPr>
+      </w:pPr>
+      <w:r>
+        <w:rPr>
+          <w:rFonts w:ascii="Arial Narrow" w:hAnsi="Arial Narrow"/>
+        </w:rPr>
+        <w:t>5.</w:t>
+      </w:r>
+      <w:r>
+        <w:rPr>
+          <w:rFonts w:ascii="Arial Narrow" w:hAnsi="Arial Narrow"/>
+        </w:rPr>
+        <w:tab/>
+        <w:t>En tanto la denuncia reúne los requisitos establecidos por la norma citada, corresponde admitirla a trámite</w:t>
+      </w:r>
+      <w:r>
+        <w:rPr>
+          <w:rStyle w:val="Refdenotaalpie"/>
+        </w:rPr>
+        <w:footnoteReference w:id="5"/>
+      </w:r>
+      <w:r>
+        <w:rPr>
+          <w:rFonts w:ascii="Arial Narrow" w:hAnsi="Arial Narrow"/>
+        </w:rPr>
+        <w:t>.</w:t>
+      </w:r>
+    </w:p>
+    <w:p>
+      <w:pPr>
+        <w:tabs>
+          <w:tab w:val="left" w:pos="567"/>
+        </w:tabs>
+        <w:spacing w:after="0" w:line="240" w:lineRule="auto"/>
+        <w:ind w:left="567" w:hanging="567"/>
+        <w:jc w:val="both"/>
+        <w:rPr>
+          <w:rFonts w:ascii="Arial Narrow" w:hAnsi="Arial Narrow"/>
+        </w:rPr>
+      </w:pPr>
+    </w:p>
+    <w:p>
+      <w:pPr>
+        <w:tabs>
+          <w:tab w:val="left" w:pos="567"/>
+        </w:tabs>
+        <w:spacing w:after="0" w:line="240" w:lineRule="auto"/>
+        <w:ind w:left="567" w:hanging="567"/>
+        <w:rPr>
+          <w:rFonts w:ascii="Arial Narrow" w:hAnsi="Arial Narrow"/>
+        </w:rPr>
+      </w:pPr>
+      <w:r>
+        <w:rPr>
+          <w:rFonts w:ascii="Arial Narrow" w:hAnsi="Arial Narrow"/>
+        </w:rPr>
+        <w:t>III.</w:t>
+      </w:r>
+      <w:r>
+        <w:rPr>
+          <w:rFonts w:ascii="Arial Narrow" w:hAnsi="Arial Narrow"/>
+        </w:rPr>
+        <w:tab/>
+        <w:t>REQUERIMIENTO DE INFORMACIÓN</w:t>
+      </w:r>
+    </w:p>
+    <w:p>
+      <w:pPr>
+        <w:tabs>
+          <w:tab w:val="left" w:pos="567"/>
+        </w:tabs>
+        <w:spacing w:after="0" w:line="240" w:lineRule="auto"/>
+        <w:ind w:left="567" w:hanging="567"/>
+        <w:jc w:val="both"/>
+        <w:rPr>
+          <w:rFonts w:ascii="Arial Narrow" w:hAnsi="Arial Narrow"/>
+        </w:rPr>
+      </w:pPr>
+      <w:r>
+        <w:rPr>
+          <w:rFonts w:ascii="Arial Narrow" w:hAnsi="Arial Narrow"/>
+        </w:rPr>
+        <w:t>6.</w:t>
+      </w:r>
+      <w:r>
+        <w:rPr>
+          <w:rFonts w:ascii="Arial Narrow" w:hAnsi="Arial Narrow"/>
+        </w:rPr>
+        <w:tab/>
+        <w:t>A efectos de tener mayores elementos que sirvan para la resolución definitiva del presente caso, la Secretaría Técnica, en ejercicio de las facultades que la ley le confiere, conviene requerir a la compañía aseguradora que, en un plazo no mayor de cinco (5) días hábiles contado a partir del día siguiente de la notificación de la presente resolución, cumpla con presentar lo siguiente:</w:t>
+      </w:r>
+    </w:p>
+    <w:p>
+      <w:pPr>
+        <w:tabs>
+          <w:tab w:val="left" w:pos="1134"/>
+        </w:tabs>
+        <w:spacing w:after="0" w:line="240" w:lineRule="auto"/>
         <w:ind w:left="1134" w:hanging="567"/>
         <w:jc w:val="both"/>
         <w:rPr>
           <w:rFonts w:ascii="Arial Narrow" w:hAnsi="Arial Narrow"/>
         </w:rPr>
       </w:pPr>
-    </w:p>
-    <w:p>
-      <w:pPr>
-        <w:tabs>
-          <w:tab w:val="left" w:pos="1701"/>
-          <w:tab w:val="left" w:pos="2132"/>
-        </w:tabs>
-        <w:spacing w:line="240" w:lineRule="auto"/>
-        <w:ind w:left="567" w:hanging="567"/>
-        <w:jc w:val="both"/>
-        <w:rPr>
-          <w:rFonts w:ascii="Arial Narrow" w:hAnsi="Arial Narrow"/>
-        </w:rPr>
-      </w:pPr>
-      <w:r>
-        <w:rPr>
-          <w:rFonts w:ascii="Arial Narrow" w:hAnsi="Arial Narrow"/>
-        </w:rPr>
-        <w:t>2.</w:t>
-      </w:r>
-      <w:r>
-        <w:rPr>
-          <w:rFonts w:ascii="Arial Narrow" w:hAnsi="Arial Narrow"/>
-        </w:rPr>
-        <w:tab/>
-        <w:t>El señor Coronel solicitó, en calidad de medida correctiva, que la compañía aseguradora cumpla con: (i) otorgar la cobertura del seguro vehicular por el siniestro de robo total ocurrido el 22 de mayo de 2024; (ii) el pago de la suma asegurada conforme a la póliza (USD 12 450,00); y, (iii) la devolución de los cobros indebidos. Asimismo, requirió de manera expresa el reembolso de las costas y costos del presente procedimiento.</w:t>
-      </w:r>
-    </w:p>
-    <w:p>
-      <w:pPr>
-        <w:tabs>
-          <w:tab w:val="left" w:pos="1701"/>
-          <w:tab w:val="left" w:pos="2132"/>
-        </w:tabs>
-        <w:spacing w:line="240" w:lineRule="auto"/>
-        <w:ind w:left="567" w:hanging="567"/>
-        <w:jc w:val="both"/>
-        <w:rPr>
-          <w:rFonts w:ascii="Arial Narrow" w:hAnsi="Arial Narrow"/>
-        </w:rPr>
-      </w:pPr>
-    </w:p>
-    <w:p>
-      <w:pPr>
-        <w:tabs>
-          <w:tab w:val="left" w:pos="1701"/>
-          <w:tab w:val="left" w:pos="2132"/>
-        </w:tabs>
-        <w:spacing w:line="240" w:lineRule="auto"/>
-        <w:ind w:left="567" w:hanging="567"/>
-        <w:rPr>
-          <w:rFonts w:ascii="Arial Narrow" w:hAnsi="Arial Narrow"/>
-        </w:rPr>
-      </w:pPr>
+      <w:r>
+        <w:rPr>
+          <w:rFonts w:ascii="Arial Narrow" w:hAnsi="Arial Narrow"/>
+        </w:rPr>
+        <w:t>(i)</w:t>
+      </w:r>
+      <w:r>
+        <w:rPr>
+          <w:rFonts w:ascii="Arial Narrow" w:hAnsi="Arial Narrow"/>
+        </w:rPr>
+        <w:tab/>
+        <w:t>Una copia completa, legible y debidamente suscrita de la póliza de seguro vehicular y sus anexos;</w:t>
+      </w:r>
+    </w:p>
+    <w:p>
+      <w:pPr>
+        <w:tabs>
+          <w:tab w:val="left" w:pos="1134"/>
+        </w:tabs>
+        <w:spacing w:after="0" w:line="240" w:lineRule="auto"/>
+        <w:ind w:left="1134" w:hanging="567"/>
+        <w:jc w:val="both"/>
+        <w:rPr>
+          <w:rFonts w:ascii="Arial Narrow" w:hAnsi="Arial Narrow"/>
+        </w:rPr>
+      </w:pPr>
+      <w:r>
+        <w:rPr>
+          <w:rFonts w:ascii="Arial Narrow" w:hAnsi="Arial Narrow"/>
+        </w:rPr>
+        <w:t>(ii)</w:t>
+      </w:r>
+      <w:r>
+        <w:rPr>
+          <w:rFonts w:ascii="Arial Narrow" w:hAnsi="Arial Narrow"/>
+        </w:rPr>
+        <w:tab/>
+        <w:t>Los medios probatorios que acrediten que la negativa de otorgamiento de cobertura fue justificada; y,</w:t>
+      </w:r>
+    </w:p>
+    <w:p>
+      <w:pPr>
+        <w:tabs>
+          <w:tab w:val="left" w:pos="1134"/>
+        </w:tabs>
+        <w:spacing w:after="0" w:line="240" w:lineRule="auto"/>
+        <w:ind w:left="1134" w:hanging="567"/>
+        <w:jc w:val="both"/>
+        <w:rPr>
+          <w:rFonts w:ascii="Arial Narrow" w:hAnsi="Arial Narrow"/>
+        </w:rPr>
+      </w:pPr>
+      <w:r>
+        <w:rPr>
+          <w:rFonts w:ascii="Arial Narrow" w:hAnsi="Arial Narrow"/>
+        </w:rPr>
+        <w:t>(iii)</w:t>
+      </w:r>
+      <w:r>
+        <w:rPr>
+          <w:rFonts w:ascii="Arial Narrow" w:hAnsi="Arial Narrow"/>
+        </w:rPr>
+        <w:tab/>
+        <w:t>Todas las comunicaciones cursadas con la parte denunciante en virtud de los hechos materia de denuncia.</w:t>
+      </w:r>
+    </w:p>
+    <w:p>
+      <w:pPr>
+        <w:tabs>
+          <w:tab w:val="left" w:pos="1134"/>
+        </w:tabs>
+        <w:spacing w:after="0" w:line="240" w:lineRule="auto"/>
+        <w:ind w:left="1134" w:hanging="567"/>
+        <w:jc w:val="both"/>
+        <w:rPr>
+          <w:rFonts w:ascii="Arial Narrow" w:hAnsi="Arial Narrow"/>
+        </w:rPr>
+      </w:pPr>
+    </w:p>
+    <w:p>
+      <w:pPr>
+        <w:tabs>
+          <w:tab w:val="left" w:pos="567"/>
+        </w:tabs>
+        <w:spacing w:after="0" w:line="240" w:lineRule="auto"/>
+        <w:ind w:left="567" w:hanging="567"/>
+        <w:rPr>
+          <w:rFonts w:ascii="Arial Narrow" w:hAnsi="Arial Narrow"/>
+        </w:rPr>
+      </w:pPr>
+      <w:r>
+        <w:rPr>
+          <w:rFonts w:ascii="Arial Narrow" w:hAnsi="Arial Narrow"/>
+        </w:rPr>
+        <w:t>IV.</w:t>
+      </w:r>
+      <w:r>
+        <w:rPr>
+          <w:rFonts w:ascii="Arial Narrow" w:hAnsi="Arial Narrow"/>
+        </w:rPr>
+        <w:tab/>
+        <w:t>RESOLUCIÓN DE LA SECRETARÍA TÉCNICA</w:t>
+      </w:r>
+    </w:p>
+    <w:p>
+      <w:pPr>
+        <w:tabs>
+          <w:tab w:val="left" w:pos="567"/>
+        </w:tabs>
+        <w:spacing w:after="0" w:line="240" w:lineRule="auto"/>
+        <w:ind w:left="567" w:hanging="567"/>
+        <w:jc w:val="both"/>
+        <w:rPr>
+          <w:rFonts w:ascii="Arial Narrow" w:hAnsi="Arial Narrow"/>
+        </w:rPr>
+      </w:pPr>
+      <w:r>
+        <w:rPr>
+          <w:rFonts w:ascii="Arial Narrow" w:hAnsi="Arial Narrow"/>
+        </w:rPr>
+        <w:t>PRIMERO: admitir a trámite la denuncia del 22 de abril de 2026, interpuesta por el señor Efraín Coronel Quispe contra La Positiva Seguros y Reaseguros S.A.A., por presuntas infracciones a la Ley N° 29571, Código de Protección y Defensa del Consumidor; imputándosele los siguientes cargos:</w:t>
+      </w:r>
+    </w:p>
+    <w:p>
+      <w:pPr>
+        <w:tabs>
+          <w:tab w:val="left" w:pos="567"/>
+        </w:tabs>
+        <w:spacing w:after="0" w:line="240" w:lineRule="auto"/>
+        <w:ind w:left="567" w:hanging="567"/>
+        <w:jc w:val="both"/>
+        <w:rPr>
+          <w:rFonts w:ascii="Arial Narrow" w:hAnsi="Arial Narrow"/>
+        </w:rPr>
+      </w:pPr>
+      <w:r>
+        <w:rPr>
+          <w:rFonts w:ascii="Arial Narrow" w:hAnsi="Arial Narrow"/>
+        </w:rPr>
+        <w:t>(i)</w:t>
+      </w:r>
+      <w:r>
+        <w:rPr>
+          <w:rFonts w:ascii="Arial Narrow" w:hAnsi="Arial Narrow"/>
+        </w:rPr>
+        <w:tab/>
+        <w:t>Presunta infracción a los artículos 18° y 19° de la Ley N° 29571, Código de Protección y Defensa del Consumidor, en tanto La Positiva Seguros y Reaseguros S.A.A. se habría negado a otorgar al denunciante la cobertura del siniestro de robo total de la póliza del seguro vehicular, argumentando que el vehículo era utilizado para alquiler.</w:t>
+      </w:r>
+    </w:p>
+    <w:p>
+      <w:pPr>
+        <w:tabs>
+          <w:tab w:val="left" w:pos="567"/>
+        </w:tabs>
+        <w:spacing w:after="0" w:line="240" w:lineRule="auto"/>
+        <w:ind w:left="567" w:hanging="567"/>
+        <w:jc w:val="both"/>
+        <w:rPr>
+          <w:rFonts w:ascii="Arial Narrow" w:hAnsi="Arial Narrow"/>
+        </w:rPr>
+      </w:pPr>
+      <w:r>
+        <w:rPr>
+          <w:rFonts w:ascii="Arial Narrow" w:hAnsi="Arial Narrow"/>
+        </w:rPr>
+        <w:t>(ii)</w:t>
+      </w:r>
+      <w:r>
+        <w:rPr>
+          <w:rFonts w:ascii="Arial Narrow" w:hAnsi="Arial Narrow"/>
+        </w:rPr>
+        <w:tab/>
+        <w:t>Presunta infracción al literal b) del artículo 56° de la Ley N° 29571, Código de Protección y Defensa del Consumidor, en tanto La Positiva Seguros y Reaseguros S.A.A. habría continuado realizando cobros en la tarjeta CMR del señor Coronel por concepto de la renovación automática no solicitada de la póliza de seguro vehicular, por el periodo hasta julio de 2025.</w:t>
+      </w:r>
+    </w:p>
+    <w:p>
+      <w:pPr>
+        <w:tabs>
+          <w:tab w:val="left" w:pos="567"/>
+        </w:tabs>
+        <w:spacing w:after="0" w:line="240" w:lineRule="auto"/>
+        <w:ind w:left="567" w:hanging="567"/>
+        <w:jc w:val="both"/>
+        <w:rPr>
+          <w:rFonts w:ascii="Arial Narrow" w:hAnsi="Arial Narrow"/>
+        </w:rPr>
+      </w:pPr>
+    </w:p>
+    <w:p>
+      <w:pPr>
+        <w:tabs>
+          <w:tab w:val="left" w:pos="567"/>
+        </w:tabs>
+        <w:spacing w:after="0" w:line="240" w:lineRule="auto"/>
+        <w:ind w:left="567" w:hanging="567"/>
+        <w:jc w:val="both"/>
+        <w:rPr>
+          <w:rFonts w:ascii="Arial Narrow" w:hAnsi="Arial Narrow"/>
+        </w:rPr>
+      </w:pPr>
+      <w:r>
+        <w:rPr>
+          <w:rFonts w:ascii="Arial Narrow" w:hAnsi="Arial Narrow"/>
+        </w:rPr>
+        <w:t>SEGUNDO: tener por ofrecidos los medios probatorios presentados en el escrito de denuncia del 22 de abril de 2026, subsanado mediante escrito del 26 de junio de 2026.</w:t>
+      </w:r>
+    </w:p>
+    <w:p>
+      <w:pPr>
+        <w:tabs>
+          <w:tab w:val="left" w:pos="567"/>
+        </w:tabs>
+        <w:spacing w:after="0" w:line="240" w:lineRule="auto"/>
+        <w:ind w:left="567" w:hanging="567"/>
+        <w:jc w:val="both"/>
+        <w:rPr>
+          <w:rFonts w:ascii="Arial Narrow" w:hAnsi="Arial Narrow"/>
+        </w:rPr>
+      </w:pPr>
+    </w:p>
+    <w:p>
+      <w:pPr>
+        <w:tabs>
+          <w:tab w:val="left" w:pos="567"/>
+        </w:tabs>
+        <w:spacing w:after="0" w:line="240" w:lineRule="auto"/>
+        <w:ind w:left="567" w:hanging="567"/>
+        <w:jc w:val="both"/>
+        <w:rPr>
+          <w:rFonts w:ascii="Arial Narrow" w:hAnsi="Arial Narrow"/>
+        </w:rPr>
+      </w:pPr>
+      <w:r>
+        <w:rPr>
+          <w:rFonts w:ascii="Arial Narrow" w:hAnsi="Arial Narrow"/>
+        </w:rPr>
+        <w:t>TERCERO: requerir a La Positiva Seguros y Reaseguros S.A.A. que cumpla con lo siguiente:</w:t>
+      </w:r>
+    </w:p>
+    <w:p>
+      <w:pPr>
+        <w:tabs>
+          <w:tab w:val="left" w:pos="567"/>
+        </w:tabs>
+        <w:spacing w:after="0" w:line="240" w:lineRule="auto"/>
+        <w:ind w:left="567" w:hanging="567"/>
+        <w:jc w:val="both"/>
+        <w:rPr>
+          <w:rFonts w:ascii="Arial Narrow" w:hAnsi="Arial Narrow"/>
+        </w:rPr>
+      </w:pPr>
+      <w:r>
+        <w:rPr>
+          <w:rFonts w:ascii="Arial Narrow" w:hAnsi="Arial Narrow"/>
+        </w:rPr>
+        <w:t>(i)</w:t>
+      </w:r>
+      <w:r>
+        <w:rPr>
+          <w:rFonts w:ascii="Arial Narrow" w:hAnsi="Arial Narrow"/>
+        </w:rPr>
+        <w:tab/>
+        <w:t>presentar documentos que acrediten su inscripción en los Registros Públicos o una declaración jurada que indique que cuenta con dicha inscripción;</w:t>
+      </w:r>
+    </w:p>
+    <w:p>
+      <w:pPr>
+        <w:tabs>
+          <w:tab w:val="left" w:pos="567"/>
+        </w:tabs>
+        <w:spacing w:after="0" w:line="240" w:lineRule="auto"/>
+        <w:ind w:left="567" w:hanging="567"/>
+        <w:jc w:val="both"/>
+        <w:rPr>
+          <w:rFonts w:ascii="Arial Narrow" w:hAnsi="Arial Narrow"/>
+        </w:rPr>
+      </w:pPr>
+      <w:r>
+        <w:rPr>
+          <w:rFonts w:ascii="Arial Narrow" w:hAnsi="Arial Narrow"/>
+        </w:rPr>
+        <w:t>(ii)</w:t>
+      </w:r>
+      <w:r>
+        <w:rPr>
+          <w:rFonts w:ascii="Arial Narrow" w:hAnsi="Arial Narrow"/>
+        </w:rPr>
+        <w:tab/>
+        <w:t>presentar copia simple de las facultades de representación de su representante legal en el presente procedimiento o la declaración jurada que indique que cuenta con dichas facultades y que estas se encuentran vigentes;</w:t>
+      </w:r>
+    </w:p>
+    <w:p>
+      <w:pPr>
+        <w:tabs>
+          <w:tab w:val="left" w:pos="567"/>
+        </w:tabs>
+        <w:spacing w:after="0" w:line="240" w:lineRule="auto"/>
+        <w:ind w:left="567" w:hanging="567"/>
+        <w:jc w:val="both"/>
+        <w:rPr>
+          <w:rFonts w:ascii="Arial Narrow" w:hAnsi="Arial Narrow"/>
+        </w:rPr>
+      </w:pPr>
+      <w:r>
+        <w:rPr>
+          <w:rFonts w:ascii="Arial Narrow" w:hAnsi="Arial Narrow"/>
+        </w:rPr>
+        <w:t>(iii)</w:t>
+      </w:r>
+      <w:r>
+        <w:rPr>
+          <w:rFonts w:ascii="Arial Narrow" w:hAnsi="Arial Narrow"/>
+        </w:rPr>
+        <w:tab/>
+        <w:t>consignar el Número de Registro Único de Contribuyentes (RUC); y,</w:t>
+      </w:r>
+    </w:p>
+    <w:p>
+      <w:pPr>
+        <w:tabs>
+          <w:tab w:val="left" w:pos="567"/>
+        </w:tabs>
+        <w:spacing w:after="0" w:line="240" w:lineRule="auto"/>
+        <w:ind w:left="567" w:hanging="567"/>
+        <w:jc w:val="both"/>
+        <w:rPr>
+          <w:rFonts w:ascii="Arial Narrow" w:hAnsi="Arial Narrow"/>
+        </w:rPr>
+      </w:pPr>
+      <w:r>
+        <w:rPr>
+          <w:rFonts w:ascii="Arial Narrow" w:hAnsi="Arial Narrow"/>
+        </w:rPr>
+        <w:t>(iv)</w:t>
+      </w:r>
+      <w:r>
+        <w:rPr>
+          <w:rFonts w:ascii="Arial Narrow" w:hAnsi="Arial Narrow"/>
+        </w:rPr>
+        <w:tab/>
+        <w:t>fijar domicilio procesal para el procedimiento, de conformidad con el numeral 1 del artículo 442 del Código Procesal Civil. Para ello podrá señalar domicilio físico o una dirección electrónica a la que pueda remitirse las notificaciones.</w:t>
+      </w:r>
+    </w:p>
+    <w:p>
+      <w:pPr>
+        <w:tabs>
+          <w:tab w:val="left" w:pos="567"/>
+        </w:tabs>
+        <w:spacing w:after="0" w:line="240" w:lineRule="auto"/>
+        <w:ind w:left="567" w:hanging="567"/>
+        <w:jc w:val="both"/>
+        <w:rPr>
+          <w:rFonts w:ascii="Arial Narrow" w:hAnsi="Arial Narrow"/>
+        </w:rPr>
+      </w:pPr>
+      <w:r>
+        <w:rPr>
+          <w:rFonts w:ascii="Arial Narrow" w:hAnsi="Arial Narrow"/>
+        </w:rPr>
+        <w:t>(v)</w:t>
+      </w:r>
+      <w:r>
+        <w:rPr>
+          <w:rFonts w:ascii="Arial Narrow" w:hAnsi="Arial Narrow"/>
+        </w:rPr>
+        <w:tab/>
+        <w:t xml:space="preserve">en caso califique como micro empresa o pequeña empresa, presentar los documentos que acrediten su volumen de ventas o ingresos brutos percibidos el año anterior relativo a todas sus actividades </w:t>
+      </w:r>
       <w:r>
         <w:rPr>
           <w:rFonts w:ascii="Arial Narrow" w:hAnsi="Arial Narrow"/>
         </w:rPr>
         <w:lastRenderedPageBreak/>
-        <w:t>II.</w:t>
-      </w:r>
-      <w:r>
-        <w:rPr>
-          <w:rFonts w:ascii="Arial Narrow" w:hAnsi="Arial Narrow"/>
-        </w:rPr>
-        <w:tab/>
-        <w:t>DE LA ADMISIÓN A TRÁMITE DE LA DENUNCIA</w:t>
-      </w:r>
-    </w:p>
-    <w:p>
-      <w:pPr>
-        <w:tabs>
-          <w:tab w:val="left" w:pos="1701"/>
-          <w:tab w:val="left" w:pos="2132"/>
-        </w:tabs>
-        <w:spacing w:line="240" w:lineRule="auto"/>
-        <w:rPr>
-          <w:rFonts w:ascii="Arial Narrow" w:hAnsi="Arial Narrow"/>
-        </w:rPr>
-      </w:pPr>
-      <w:r>
-        <w:rPr>
-          <w:rFonts w:ascii="Arial Narrow" w:hAnsi="Arial Narrow"/>
-        </w:rPr>
-        <w:t>3.</w:t>
-      </w:r>
-      <w:r>
-        <w:rPr>
-          <w:rFonts w:ascii="Arial Narrow" w:hAnsi="Arial Narrow"/>
-        </w:rPr>
-        <w:tab/>
-        <w:t>La Secretaría Técnica de la Comisión de Protección al Consumidor N°1 (en adelante, la Secretaría Técnica), en ejercicio de sus facultades</w:t>
+        <w:t>económicas y el número de trabajadores con el que cuenta</w:t>
       </w:r>
       <w:r>
         <w:rPr>
           <w:rStyle w:val="Refdenotaalpie"/>
         </w:rPr>
-        <w:footnoteReference w:id="3"/>
-      </w:r>
-      <w:r>
-        <w:rPr>
-          <w:rFonts w:ascii="Arial Narrow" w:hAnsi="Arial Narrow"/>
-        </w:rPr>
-        <w:t>, considera que el hecho denunciado, consistente en que la compañía aseguradora, al momento de la contratación, no le habría brindado al señor Coronel información clara y suficiente sobre las alternativas contractuales y exclusiones del seguro vehicular; podría configurar una presunta infracción al deber de información, tipificado en el artículo 1, numeral 1, literal b) y al artículo 2 del Código.</w:t>
-      </w:r>
-    </w:p>
-    <w:p>
-      <w:pPr>
-        <w:tabs>
-          <w:tab w:val="left" w:pos="1701"/>
-          <w:tab w:val="left" w:pos="2132"/>
-        </w:tabs>
-        <w:spacing w:line="240" w:lineRule="auto"/>
-        <w:rPr>
-          <w:rFonts w:ascii="Arial Narrow" w:hAnsi="Arial Narrow"/>
-        </w:rPr>
-      </w:pPr>
-    </w:p>
-    <w:p>
-      <w:pPr>
-        <w:tabs>
-          <w:tab w:val="left" w:pos="1701"/>
-          <w:tab w:val="left" w:pos="2132"/>
-        </w:tabs>
-        <w:spacing w:line="240" w:lineRule="auto"/>
-        <w:ind w:left="567" w:hanging="567"/>
-        <w:jc w:val="both"/>
-        <w:rPr>
-          <w:rFonts w:ascii="Arial Narrow" w:hAnsi="Arial Narrow"/>
-        </w:rPr>
-      </w:pPr>
-      <w:r>
-        <w:rPr>
-          <w:rFonts w:ascii="Arial Narrow" w:hAnsi="Arial Narrow"/>
-        </w:rPr>
-        <w:t>4.</w:t>
-      </w:r>
-      <w:r>
-        <w:rPr>
-          <w:rFonts w:ascii="Arial Narrow" w:hAnsi="Arial Narrow"/>
-        </w:rPr>
-        <w:tab/>
-        <w:t>Además, considera que el hecho denunciado, consistente en que la compañía aseguradora se habría negado a otorgar al denunciante la cobertura del siniestro de robo total de la póliza del seguro vehicular, argumentando que el vehículo era utilizado para alquiler; involucraría una presunta afectación a sus expectativas, quien no habría encontrado una correspondencia entre lo que esperaba recibir de parte del proveedor y lo que realmente recibió. Por consiguiente, corresponde calificar el hecho como una presunta infracción al deber de idoneidad, tipificado en los artículos 18° y 19° del Código.</w:t>
-      </w:r>
-    </w:p>
-    <w:p>
-      <w:pPr>
-        <w:tabs>
-          <w:tab w:val="left" w:pos="1701"/>
-          <w:tab w:val="left" w:pos="2132"/>
-        </w:tabs>
-        <w:spacing w:line="240" w:lineRule="auto"/>
-        <w:ind w:left="567" w:hanging="567"/>
-        <w:jc w:val="both"/>
-        <w:rPr>
-          <w:rFonts w:ascii="Arial Narrow" w:hAnsi="Arial Narrow"/>
-        </w:rPr>
-      </w:pPr>
-    </w:p>
-    <w:p>
-      <w:pPr>
-        <w:tabs>
-          <w:tab w:val="left" w:pos="1701"/>
-          <w:tab w:val="left" w:pos="2132"/>
-        </w:tabs>
-        <w:spacing w:line="240" w:lineRule="auto"/>
-        <w:ind w:left="567" w:hanging="567"/>
-        <w:jc w:val="both"/>
-        <w:rPr>
-          <w:rFonts w:ascii="Arial Narrow" w:hAnsi="Arial Narrow"/>
-        </w:rPr>
-      </w:pPr>
-      <w:r>
-        <w:rPr>
-          <w:rFonts w:ascii="Arial Narrow" w:hAnsi="Arial Narrow"/>
-        </w:rPr>
-        <w:t>5.</w:t>
-      </w:r>
-      <w:r>
-        <w:rPr>
-          <w:rFonts w:ascii="Arial Narrow" w:hAnsi="Arial Narrow"/>
-        </w:rPr>
-        <w:tab/>
-        <w:t>Asimismo, considera que el hecho denunciado, consistente en que la compañía aseguradora habría continuado realizando cobros en la tarjeta CMR del señor Coronel por concepto de la renovación automática no solicitada de la póliza de seguro vehicular, por el periodo hasta julio de 2025; involucraría una presunta afectación a sus expectativas, quien no habría encontrado una correspondencia entre lo que esperaba recibir de parte del proveedor y lo que realmente recibió. Por consiguiente, corresponde calificar el hecho como una presunta infracción al deber de idoneidad, tipificado en los artículos 18° y 19° del Código.</w:t>
-      </w:r>
-    </w:p>
-    <w:p>
-      <w:pPr>
-        <w:tabs>
-          <w:tab w:val="left" w:pos="1701"/>
-          <w:tab w:val="left" w:pos="2132"/>
-        </w:tabs>
-        <w:spacing w:line="240" w:lineRule="auto"/>
-        <w:ind w:left="567" w:hanging="567"/>
-        <w:jc w:val="both"/>
-        <w:rPr>
-          <w:rFonts w:ascii="Arial Narrow" w:hAnsi="Arial Narrow"/>
-        </w:rPr>
-      </w:pPr>
-    </w:p>
-    <w:p>
-      <w:pPr>
-        <w:tabs>
-          <w:tab w:val="left" w:pos="1701"/>
-          <w:tab w:val="left" w:pos="2132"/>
-        </w:tabs>
-        <w:spacing w:line="240" w:lineRule="auto"/>
-        <w:rPr>
-          <w:rFonts w:ascii="Arial Narrow" w:hAnsi="Arial Narrow"/>
-        </w:rPr>
-      </w:pPr>
-      <w:r>
-        <w:rPr>
-          <w:rFonts w:ascii="Arial Narrow" w:hAnsi="Arial Narrow"/>
-        </w:rPr>
-        <w:t>6.</w:t>
-      </w:r>
-      <w:r>
-        <w:rPr>
-          <w:rFonts w:ascii="Arial Narrow" w:hAnsi="Arial Narrow"/>
-        </w:rPr>
-        <w:tab/>
-        <w:t>En tanto la denuncia reúne los requisitos establecidos por la norma citada, corresponde admitirla a trámite</w:t>
+        <w:footnoteReference w:id="6"/>
+      </w:r>
+      <w:r>
+        <w:rPr>
+          <w:rFonts w:ascii="Arial Narrow" w:hAnsi="Arial Narrow"/>
+        </w:rPr>
+        <w:t>. Ello, a fin de que la Comisión pueda meritar dicha documentación, conforme lo establece el artículo 110° del Código</w:t>
       </w:r>
       <w:r>
         <w:rPr>
           <w:rStyle w:val="Refdenotaalpie"/>
         </w:rPr>
-        <w:footnoteReference w:id="4"/>
+        <w:footnoteReference w:id="7"/>
       </w:r>
       <w:r>
         <w:rPr>
@@ -645,133 +1045,73 @@
     <w:p>
       <w:pPr>
         <w:tabs>
-          <w:tab w:val="left" w:pos="1701"/>
-          <w:tab w:val="left" w:pos="2132"/>
-        </w:tabs>
-        <w:spacing w:line="240" w:lineRule="auto"/>
-        <w:rPr>
-          <w:rFonts w:ascii="Arial Narrow" w:hAnsi="Arial Narrow"/>
-        </w:rPr>
-      </w:pPr>
-    </w:p>
-    <w:p>
-      <w:pPr>
-        <w:tabs>
-          <w:tab w:val="left" w:pos="1701"/>
-          <w:tab w:val="left" w:pos="2132"/>
-        </w:tabs>
-        <w:spacing w:line="240" w:lineRule="auto"/>
-        <w:ind w:left="567" w:hanging="567"/>
-        <w:rPr>
-          <w:rFonts w:ascii="Arial Narrow" w:hAnsi="Arial Narrow"/>
-        </w:rPr>
-      </w:pPr>
-      <w:r>
-        <w:rPr>
-          <w:rFonts w:ascii="Arial Narrow" w:hAnsi="Arial Narrow"/>
-        </w:rPr>
-        <w:t>III.</w:t>
-      </w:r>
-      <w:r>
-        <w:rPr>
-          <w:rFonts w:ascii="Arial Narrow" w:hAnsi="Arial Narrow"/>
-        </w:rPr>
-        <w:tab/>
-        <w:t>REQUERIMIENTO DE INFORMACIÓN</w:t>
-      </w:r>
-    </w:p>
-    <w:p>
-      <w:pPr>
-        <w:tabs>
-          <w:tab w:val="left" w:pos="1701"/>
-          <w:tab w:val="left" w:pos="2132"/>
-        </w:tabs>
-        <w:spacing w:line="240" w:lineRule="auto"/>
-        <w:ind w:left="567" w:hanging="567"/>
-        <w:jc w:val="both"/>
-        <w:rPr>
-          <w:rFonts w:ascii="Arial Narrow" w:hAnsi="Arial Narrow"/>
-        </w:rPr>
-      </w:pPr>
-      <w:r>
-        <w:rPr>
-          <w:rFonts w:ascii="Arial Narrow" w:hAnsi="Arial Narrow"/>
-        </w:rPr>
-        <w:t>7.</w:t>
-      </w:r>
-      <w:r>
-        <w:rPr>
-          <w:rFonts w:ascii="Arial Narrow" w:hAnsi="Arial Narrow"/>
-        </w:rPr>
-        <w:tab/>
-        <w:t>A efectos de tener mayores elementos que sirvan para la resolución definitiva del presente caso, la Secretaría Técnica, en ejercicio de las facultades que la ley le confiere, conviene requerir a la compañía aseguradora que, en un plazo no mayor de cinco (5) días hábiles contado a partir del día siguiente de la notificación de la presente resolución, cumpla con lo siguiente: (i) presentar una copia completa, legible y debidamente suscrita de la póliza de seguro vehicular y sus anexos; (ii) presentar los medios probatorios que acrediten que la negativa de otorgamiento de cobertura fue justificada; y, (iii) presentar todas las comunicaciones cursadas con la parte denunciante en virtud de los hechos materia de denuncia.</w:t>
-      </w:r>
-    </w:p>
-    <w:p>
-      <w:pPr>
-        <w:tabs>
-          <w:tab w:val="left" w:pos="1701"/>
-          <w:tab w:val="left" w:pos="2132"/>
-        </w:tabs>
-        <w:spacing w:line="240" w:lineRule="auto"/>
-        <w:ind w:left="567" w:hanging="567"/>
-        <w:jc w:val="both"/>
-        <w:rPr>
-          <w:rFonts w:ascii="Arial Narrow" w:hAnsi="Arial Narrow"/>
-        </w:rPr>
-      </w:pPr>
-    </w:p>
-    <w:p>
-      <w:pPr>
-        <w:tabs>
-          <w:tab w:val="left" w:pos="1701"/>
-          <w:tab w:val="left" w:pos="2132"/>
-        </w:tabs>
-        <w:spacing w:line="240" w:lineRule="auto"/>
-        <w:ind w:left="567" w:hanging="567"/>
-        <w:rPr>
-          <w:rFonts w:ascii="Arial Narrow" w:hAnsi="Arial Narrow"/>
-        </w:rPr>
-      </w:pPr>
-      <w:r>
-        <w:rPr>
-          <w:rFonts w:ascii="Arial Narrow" w:hAnsi="Arial Narrow"/>
-        </w:rPr>
-        <w:t>IV.</w:t>
-      </w:r>
-      <w:r>
-        <w:rPr>
-          <w:rFonts w:ascii="Arial Narrow" w:hAnsi="Arial Narrow"/>
-        </w:rPr>
-        <w:tab/>
-        <w:t>RESOLUCIÓN DE LA SECRETARÍA TÉCNICA</w:t>
-      </w:r>
-    </w:p>
-    <w:p>
-      <w:pPr>
-        <w:tabs>
-          <w:tab w:val="left" w:pos="1701"/>
-          <w:tab w:val="left" w:pos="2132"/>
-        </w:tabs>
-        <w:spacing w:line="240" w:lineRule="auto"/>
-        <w:rPr>
-          <w:rFonts w:ascii="Arial Narrow" w:hAnsi="Arial Narrow"/>
-        </w:rPr>
-      </w:pPr>
-      <w:r>
-        <w:rPr>
-          <w:rFonts w:ascii="Arial Narrow" w:hAnsi="Arial Narrow"/>
-        </w:rPr>
-        <w:t>PRIMERO: admitir a trámite la denuncia del 22 de abril de 2026, interpuesta por el señor Efraín Coronel Quispe contra La Positiva Seguros y Reaseguros S.A.A., por presuntas infracciones a la Ley N° 29571, Código de Protección y Defensa del Consumidor; imputándosele los siguientes cargos:</w:t>
-      </w:r>
-    </w:p>
-    <w:p>
-      <w:pPr>
-        <w:tabs>
-          <w:tab w:val="left" w:pos="1701"/>
-          <w:tab w:val="left" w:pos="2132"/>
-        </w:tabs>
-        <w:spacing w:line="240" w:lineRule="auto"/>
+          <w:tab w:val="left" w:pos="567"/>
+        </w:tabs>
+        <w:spacing w:after="0" w:line="240" w:lineRule="auto"/>
+        <w:ind w:left="567" w:hanging="567"/>
+        <w:jc w:val="both"/>
+        <w:rPr>
+          <w:rFonts w:ascii="Arial Narrow" w:hAnsi="Arial Narrow"/>
+        </w:rPr>
+      </w:pPr>
+    </w:p>
+    <w:p>
+      <w:pPr>
+        <w:tabs>
+          <w:tab w:val="left" w:pos="567"/>
+        </w:tabs>
+        <w:spacing w:after="0" w:line="240" w:lineRule="auto"/>
+        <w:ind w:left="567" w:hanging="567"/>
+        <w:jc w:val="both"/>
+        <w:rPr>
+          <w:rFonts w:ascii="Arial Narrow" w:hAnsi="Arial Narrow"/>
+        </w:rPr>
+      </w:pPr>
+      <w:r>
+        <w:rPr>
+          <w:rFonts w:ascii="Arial Narrow" w:hAnsi="Arial Narrow"/>
+        </w:rPr>
+        <w:t>CUARTO: correr traslado de la denuncia interpuesta el 22 de abril de 2026, subsanado mediante escrito del 26 de junio de 2026, a La Positiva Seguros y Reaseguros S.A.A., para que, de conformidad con lo dispuesto por el artículo 26° de la Ley sobre Facultades, Normas y Organización del Indecopi, aprobada por Decreto Legislativo 807, presente sus descargos en un plazo no mayor de cinco (5) días hábiles contados desde la notificación.</w:t>
+      </w:r>
+    </w:p>
+    <w:p>
+      <w:pPr>
+        <w:tabs>
+          <w:tab w:val="left" w:pos="567"/>
+        </w:tabs>
+        <w:spacing w:after="0" w:line="240" w:lineRule="auto"/>
+        <w:ind w:left="567" w:hanging="567"/>
+        <w:jc w:val="both"/>
+        <w:rPr>
+          <w:rFonts w:ascii="Arial Narrow" w:hAnsi="Arial Narrow"/>
+        </w:rPr>
+      </w:pPr>
+    </w:p>
+    <w:p>
+      <w:pPr>
+        <w:tabs>
+          <w:tab w:val="left" w:pos="567"/>
+        </w:tabs>
+        <w:spacing w:after="0" w:line="240" w:lineRule="auto"/>
+        <w:ind w:left="567" w:hanging="567"/>
+        <w:jc w:val="both"/>
+        <w:rPr>
+          <w:rFonts w:ascii="Arial Narrow" w:hAnsi="Arial Narrow"/>
+        </w:rPr>
+      </w:pPr>
+      <w:r>
+        <w:rPr>
+          <w:rFonts w:ascii="Arial Narrow" w:hAnsi="Arial Narrow"/>
+        </w:rPr>
+        <w:t>QUINTO: requerir a La Positiva Seguros y Reaseguros S.A.A. que, en un plazo no mayor de cinco (5) días hábiles contado a partir del día siguiente de la notificación de la presente resolución, cumpla con presentar lo siguiente:</w:t>
+      </w:r>
+    </w:p>
+    <w:p>
+      <w:pPr>
+        <w:tabs>
+          <w:tab w:val="left" w:pos="567"/>
+        </w:tabs>
+        <w:spacing w:after="0" w:line="240" w:lineRule="auto"/>
         <w:ind w:left="567" w:hanging="567"/>
         <w:jc w:val="both"/>
         <w:rPr>
@@ -789,16 +1129,15 @@
           <w:rFonts w:ascii="Arial Narrow" w:hAnsi="Arial Narrow"/>
         </w:rPr>
         <w:tab/>
-        <w:t>Presunta infracción a los artículos 18° y 19° de la Ley N° 29571, Código de Protección y Defensa del Consumidor, en tanto La Positiva Seguros y Reaseguros S.A.A. se habría negado a otorgar al denunciante la cobertura del siniestro de robo total de la póliza del seguro vehicular, argumentando que el vehículo era utilizado para alquiler.</w:t>
-      </w:r>
-    </w:p>
-    <w:p>
-      <w:pPr>
-        <w:tabs>
-          <w:tab w:val="left" w:pos="1701"/>
-          <w:tab w:val="left" w:pos="2132"/>
-        </w:tabs>
-        <w:spacing w:line="240" w:lineRule="auto"/>
+        <w:t>Una copia completa, legible y debidamente suscrita de la póliza de seguro vehicular y sus anexos;</w:t>
+      </w:r>
+    </w:p>
+    <w:p>
+      <w:pPr>
+        <w:tabs>
+          <w:tab w:val="left" w:pos="567"/>
+        </w:tabs>
+        <w:spacing w:after="0" w:line="240" w:lineRule="auto"/>
         <w:ind w:left="567" w:hanging="567"/>
         <w:jc w:val="both"/>
         <w:rPr>
@@ -816,254 +1155,178 @@
           <w:rFonts w:ascii="Arial Narrow" w:hAnsi="Arial Narrow"/>
         </w:rPr>
         <w:tab/>
-        <w:t xml:space="preserve">Presunta infracción a los artículos 18° y 19° de la Ley N° 29571, Código de Protección y Defensa del Consumidor, en tanto La Positiva Seguros y Reaseguros S.A.A. habría continuado realizando </w:t>
+        <w:t>Los medios probatorios que acrediten que la negativa de otorgamiento de cobertura fue justificada; y,</w:t>
+      </w:r>
+    </w:p>
+    <w:p>
+      <w:pPr>
+        <w:tabs>
+          <w:tab w:val="left" w:pos="567"/>
+        </w:tabs>
+        <w:spacing w:after="0" w:line="240" w:lineRule="auto"/>
+        <w:ind w:left="567" w:hanging="567"/>
+        <w:jc w:val="both"/>
+        <w:rPr>
+          <w:rFonts w:ascii="Arial Narrow" w:hAnsi="Arial Narrow"/>
+        </w:rPr>
+      </w:pPr>
+      <w:r>
+        <w:rPr>
+          <w:rFonts w:ascii="Arial Narrow" w:hAnsi="Arial Narrow"/>
+        </w:rPr>
+        <w:t>(iii)</w:t>
+      </w:r>
+      <w:r>
+        <w:rPr>
+          <w:rFonts w:ascii="Arial Narrow" w:hAnsi="Arial Narrow"/>
+        </w:rPr>
+        <w:tab/>
+        <w:t>Todas las comunicaciones cursadas con la parte denunciante en virtud de los hechos materia de denuncia.</w:t>
+      </w:r>
+    </w:p>
+    <w:p>
+      <w:pPr>
+        <w:tabs>
+          <w:tab w:val="left" w:pos="567"/>
+        </w:tabs>
+        <w:spacing w:after="0" w:line="240" w:lineRule="auto"/>
+        <w:ind w:left="567" w:hanging="567"/>
+        <w:jc w:val="both"/>
+        <w:rPr>
+          <w:rFonts w:ascii="Arial Narrow" w:hAnsi="Arial Narrow"/>
+        </w:rPr>
+      </w:pPr>
+    </w:p>
+    <w:p>
+      <w:pPr>
+        <w:tabs>
+          <w:tab w:val="left" w:pos="567"/>
+        </w:tabs>
+        <w:spacing w:after="0" w:line="240" w:lineRule="auto"/>
+        <w:ind w:left="567" w:hanging="567"/>
+        <w:jc w:val="both"/>
+        <w:rPr>
+          <w:rFonts w:ascii="Arial Narrow" w:hAnsi="Arial Narrow"/>
+        </w:rPr>
+      </w:pPr>
+      <w:r>
+        <w:rPr>
+          <w:rFonts w:ascii="Arial Narrow" w:hAnsi="Arial Narrow"/>
+        </w:rPr>
+        <w:t>SEXTO: requerir a las partes que en todos sus escritos y/o documentos que presenten consignen el número de expediente que figura en la parte superior derecha, caso contrario no se anexarán al mismo.</w:t>
+      </w:r>
+    </w:p>
+    <w:p>
+      <w:pPr>
+        <w:tabs>
+          <w:tab w:val="left" w:pos="567"/>
+        </w:tabs>
+        <w:spacing w:after="0" w:line="240" w:lineRule="auto"/>
+        <w:ind w:left="567" w:hanging="567"/>
+        <w:jc w:val="both"/>
+        <w:rPr>
+          <w:rFonts w:ascii="Arial Narrow" w:hAnsi="Arial Narrow"/>
+        </w:rPr>
+      </w:pPr>
+    </w:p>
+    <w:p>
+      <w:pPr>
+        <w:tabs>
+          <w:tab w:val="left" w:pos="567"/>
+        </w:tabs>
+        <w:spacing w:after="0" w:line="240" w:lineRule="auto"/>
+        <w:ind w:left="567" w:hanging="567"/>
+        <w:jc w:val="both"/>
+        <w:rPr>
+          <w:rFonts w:ascii="Arial Narrow" w:hAnsi="Arial Narrow"/>
+        </w:rPr>
+      </w:pPr>
+      <w:r>
+        <w:rPr>
+          <w:rFonts w:ascii="Arial Narrow" w:hAnsi="Arial Narrow"/>
+        </w:rPr>
+        <w:t>SÉTIMO: informar a La Positiva Seguros y Reaseguros S.A.A. que las infracciones a las normas de protección al consumidor y defensa de la competencia determinan la imposición de una multa de hasta 450 Unidades Impositivas Tributarias</w:t>
+      </w:r>
+      <w:r>
+        <w:rPr>
+          <w:rStyle w:val="Refdenotaalpie"/>
+        </w:rPr>
+        <w:footnoteReference w:id="8"/>
+      </w:r>
+      <w:r>
+        <w:rPr>
+          <w:rFonts w:ascii="Arial Narrow" w:hAnsi="Arial Narrow"/>
+        </w:rPr>
+        <w:t xml:space="preserve">; asimismo, conforme a lo establecido en la norma, se </w:t>
       </w:r>
       <w:r>
         <w:rPr>
           <w:rFonts w:ascii="Arial Narrow" w:hAnsi="Arial Narrow"/>
         </w:rPr>
         <w:lastRenderedPageBreak/>
-        <w:t>cobros en la tarjeta CMR del señor Coronel por concepto de la renovación automática no solicitada de la póliza de seguro vehicular, por el periodo hasta julio de 2025.</w:t>
-      </w:r>
-    </w:p>
-    <w:p>
-      <w:pPr>
-        <w:tabs>
-          <w:tab w:val="left" w:pos="1701"/>
-          <w:tab w:val="left" w:pos="2132"/>
-        </w:tabs>
-        <w:spacing w:line="240" w:lineRule="auto"/>
-        <w:ind w:left="567" w:hanging="567"/>
-        <w:jc w:val="both"/>
-        <w:rPr>
-          <w:rFonts w:ascii="Arial Narrow" w:hAnsi="Arial Narrow"/>
-        </w:rPr>
-      </w:pPr>
-      <w:r>
-        <w:rPr>
-          <w:rFonts w:ascii="Arial Narrow" w:hAnsi="Arial Narrow"/>
-        </w:rPr>
-        <w:t>(iii)</w:t>
-      </w:r>
-      <w:r>
-        <w:rPr>
-          <w:rFonts w:ascii="Arial Narrow" w:hAnsi="Arial Narrow"/>
-        </w:rPr>
-        <w:tab/>
-        <w:t>Presunta infracción al artículo 1, numeral 1, literal b) y al artículo 2 de la Ley N° 29571, Código de Protección y Defensa del Consumidor, en tanto La Positiva Seguros y Reaseguros S.A.A., al momento de la contratación, no habría brindado al señor Coronel información clara y suficiente sobre las alternativas contractuales y exclusiones del seguro vehicular.</w:t>
-      </w:r>
-    </w:p>
-    <w:p>
-      <w:pPr>
-        <w:tabs>
-          <w:tab w:val="left" w:pos="1701"/>
-          <w:tab w:val="left" w:pos="2132"/>
-        </w:tabs>
-        <w:spacing w:line="240" w:lineRule="auto"/>
-        <w:ind w:left="567" w:hanging="567"/>
-        <w:jc w:val="both"/>
-        <w:rPr>
-          <w:rFonts w:ascii="Arial Narrow" w:hAnsi="Arial Narrow"/>
-        </w:rPr>
-      </w:pPr>
-    </w:p>
-    <w:p>
-      <w:pPr>
-        <w:tabs>
-          <w:tab w:val="left" w:pos="1701"/>
-          <w:tab w:val="left" w:pos="2132"/>
-        </w:tabs>
-        <w:spacing w:line="240" w:lineRule="auto"/>
-        <w:rPr>
-          <w:rFonts w:ascii="Arial Narrow" w:hAnsi="Arial Narrow"/>
-        </w:rPr>
-      </w:pPr>
-      <w:r>
-        <w:rPr>
-          <w:rFonts w:ascii="Arial Narrow" w:hAnsi="Arial Narrow"/>
-        </w:rPr>
-        <w:t>SEGUNDO: tener por ofrecidos los medios probatorios presentados en el escrito de denuncia del 22 de abril de 2026, subsanado mediante escrito del 26 de junio de 2026.</w:t>
-      </w:r>
-    </w:p>
-    <w:p>
-      <w:pPr>
-        <w:tabs>
-          <w:tab w:val="left" w:pos="1701"/>
-          <w:tab w:val="left" w:pos="2132"/>
-        </w:tabs>
-        <w:spacing w:line="240" w:lineRule="auto"/>
-        <w:rPr>
-          <w:rFonts w:ascii="Arial Narrow" w:hAnsi="Arial Narrow"/>
-        </w:rPr>
-      </w:pPr>
-    </w:p>
-    <w:p>
-      <w:pPr>
-        <w:tabs>
-          <w:tab w:val="left" w:pos="1701"/>
-          <w:tab w:val="left" w:pos="2132"/>
-        </w:tabs>
-        <w:spacing w:line="240" w:lineRule="auto"/>
-        <w:rPr>
-          <w:rFonts w:ascii="Arial Narrow" w:hAnsi="Arial Narrow"/>
-        </w:rPr>
-      </w:pPr>
-      <w:r>
-        <w:rPr>
-          <w:rFonts w:ascii="Arial Narrow" w:hAnsi="Arial Narrow"/>
-        </w:rPr>
-        <w:t>TERCERO: requerir a La Positiva Seguros y Reaseguros S.A.A. que cumpla con lo siguiente:</w:t>
-      </w:r>
-    </w:p>
-    <w:p>
-      <w:pPr>
-        <w:tabs>
-          <w:tab w:val="left" w:pos="1701"/>
-          <w:tab w:val="left" w:pos="2132"/>
-        </w:tabs>
-        <w:spacing w:line="240" w:lineRule="auto"/>
-        <w:ind w:left="567" w:hanging="567"/>
-        <w:jc w:val="both"/>
-        <w:rPr>
-          <w:rFonts w:ascii="Arial Narrow" w:hAnsi="Arial Narrow"/>
-        </w:rPr>
-      </w:pPr>
-      <w:r>
-        <w:rPr>
-          <w:rFonts w:ascii="Arial Narrow" w:hAnsi="Arial Narrow"/>
-        </w:rPr>
-        <w:t>(i)</w:t>
-      </w:r>
-      <w:r>
-        <w:rPr>
-          <w:rFonts w:ascii="Arial Narrow" w:hAnsi="Arial Narrow"/>
-        </w:rPr>
-        <w:tab/>
-        <w:t>presentar documentos que acrediten su inscripción en los Registros Públicos o una declaración jurada que indique que cuenta con dicha inscripción;</w:t>
-      </w:r>
-    </w:p>
-    <w:p>
-      <w:pPr>
-        <w:tabs>
-          <w:tab w:val="left" w:pos="1701"/>
-          <w:tab w:val="left" w:pos="2132"/>
-        </w:tabs>
-        <w:spacing w:line="240" w:lineRule="auto"/>
-        <w:ind w:left="567" w:hanging="567"/>
-        <w:jc w:val="both"/>
-        <w:rPr>
-          <w:rFonts w:ascii="Arial Narrow" w:hAnsi="Arial Narrow"/>
-        </w:rPr>
-      </w:pPr>
-      <w:r>
-        <w:rPr>
-          <w:rFonts w:ascii="Arial Narrow" w:hAnsi="Arial Narrow"/>
-        </w:rPr>
-        <w:t>(ii)</w:t>
-      </w:r>
-      <w:r>
-        <w:rPr>
-          <w:rFonts w:ascii="Arial Narrow" w:hAnsi="Arial Narrow"/>
-        </w:rPr>
-        <w:tab/>
-        <w:t>presentar copia simple de las facultades de representación de su representante legal en el presente procedimiento o la declaración jurada que indique que cuenta con dichas facultades y que estas se encuentran vigentes;</w:t>
-      </w:r>
-    </w:p>
-    <w:p>
-      <w:pPr>
-        <w:tabs>
-          <w:tab w:val="left" w:pos="1701"/>
-          <w:tab w:val="left" w:pos="2132"/>
-        </w:tabs>
-        <w:spacing w:line="240" w:lineRule="auto"/>
-        <w:ind w:left="567" w:hanging="567"/>
-        <w:jc w:val="both"/>
-        <w:rPr>
-          <w:rFonts w:ascii="Arial Narrow" w:hAnsi="Arial Narrow"/>
-        </w:rPr>
-      </w:pPr>
-      <w:r>
-        <w:rPr>
-          <w:rFonts w:ascii="Arial Narrow" w:hAnsi="Arial Narrow"/>
-        </w:rPr>
-        <w:t>(iii)</w:t>
-      </w:r>
-      <w:r>
-        <w:rPr>
-          <w:rFonts w:ascii="Arial Narrow" w:hAnsi="Arial Narrow"/>
-        </w:rPr>
-        <w:tab/>
-        <w:t>consignar el Número de Registro Único de Contribuyentes (RUC); y,</w:t>
-      </w:r>
-    </w:p>
-    <w:p>
-      <w:pPr>
-        <w:tabs>
-          <w:tab w:val="left" w:pos="1701"/>
-          <w:tab w:val="left" w:pos="2132"/>
-        </w:tabs>
-        <w:spacing w:line="240" w:lineRule="auto"/>
-        <w:ind w:left="567" w:hanging="567"/>
-        <w:jc w:val="both"/>
-        <w:rPr>
-          <w:rFonts w:ascii="Arial Narrow" w:hAnsi="Arial Narrow"/>
-        </w:rPr>
-      </w:pPr>
-      <w:r>
-        <w:rPr>
-          <w:rFonts w:ascii="Arial Narrow" w:hAnsi="Arial Narrow"/>
-        </w:rPr>
-        <w:t>(iv)</w:t>
-      </w:r>
-      <w:r>
-        <w:rPr>
-          <w:rFonts w:ascii="Arial Narrow" w:hAnsi="Arial Narrow"/>
-        </w:rPr>
-        <w:tab/>
-        <w:t>fijar domicilio procesal para el procedimiento, de conformidad con el numeral 1 del artículo 442 del Código Procesal Civil. Para ello podrá señalar domicilio físico o una dirección electrónica a la que pueda remitirse las notificaciones.</w:t>
-      </w:r>
-    </w:p>
-    <w:p>
-      <w:pPr>
-        <w:tabs>
-          <w:tab w:val="left" w:pos="1701"/>
-          <w:tab w:val="left" w:pos="2132"/>
-        </w:tabs>
-        <w:spacing w:line="240" w:lineRule="auto"/>
-        <w:rPr>
-          <w:rFonts w:ascii="Arial Narrow" w:hAnsi="Arial Narrow"/>
-        </w:rPr>
-      </w:pPr>
-      <w:r>
-        <w:rPr>
-          <w:rFonts w:ascii="Arial Narrow" w:hAnsi="Arial Narrow"/>
-        </w:rPr>
-        <w:t>(v)</w:t>
-      </w:r>
-      <w:r>
-        <w:rPr>
-          <w:rFonts w:ascii="Arial Narrow" w:hAnsi="Arial Narrow"/>
-        </w:rPr>
-        <w:tab/>
-        <w:t>en caso califique como micro empresa o pequeña empresa, presentar los documentos que acrediten su volumen de ventas o ingresos brutos percibidos el año anterior relativo a todas sus actividades económicas y el número de trabajadores con el que cuenta</w:t>
+        <w:t>considerará como circunstancia atenuante especial el hecho que la parte denunciada, con anterioridad al vencimiento del plazo conferido para que presente sus descargos, acredite haber solucionado la controversia que dio lugar a la interposición de la denuncia</w:t>
       </w:r>
       <w:r>
         <w:rPr>
           <w:rStyle w:val="Refdenotaalpie"/>
         </w:rPr>
-        <w:footnoteReference w:id="5"/>
-      </w:r>
-      <w:r>
-        <w:rPr>
-          <w:rFonts w:ascii="Arial Narrow" w:hAnsi="Arial Narrow"/>
-        </w:rPr>
-        <w:t>. Ello, a fin de que la Comisión pueda meritar dicha documentación, conforme lo establece el artículo 110° del Código</w:t>
+        <w:footnoteReference w:id="9"/>
+      </w:r>
+      <w:r>
+        <w:rPr>
+          <w:rFonts w:ascii="Arial Narrow" w:hAnsi="Arial Narrow"/>
+        </w:rPr>
+        <w:t>.</w:t>
+      </w:r>
+    </w:p>
+    <w:p>
+      <w:pPr>
+        <w:tabs>
+          <w:tab w:val="left" w:pos="567"/>
+        </w:tabs>
+        <w:spacing w:after="0" w:line="240" w:lineRule="auto"/>
+        <w:ind w:left="567" w:hanging="567"/>
+        <w:jc w:val="both"/>
+        <w:rPr>
+          <w:rFonts w:ascii="Arial Narrow" w:hAnsi="Arial Narrow"/>
+        </w:rPr>
+      </w:pPr>
+    </w:p>
+    <w:p>
+      <w:pPr>
+        <w:tabs>
+          <w:tab w:val="left" w:pos="567"/>
+        </w:tabs>
+        <w:spacing w:after="0" w:line="240" w:lineRule="auto"/>
+        <w:ind w:left="567" w:hanging="567"/>
+        <w:jc w:val="both"/>
+        <w:rPr>
+          <w:rFonts w:ascii="Arial Narrow" w:hAnsi="Arial Narrow"/>
+        </w:rPr>
+      </w:pPr>
+      <w:r>
+        <w:rPr>
+          <w:rFonts w:ascii="Arial Narrow" w:hAnsi="Arial Narrow"/>
+        </w:rPr>
+        <w:t>OCTAVO: comunicar a las partes que la Comisión de Protección al Consumidor Nº 1 en cualquier etapa del procedimiento promoverá la conclusión del procedimiento a través de la conciliación</w:t>
       </w:r>
       <w:r>
         <w:rPr>
           <w:rStyle w:val="Refdenotaalpie"/>
         </w:rPr>
-        <w:footnoteReference w:id="6"/>
+        <w:footnoteReference w:id="10"/>
+      </w:r>
+      <w:r>
+        <w:rPr>
+          <w:rFonts w:ascii="Arial Narrow" w:hAnsi="Arial Narrow"/>
+        </w:rPr>
+        <w:t>. Así como, tienen expedito su derecho al desistimiento, debiendo comunicar fehacientemente de la misma a la Secretaría Técnica, para lo cual deberán tener en cuenta lo dispuesto en la normativa vigente</w:t>
+      </w:r>
+      <w:r>
+        <w:rPr>
+          <w:rStyle w:val="Refdenotaalpie"/>
+        </w:rPr>
+        <w:footnoteReference w:id="11"/>
       </w:r>
       <w:r>
         <w:rPr>
@@ -1075,109 +1338,127 @@
     <w:p>
       <w:pPr>
         <w:tabs>
-          <w:tab w:val="left" w:pos="1701"/>
-          <w:tab w:val="left" w:pos="2132"/>
-        </w:tabs>
-        <w:spacing w:line="240" w:lineRule="auto"/>
-        <w:rPr>
-          <w:rFonts w:ascii="Arial Narrow" w:hAnsi="Arial Narrow"/>
-        </w:rPr>
-      </w:pPr>
-    </w:p>
-    <w:p>
-      <w:pPr>
-        <w:tabs>
-          <w:tab w:val="left" w:pos="1701"/>
-          <w:tab w:val="left" w:pos="2132"/>
-        </w:tabs>
-        <w:spacing w:line="240" w:lineRule="auto"/>
-        <w:rPr>
-          <w:rFonts w:ascii="Arial Narrow" w:hAnsi="Arial Narrow"/>
-        </w:rPr>
-      </w:pPr>
-      <w:r>
-        <w:rPr>
-          <w:rFonts w:ascii="Arial Narrow" w:hAnsi="Arial Narrow"/>
-        </w:rPr>
-        <w:t>CUARTO: correr traslado de la denuncia interpuesta el 22 de abril de 2026, subsanado mediante escrito del 26 de junio de 2026, a La Positiva Seguros y Reaseguros S.A.A., para que, de conformidad con lo dispuesto por el artículo 26° de la Ley sobre Facultades, Normas y Organización del Indecopi, aprobada por Decreto Legislativo 807, presente sus descargos en un plazo no mayor de cinco (5) días hábiles contados desde la notificación.</w:t>
-      </w:r>
-    </w:p>
-    <w:p>
-      <w:pPr>
-        <w:tabs>
-          <w:tab w:val="left" w:pos="1701"/>
-          <w:tab w:val="left" w:pos="2132"/>
-        </w:tabs>
-        <w:spacing w:line="240" w:lineRule="auto"/>
-        <w:rPr>
-          <w:rFonts w:ascii="Arial Narrow" w:hAnsi="Arial Narrow"/>
-        </w:rPr>
-      </w:pPr>
-    </w:p>
-    <w:p>
-      <w:pPr>
-        <w:tabs>
-          <w:tab w:val="left" w:pos="1701"/>
-          <w:tab w:val="left" w:pos="2132"/>
-        </w:tabs>
-        <w:spacing w:line="240" w:lineRule="auto"/>
-        <w:rPr>
-          <w:rFonts w:ascii="Arial Narrow" w:hAnsi="Arial Narrow"/>
-        </w:rPr>
-      </w:pPr>
-      <w:r>
-        <w:rPr>
-          <w:rFonts w:ascii="Arial Narrow" w:hAnsi="Arial Narrow"/>
-        </w:rPr>
-        <w:t>QUINTO: requerir que, en un plazo no mayor de cinco (5) días hábiles contado a partir del día siguiente de la notificación de la presente resolución, la compañía aseguradora cumpla con: (i) presentar una copia completa, legible y debidamente suscrita de la póliza de seguro vehicular y sus anexos; (ii) presentar los medios probatorios que acrediten que la negativa de otorgamiento de cobertura fue justificada; y, (iii) presentar todas las comunicaciones cursadas con la parte denunciante en virtud de los hechos materia de denuncia.</w:t>
-      </w:r>
-    </w:p>
-    <w:p>
-      <w:pPr>
-        <w:tabs>
-          <w:tab w:val="left" w:pos="1701"/>
-          <w:tab w:val="left" w:pos="2132"/>
-        </w:tabs>
-        <w:spacing w:line="240" w:lineRule="auto"/>
-        <w:rPr>
-          <w:rFonts w:ascii="Arial Narrow" w:hAnsi="Arial Narrow"/>
-        </w:rPr>
-      </w:pPr>
-    </w:p>
-    <w:p>
-      <w:pPr>
-        <w:tabs>
-          <w:tab w:val="left" w:pos="1701"/>
-          <w:tab w:val="left" w:pos="2132"/>
-        </w:tabs>
-        <w:spacing w:line="240" w:lineRule="auto"/>
-        <w:rPr>
-          <w:rFonts w:ascii="Arial Narrow" w:hAnsi="Arial Narrow"/>
-        </w:rPr>
-      </w:pPr>
-      <w:r>
-        <w:rPr>
-          <w:rFonts w:ascii="Arial Narrow" w:hAnsi="Arial Narrow"/>
-        </w:rPr>
-        <w:t>SEXTO: informar a las partes que el artículo 110° de la Ley N° 29571, Código de Protección y Defensa del Consumidor</w:t>
+          <w:tab w:val="left" w:pos="567"/>
+        </w:tabs>
+        <w:spacing w:after="0" w:line="240" w:lineRule="auto"/>
+        <w:ind w:left="567" w:hanging="567"/>
+        <w:jc w:val="both"/>
+        <w:rPr>
+          <w:rFonts w:ascii="Arial Narrow" w:hAnsi="Arial Narrow"/>
+        </w:rPr>
+      </w:pPr>
+    </w:p>
+    <w:p>
+      <w:pPr>
+        <w:tabs>
+          <w:tab w:val="left" w:pos="567"/>
+        </w:tabs>
+        <w:spacing w:after="0" w:line="240" w:lineRule="auto"/>
+        <w:ind w:left="567" w:hanging="567"/>
+        <w:jc w:val="both"/>
+        <w:rPr>
+          <w:rFonts w:ascii="Arial Narrow" w:hAnsi="Arial Narrow"/>
+        </w:rPr>
+      </w:pPr>
+      <w:r>
+        <w:rPr>
+          <w:rFonts w:ascii="Arial Narrow" w:hAnsi="Arial Narrow"/>
+        </w:rPr>
+        <w:t>NOVENO: informar a las partes que para la validez del otorgamiento de facultades de representación mediante carta poder simple se debe tener en cuenta lo establecido en la directiva aplicable al presente procedimiento</w:t>
       </w:r>
       <w:r>
         <w:rPr>
           <w:rStyle w:val="Refdenotaalpie"/>
         </w:rPr>
-        <w:footnoteReference w:id="7"/>
-      </w:r>
-      <w:r>
-        <w:rPr>
-          <w:rFonts w:ascii="Arial Narrow" w:hAnsi="Arial Narrow"/>
-        </w:rPr>
-        <w:t>, faculta a la Comisión a calificar las infracciones de la referida norma como leves, graves o muy graves e imponer sanciones que van desde una amonestación hasta una multa por un máximo de 450 Unidades Impositivas Tributarias, sin perjuicio de las medidas correctivas, reparadoras y complementarias, que puedan ordenarse de acuerdo a lo estipulado en los artículos 114°, 115° y 116° de la referida norma</w:t>
+        <w:footnoteReference w:id="12"/>
+      </w:r>
+      <w:r>
+        <w:rPr>
+          <w:rFonts w:ascii="Arial Narrow" w:hAnsi="Arial Narrow"/>
+        </w:rPr>
+        <w:t>.</w:t>
+      </w:r>
+    </w:p>
+    <w:p>
+      <w:pPr>
+        <w:tabs>
+          <w:tab w:val="left" w:pos="567"/>
+        </w:tabs>
+        <w:spacing w:after="0" w:line="240" w:lineRule="auto"/>
+        <w:ind w:left="567" w:hanging="567"/>
+        <w:jc w:val="both"/>
+        <w:rPr>
+          <w:rFonts w:ascii="Arial Narrow" w:hAnsi="Arial Narrow"/>
+        </w:rPr>
+      </w:pPr>
+    </w:p>
+    <w:p>
+      <w:pPr>
+        <w:tabs>
+          <w:tab w:val="left" w:pos="567"/>
+        </w:tabs>
+        <w:spacing w:after="0" w:line="240" w:lineRule="auto"/>
+        <w:ind w:left="567" w:hanging="567"/>
+        <w:jc w:val="both"/>
+        <w:rPr>
+          <w:rFonts w:ascii="Arial Narrow" w:hAnsi="Arial Narrow"/>
+        </w:rPr>
+      </w:pPr>
+      <w:r>
+        <w:rPr>
+          <w:rFonts w:ascii="Arial Narrow" w:hAnsi="Arial Narrow"/>
+        </w:rPr>
+        <w:t>DÉCIMO: requerir al señor Coronel para que efectúe el acuse de recibo mediante la confirmación de recepción de la notificación remitida por este despacho al correo electrónico señalado, dentro de los dos (2) primeros días hábiles siguientes a la fecha en que recibe la notificación, conforme a lo dispuesto en el artículo 20</w:t>
       </w:r>
       <w:r>
         <w:rPr>
           <w:rStyle w:val="Refdenotaalpie"/>
         </w:rPr>
-        <w:footnoteReference w:id="8"/>
+        <w:footnoteReference w:id="13"/>
+      </w:r>
+      <w:r>
+        <w:rPr>
+          <w:rFonts w:ascii="Arial Narrow" w:hAnsi="Arial Narrow"/>
+        </w:rPr>
+        <w:t xml:space="preserve"> del TUO de la Ley del Procedimiento Administrativo General (LPAG), bajo apercibimiento de notificar la resolución al domicilio físico señalado.</w:t>
+      </w:r>
+    </w:p>
+    <w:p>
+      <w:pPr>
+        <w:tabs>
+          <w:tab w:val="left" w:pos="567"/>
+        </w:tabs>
+        <w:spacing w:after="0" w:line="240" w:lineRule="auto"/>
+        <w:ind w:left="567" w:hanging="567"/>
+        <w:jc w:val="both"/>
+        <w:rPr>
+          <w:rFonts w:ascii="Arial Narrow" w:hAnsi="Arial Narrow"/>
+        </w:rPr>
+      </w:pPr>
+    </w:p>
+    <w:p>
+      <w:pPr>
+        <w:tabs>
+          <w:tab w:val="left" w:pos="567"/>
+        </w:tabs>
+        <w:spacing w:after="0" w:line="240" w:lineRule="auto"/>
+        <w:ind w:left="567" w:hanging="567"/>
+        <w:jc w:val="both"/>
+        <w:rPr>
+          <w:rFonts w:ascii="Arial Narrow" w:hAnsi="Arial Narrow"/>
+        </w:rPr>
+      </w:pPr>
+      <w:r>
+        <w:rPr>
+          <w:rFonts w:ascii="Arial Narrow" w:hAnsi="Arial Narrow"/>
+        </w:rPr>
+        <w:t>DÉCIMO PRIMERO: requerir a La Positiva Seguros y Reaseguros S.A.A. para que efectúe el acuse de recibo mediante la confirmación de recepción de la notificación remitida por este despacho a su Casilla Electrónica, dentro de los cinco (5) primeros días hábiles siguientes a la fecha en que recibe la notificación</w:t>
+      </w:r>
+      <w:r>
+        <w:rPr>
+          <w:rStyle w:val="Refdenotaalpie"/>
+        </w:rPr>
+        <w:footnoteReference w:id="14"/>
       </w:r>
       <w:r>
         <w:rPr>
@@ -1189,372 +1470,57 @@
     <w:p>
       <w:pPr>
         <w:tabs>
-          <w:tab w:val="left" w:pos="1701"/>
-          <w:tab w:val="left" w:pos="2132"/>
-        </w:tabs>
-        <w:spacing w:line="240" w:lineRule="auto"/>
-        <w:rPr>
-          <w:rFonts w:ascii="Arial Narrow" w:hAnsi="Arial Narrow"/>
-        </w:rPr>
-      </w:pPr>
-    </w:p>
-    <w:p>
-      <w:pPr>
-        <w:tabs>
-          <w:tab w:val="left" w:pos="1701"/>
-          <w:tab w:val="left" w:pos="2132"/>
-        </w:tabs>
-        <w:spacing w:line="240" w:lineRule="auto"/>
-        <w:rPr>
-          <w:rFonts w:ascii="Arial Narrow" w:hAnsi="Arial Narrow"/>
-        </w:rPr>
-      </w:pPr>
-      <w:r>
-        <w:rPr>
-          <w:rFonts w:ascii="Arial Narrow" w:hAnsi="Arial Narrow"/>
-        </w:rPr>
-        <w:t>SÉTIMO: informar a las partes que conforme a lo establecido en el artículo 39° de la Ley sobre Facultades, Normas y Organización del Indecopi, aprobada por Decreto Legislativo 807, los gastos por los peritajes realizados, actuación de pruebas, inspecciones y otros derivados de la tramitación del proceso serán de cargo de la parte que solicita la prueba, salvo pacto en contrario. En todos los casos, la resolución final determinará si los gastos deben ser asumidos por alguna de las partes, o reembolsados a la otra parte o al Indecopi, según sea el caso, de manera adicional a la sanción que haya podido imponerse.</w:t>
-      </w:r>
-    </w:p>
-    <w:p>
-      <w:pPr>
-        <w:tabs>
-          <w:tab w:val="left" w:pos="1701"/>
-          <w:tab w:val="left" w:pos="2132"/>
-        </w:tabs>
-        <w:spacing w:line="240" w:lineRule="auto"/>
-        <w:rPr>
-          <w:rFonts w:ascii="Arial Narrow" w:hAnsi="Arial Narrow"/>
-        </w:rPr>
-      </w:pPr>
-    </w:p>
-    <w:p>
-      <w:pPr>
-        <w:tabs>
-          <w:tab w:val="left" w:pos="1701"/>
-          <w:tab w:val="left" w:pos="2132"/>
-        </w:tabs>
-        <w:spacing w:line="240" w:lineRule="auto"/>
-        <w:rPr>
-          <w:rFonts w:ascii="Arial Narrow" w:hAnsi="Arial Narrow"/>
-        </w:rPr>
-      </w:pPr>
-      <w:r>
-        <w:rPr>
-          <w:rFonts w:ascii="Arial Narrow" w:hAnsi="Arial Narrow"/>
-        </w:rPr>
-        <w:t>Asimismo, se consideran circunstancias atenuantes para la graduación de la sanción, el allanamiento de la denuncia o el reconocimiento de las pretensiones en ella contenidas, de acuerdo con el artículo 112° del Código</w:t>
-      </w:r>
-      <w:r>
-        <w:rPr>
-          <w:rStyle w:val="Refdenotaalpie"/>
-        </w:rPr>
-        <w:footnoteReference w:id="9"/>
-      </w:r>
-      <w:r>
-        <w:rPr>
-          <w:rFonts w:ascii="Arial Narrow" w:hAnsi="Arial Narrow"/>
-        </w:rPr>
-        <w:t>.</w:t>
-      </w:r>
-    </w:p>
-    <w:p>
-      <w:pPr>
-        <w:tabs>
-          <w:tab w:val="left" w:pos="1701"/>
-          <w:tab w:val="left" w:pos="2132"/>
-        </w:tabs>
-        <w:spacing w:line="240" w:lineRule="auto"/>
-        <w:rPr>
-          <w:rFonts w:ascii="Arial Narrow" w:hAnsi="Arial Narrow"/>
-        </w:rPr>
-      </w:pPr>
-    </w:p>
-    <w:p>
-      <w:pPr>
-        <w:tabs>
-          <w:tab w:val="left" w:pos="1701"/>
-          <w:tab w:val="left" w:pos="2132"/>
-        </w:tabs>
-        <w:spacing w:line="240" w:lineRule="auto"/>
-        <w:rPr>
-          <w:rFonts w:ascii="Arial Narrow" w:hAnsi="Arial Narrow"/>
-        </w:rPr>
-      </w:pPr>
-      <w:r>
-        <w:rPr>
-          <w:rFonts w:ascii="Arial Narrow" w:hAnsi="Arial Narrow"/>
-        </w:rPr>
-        <w:t>OCTAVO: comunicar a las partes que, de acuerdo a lo señalado por el artículo 29° del Decreto Legislativo N° 807</w:t>
-      </w:r>
-      <w:r>
-        <w:rPr>
-          <w:rStyle w:val="Refdenotaalpie"/>
-        </w:rPr>
-        <w:footnoteReference w:id="10"/>
-      </w:r>
-      <w:r>
-        <w:rPr>
-          <w:rFonts w:ascii="Arial Narrow" w:hAnsi="Arial Narrow"/>
-        </w:rPr>
-        <w:t>, hasta antes de la emisión de la Resolución Final tienen la posibilidad de solicitar una audiencia de conciliación. En caso deleguen a favor de una tercera persona su actuación en la diligencia programada, ésta deberá presentar un poder especial con firma legalizada ante Notario Público, donde conste expresamente su facultad para asistir y conciliar en su representación. Ello bajo apercibimiento de no realizar la audiencia de conciliación y levantar el acta de inasistencia correspondiente.</w:t>
-      </w:r>
-    </w:p>
-    <w:p>
-      <w:pPr>
-        <w:tabs>
-          <w:tab w:val="left" w:pos="1701"/>
-          <w:tab w:val="left" w:pos="2132"/>
-        </w:tabs>
-        <w:spacing w:line="240" w:lineRule="auto"/>
-        <w:rPr>
-          <w:rFonts w:ascii="Arial Narrow" w:hAnsi="Arial Narrow"/>
-        </w:rPr>
-      </w:pPr>
-    </w:p>
-    <w:p>
-      <w:pPr>
-        <w:tabs>
-          <w:tab w:val="left" w:pos="1701"/>
-          <w:tab w:val="left" w:pos="2132"/>
-        </w:tabs>
-        <w:spacing w:line="240" w:lineRule="auto"/>
-        <w:rPr>
-          <w:rFonts w:ascii="Arial Narrow" w:hAnsi="Arial Narrow"/>
-        </w:rPr>
-      </w:pPr>
-      <w:r>
-        <w:rPr>
-          <w:rFonts w:ascii="Arial Narrow" w:hAnsi="Arial Narrow"/>
-        </w:rPr>
-        <w:t>NOVENO: poner en conocimiento de las partes que, antes de la emisión de la Resolución Final, tienen la posibilidad de formular su desistimiento o presentar el acuerdo arribado mediante la conciliación, mediación, transacción o cualquier otro que, de forma indubitable, deje constancia que se ha solucionado la controversia materia de denuncia.</w:t>
-      </w:r>
-    </w:p>
-    <w:p>
-      <w:pPr>
-        <w:tabs>
-          <w:tab w:val="left" w:pos="1701"/>
-          <w:tab w:val="left" w:pos="2132"/>
-        </w:tabs>
-        <w:spacing w:line="240" w:lineRule="auto"/>
-        <w:rPr>
-          <w:rFonts w:ascii="Arial Narrow" w:hAnsi="Arial Narrow"/>
-        </w:rPr>
-      </w:pPr>
-    </w:p>
-    <w:p>
-      <w:pPr>
-        <w:tabs>
-          <w:tab w:val="left" w:pos="1701"/>
-          <w:tab w:val="left" w:pos="2132"/>
-        </w:tabs>
-        <w:spacing w:line="240" w:lineRule="auto"/>
-        <w:rPr>
-          <w:rFonts w:ascii="Arial Narrow" w:hAnsi="Arial Narrow"/>
-        </w:rPr>
-      </w:pPr>
-      <w:r>
-        <w:rPr>
-          <w:rFonts w:ascii="Arial Narrow" w:hAnsi="Arial Narrow"/>
-        </w:rPr>
-        <w:t>DÉCIMO: requerir al señor Efraín Coronel Quispe para que, dentro del plazo de dos (2) días hábiles siguientes a la fecha en que reciba la notificación en la bandeja de correo electrónico de su representante, efectúe la confirmación de recepción de la notificación remitida por este despacho a dicho correo electrónico, de conformidad con el segundo párrafo del numeral 4 del artículo 20 del Texto Único Ordenado de la Ley del Procedimiento Administrativo General, aprobado mediante Decreto Supremo N° 006-2026-JUS, bajo apercibimiento de rehacer el acto de notificación y notificarle conforme al numeral 1 del artículo 20 del citado cuerpo normativo</w:t>
-      </w:r>
-      <w:r>
-        <w:rPr>
-          <w:rStyle w:val="Refdenotaalpie"/>
-        </w:rPr>
-        <w:footnoteReference w:id="11"/>
-      </w:r>
-      <w:r>
-        <w:rPr>
-          <w:rFonts w:ascii="Arial Narrow" w:hAnsi="Arial Narrow"/>
-        </w:rPr>
-        <w:t>.</w:t>
-      </w:r>
-    </w:p>
-    <w:p>
-      <w:pPr>
-        <w:tabs>
-          <w:tab w:val="left" w:pos="1701"/>
-          <w:tab w:val="left" w:pos="2132"/>
-        </w:tabs>
-        <w:spacing w:line="240" w:lineRule="auto"/>
-        <w:rPr>
-          <w:rFonts w:ascii="Arial Narrow" w:hAnsi="Arial Narrow"/>
-        </w:rPr>
-      </w:pPr>
-    </w:p>
-    <w:p>
-      <w:pPr>
-        <w:tabs>
-          <w:tab w:val="left" w:pos="1701"/>
-          <w:tab w:val="left" w:pos="2132"/>
-        </w:tabs>
-        <w:spacing w:line="240" w:lineRule="auto"/>
-        <w:rPr>
-          <w:rFonts w:ascii="Arial Narrow" w:hAnsi="Arial Narrow"/>
-        </w:rPr>
-      </w:pPr>
-      <w:r>
-        <w:rPr>
-          <w:rFonts w:ascii="Arial Narrow" w:hAnsi="Arial Narrow"/>
-        </w:rPr>
-        <w:t>DÉCIMO PRIMERO: requerir a La Positiva Seguros y Reaseguros S.A.A. para que efectúe el acuse de recibo mediante la confirmación de recepción de la notificación remitida por este despacho a su Casilla Electrónica, dentro de los cinco (5) primeros días hábiles siguientes a la fecha en que recibe la notificación.</w:t>
-      </w:r>
-    </w:p>
-    <w:p>
-      <w:pPr>
-        <w:tabs>
-          <w:tab w:val="left" w:pos="1701"/>
-          <w:tab w:val="left" w:pos="2132"/>
-        </w:tabs>
-        <w:spacing w:line="240" w:lineRule="auto"/>
-        <w:rPr>
-          <w:rFonts w:ascii="Arial Narrow" w:hAnsi="Arial Narrow"/>
-        </w:rPr>
-      </w:pPr>
-    </w:p>
-    <w:p>
-      <w:pPr>
-        <w:tabs>
-          <w:tab w:val="left" w:pos="1701"/>
-          <w:tab w:val="left" w:pos="2132"/>
-        </w:tabs>
-        <w:spacing w:line="240" w:lineRule="auto"/>
-        <w:rPr>
-          <w:rFonts w:ascii="Arial Narrow" w:hAnsi="Arial Narrow"/>
-        </w:rPr>
-      </w:pPr>
-    </w:p>
-    <w:p>
-      <w:pPr>
-        <w:tabs>
-          <w:tab w:val="left" w:pos="1701"/>
-          <w:tab w:val="left" w:pos="2132"/>
-        </w:tabs>
-        <w:spacing w:line="240" w:lineRule="auto"/>
-        <w:rPr>
-          <w:rFonts w:ascii="Arial Narrow" w:hAnsi="Arial Narrow"/>
-        </w:rPr>
-      </w:pPr>
-    </w:p>
-    <w:p>
-      <w:pPr>
-        <w:tabs>
-          <w:tab w:val="left" w:pos="1701"/>
-          <w:tab w:val="left" w:pos="2132"/>
-        </w:tabs>
-        <w:spacing w:line="240" w:lineRule="auto"/>
-        <w:rPr>
-          <w:rFonts w:ascii="Arial Narrow" w:hAnsi="Arial Narrow"/>
-        </w:rPr>
-      </w:pPr>
-    </w:p>
-    <w:p>
-      <w:pPr>
-        <w:tabs>
-          <w:tab w:val="left" w:pos="1701"/>
-          <w:tab w:val="left" w:pos="2132"/>
-        </w:tabs>
-        <w:spacing w:line="240" w:lineRule="auto"/>
-        <w:rPr>
-          <w:rFonts w:ascii="Arial Narrow" w:hAnsi="Arial Narrow"/>
-        </w:rPr>
-      </w:pPr>
-    </w:p>
-    <w:p>
-      <w:pPr>
-        <w:tabs>
-          <w:tab w:val="left" w:pos="1701"/>
-          <w:tab w:val="left" w:pos="2132"/>
-        </w:tabs>
-        <w:spacing w:line="240" w:lineRule="auto"/>
-        <w:jc w:val="center"/>
-        <w:rPr>
-          <w:rFonts w:ascii="Arial Narrow" w:hAnsi="Arial Narrow"/>
-        </w:rPr>
-      </w:pPr>
-      <w:r>
-        <w:rPr>
-          <w:rFonts w:ascii="Arial Narrow" w:hAnsi="Arial Narrow"/>
-        </w:rPr>
-        <w:t>Firmado digitalmente por</w:t>
-      </w:r>
-    </w:p>
-    <w:p>
-      <w:pPr>
-        <w:tabs>
-          <w:tab w:val="left" w:pos="1701"/>
-          <w:tab w:val="left" w:pos="2132"/>
-        </w:tabs>
-        <w:spacing w:line="240" w:lineRule="auto"/>
-        <w:jc w:val="center"/>
-        <w:rPr>
-          <w:rFonts w:ascii="Arial Narrow" w:hAnsi="Arial Narrow"/>
-        </w:rPr>
-      </w:pPr>
-      <w:r>
-        <w:rPr>
-          <w:rFonts w:ascii="Arial Narrow" w:hAnsi="Arial Narrow"/>
-        </w:rPr>
-        <w:t>EVELING ROA QUISPE</w:t>
-      </w:r>
-    </w:p>
-    <w:p>
-      <w:pPr>
-        <w:tabs>
-          <w:tab w:val="left" w:pos="1701"/>
-          <w:tab w:val="left" w:pos="2132"/>
-        </w:tabs>
-        <w:spacing w:line="240" w:lineRule="auto"/>
-        <w:jc w:val="center"/>
-        <w:rPr>
-          <w:rFonts w:ascii="Arial Narrow" w:hAnsi="Arial Narrow"/>
-        </w:rPr>
-      </w:pPr>
-      <w:r>
-        <w:rPr>
-          <w:rFonts w:ascii="Arial Narrow" w:hAnsi="Arial Narrow"/>
-        </w:rPr>
-        <w:t>Secretaria Técnica</w:t>
-      </w:r>
-    </w:p>
-    <w:p>
-      <w:pPr>
-        <w:tabs>
-          <w:tab w:val="left" w:pos="1701"/>
-          <w:tab w:val="left" w:pos="2132"/>
-        </w:tabs>
-        <w:spacing w:line="240" w:lineRule="auto"/>
-        <w:jc w:val="center"/>
-        <w:rPr>
-          <w:rFonts w:ascii="Arial Narrow" w:hAnsi="Arial Narrow"/>
-        </w:rPr>
-      </w:pPr>
-      <w:r>
-        <w:rPr>
-          <w:rFonts w:ascii="Arial Narrow" w:hAnsi="Arial Narrow"/>
-        </w:rPr>
-        <w:t>Comisión de Protección al Consumidor N°1</w:t>
-      </w:r>
-    </w:p>
-    <w:p>
-      <w:pPr>
-        <w:tabs>
-          <w:tab w:val="left" w:pos="1701"/>
-          <w:tab w:val="left" w:pos="2132"/>
-        </w:tabs>
-        <w:spacing w:line="240" w:lineRule="auto"/>
-        <w:jc w:val="center"/>
-        <w:rPr>
-          <w:rFonts w:ascii="Arial Narrow" w:hAnsi="Arial Narrow"/>
-        </w:rPr>
-      </w:pPr>
-      <w:r>
-        <w:rPr>
-          <w:rFonts w:ascii="Arial Narrow" w:hAnsi="Arial Narrow"/>
-        </w:rPr>
-        <w:t>LGP/JCQ</w:t>
+          <w:tab w:val="left" w:pos="567"/>
+        </w:tabs>
+        <w:spacing w:after="0" w:line="240" w:lineRule="auto"/>
+        <w:ind w:left="567" w:hanging="567"/>
+        <w:jc w:val="both"/>
+        <w:rPr>
+          <w:rFonts w:ascii="Arial Narrow" w:hAnsi="Arial Narrow"/>
+        </w:rPr>
+      </w:pPr>
+    </w:p>
+    <w:p>
+      <w:pPr>
+        <w:tabs>
+          <w:tab w:val="left" w:pos="567"/>
+        </w:tabs>
+        <w:spacing w:after="0" w:line="240" w:lineRule="auto"/>
+        <w:ind w:left="567" w:hanging="567"/>
+        <w:jc w:val="both"/>
+        <w:rPr>
+          <w:rFonts w:ascii="Arial Narrow" w:hAnsi="Arial Narrow"/>
+        </w:rPr>
+      </w:pPr>
+    </w:p>
+    <w:p>
+      <w:pPr>
+        <w:tabs>
+          <w:tab w:val="left" w:pos="567"/>
+        </w:tabs>
+        <w:spacing w:after="0" w:line="240" w:lineRule="auto"/>
+        <w:ind w:left="567" w:hanging="567"/>
+        <w:jc w:val="both"/>
+        <w:rPr>
+          <w:rFonts w:ascii="Arial Narrow" w:hAnsi="Arial Narrow"/>
+        </w:rPr>
+      </w:pPr>
+    </w:p>
+    <w:p>
+      <w:pPr>
+        <w:spacing w:after="0" w:line="240" w:lineRule="auto"/>
+        <w:jc w:val="right"/>
+        <w:rPr>
+          <w:rFonts w:ascii="Arial Narrow" w:hAnsi="Arial Narrow"/>
+          <w:sz w:val="16"/>
+        </w:rPr>
+      </w:pPr>
+      <w:r>
+        <w:rPr>
+          <w:rFonts w:ascii="Arial Narrow" w:hAnsi="Arial Narrow"/>
+          <w:sz w:val="16"/>
+        </w:rPr>
+        <w:t>LGP / JCQ</w:t>
       </w:r>
     </w:p>
     <w:sectPr>
@@ -1741,7 +1707,7 @@
       </w:r>
       <w:r>
         <w:tab/>
-        <w:t>Denuncia remitida a esta Comisión mediante DOCUMENTO DE TRASLADO N° 162-2026-PS1/INDECOPI de fecha 2 de junio de 2026, recepcionada el 12 de junio de 2026.</w:t>
+        <w:t>Denuncia remitida a esta Comisión mediante DOCUMENTO DE TRASLADO N° 1452-2026/PS1 de fecha 15 de julio de 2026, recepcionada el 15 de julio de 2026.</w:t>
       </w:r>
     </w:p>
   </w:footnote>
@@ -1767,7 +1733,7 @@
       </w:r>
       <w:r>
         <w:tab/>
-        <w:t>Publicado el 2 de setiembre del 2010 en el Diario Oficial El Peruano, vigente desde el 2 de octubre del 2010 y modificado por Decreto Legislativo 1308.</w:t>
+        <w:t>LEY N° 29571, CÓDIGO DE PROTECCIÓN Y DEFENSA DEL CONSUMIDOR, publicado el 2 de setiembre de 2010 y modificado por Decreto Legislativo N° 1308.</w:t>
       </w:r>
     </w:p>
   </w:footnote>
@@ -1960,19 +1926,19 @@
       </w:r>
       <w:r>
         <w:tab/>
-        <w:t>LEY SOBRE FACULTADES, NORMAS Y ORGANIZACIÓN DEL INDECOPI, APROBADA POR DECRETO LEGISLATIVO N° 807</w:t>
-      </w:r>
-      <w:r>
-        <w:tab/>
-      </w:r>
-      <w:r>
-        <w:br/>
-      </w:r>
-      <w:r>
-        <w:rPr>
-          <w:lang w:val="es-MX"/>
-        </w:rPr>
-        <w:t>Artículo 24.- El Secretario Técnico se encargará de la tramitación del procedimiento. Para ello, cuenta con las siguientes facultades:</w:t>
+        <w:t>LEY N° 29571, CÓDIGO DE PROTECCIÓN Y DEFENSA DEL CONSUMIDOR, publicado el 2 de setiembre de 2010 y modificado por Decreto Legislativo N° 1308</w:t>
+      </w:r>
+      <w:r>
+        <w:tab/>
+      </w:r>
+      <w:r>
+        <w:br/>
+      </w:r>
+      <w:r>
+        <w:rPr>
+          <w:lang w:val="es-MX"/>
+        </w:rPr>
+        <w:t>Artículo 56.- Métodos comerciales coercitivos</w:t>
       </w:r>
       <w:r>
         <w:rPr>
@@ -1998,7 +1964,7 @@
           <w:lang w:val="es-MX"/>
         </w:rPr>
         <w:br/>
-        <w:t>c) Admitir denuncias a trámite, en aquellos casos en que la Comisión le haya delegado esta facultad.</w:t>
+        <w:t>b. Obligar al consumidor a asumir prestaciones que no ha pactado o a efectuar pagos por productos o servicios que no han sido requeridos previamente. En ningún caso puede interpretarse el silencio del consumidor como aceptación de dichas prestaciones o pagos, salvo que lo haya autorizado expresamente con anterioridad.</w:t>
       </w:r>
       <w:r>
         <w:rPr>
@@ -2037,7 +2003,58 @@
       </w:r>
       <w:r>
         <w:tab/>
-        <w:t>El número de trabajadores se atenderá siempre que la empresa haya sido constituida antes de la vigencia de la Ley Nº 30056, publicada el 2 de julio de 2013, que modificó el artículo 5 del Texto Único Ordenado de la Ley de Promoción de la Competitividad, Formalización y Desarrollo de la Micro y Pequeña Empresa y de Acceso al Empleo Decente (LEY MYPE). Ello, en la medida que la Tercera Disposición Complementaria Transitoria de la norma modificatoria precisa que las empresas constituidas antes de la entrada en vigencia de dicha Ley se rigen por los requisitos de acogimiento al régimen de las micro y pequeñas empresas regulados en el Decreto Legislativo 1086.</w:t>
+        <w:t>LEY SOBRE FACULTADES, NORMAS Y ORGANIZACIÓN DEL INDECOPI, APROBADA POR DECRETO LEGISLATIVO N° 807</w:t>
+      </w:r>
+      <w:r>
+        <w:tab/>
+      </w:r>
+      <w:r>
+        <w:br/>
+      </w:r>
+      <w:r>
+        <w:rPr>
+          <w:lang w:val="es-MX"/>
+        </w:rPr>
+        <w:t>Artículo 24.- El Secretario Técnico se encargará de la tramitación del procedimiento. Para ello, cuenta con las siguientes facultades:</w:t>
+      </w:r>
+      <w:r>
+        <w:rPr>
+          <w:lang w:val="es-MX"/>
+        </w:rPr>
+        <w:tab/>
+      </w:r>
+      <w:r>
+        <w:rPr>
+          <w:lang w:val="es-MX"/>
+        </w:rPr>
+        <w:br/>
+        <w:t>(...)</w:t>
+      </w:r>
+      <w:r>
+        <w:rPr>
+          <w:lang w:val="es-MX"/>
+        </w:rPr>
+        <w:tab/>
+      </w:r>
+      <w:r>
+        <w:rPr>
+          <w:lang w:val="es-MX"/>
+        </w:rPr>
+        <w:br/>
+        <w:t>c) Admitir denuncias a trámite, en aquellos casos en que la Comisión le haya delegado esta facultad.</w:t>
+      </w:r>
+      <w:r>
+        <w:rPr>
+          <w:lang w:val="es-MX"/>
+        </w:rPr>
+        <w:tab/>
+      </w:r>
+      <w:r>
+        <w:rPr>
+          <w:lang w:val="es-MX"/>
+        </w:rPr>
+        <w:br/>
+        <w:t>(...).</w:t>
       </w:r>
     </w:p>
   </w:footnote>
@@ -2063,58 +2080,7 @@
       </w:r>
       <w:r>
         <w:tab/>
-        <w:t>LEY N° 29571, CÓDIGO DE PROTECCIÓN Y DEFENSA DEL CONSUMIDOR, publicado el 2 de setiembre de 2010 y modificado por Decreto Legislativo N° 1308</w:t>
-      </w:r>
-      <w:r>
-        <w:tab/>
-      </w:r>
-      <w:r>
-        <w:br/>
-      </w:r>
-      <w:r>
-        <w:rPr>
-          <w:lang w:val="es-MX"/>
-        </w:rPr>
-        <w:t>Artículo 110.- Sanciones Administrativas</w:t>
-      </w:r>
-      <w:r>
-        <w:rPr>
-          <w:lang w:val="es-MX"/>
-        </w:rPr>
-        <w:tab/>
-      </w:r>
-      <w:r>
-        <w:rPr>
-          <w:lang w:val="es-MX"/>
-        </w:rPr>
-        <w:br/>
-        <w:t>(...)</w:t>
-      </w:r>
-      <w:r>
-        <w:rPr>
-          <w:lang w:val="es-MX"/>
-        </w:rPr>
-        <w:tab/>
-      </w:r>
-      <w:r>
-        <w:rPr>
-          <w:lang w:val="es-MX"/>
-        </w:rPr>
-        <w:br/>
-        <w:t>En el caso de las microempresas, la multa no puede superar el diez por ciento (10%) de las ventas o ingresos brutos percibidos por el infractor, relativos a todas sus actividades económicas, correspondientes al ejercicio inmediato anterior al de la expedición de la resolución de primera instancia, siempre que se haya acreditado dichos ingresos, no se encuentre en una situación de reincidencia y el caso no verse sobre la vida, salud o integridad de los consumidores. Para el caso de las pequeñas empresas, la multa no puede superar el veinte por ciento (20%) de las ventas o ingresos brutos percibidos por el infractor, conforme a los requisitos señalados anteriormente.</w:t>
-      </w:r>
-      <w:r>
-        <w:rPr>
-          <w:lang w:val="es-MX"/>
-        </w:rPr>
-        <w:tab/>
-      </w:r>
-      <w:r>
-        <w:rPr>
-          <w:lang w:val="es-MX"/>
-        </w:rPr>
-        <w:br/>
-        <w:t>(...).</w:t>
+        <w:t>El número de trabajadores se atenderá siempre que la empresa haya sido constituida antes de la vigencia de la Ley Nº 30056, publicada el 2 de julio de 2013, que modificó el artículo 5 del Texto Único Ordenado de la Ley de Promoción de la Competitividad, Formalización y Desarrollo de la Micro y Pequeña Empresa y de Acceso al Empleo Decente (LEY MYPE). Ello, en la medida que la Tercera Disposición Complementaria Transitoria de la norma modificatoria precisa que las empresas constituidas antes de la entrada en vigencia de dicha Ley se rigen por los requisitos de acogimiento al régimen de las micro y pequeñas empresas regulados en el Decreto Legislativo 1086.</w:t>
       </w:r>
     </w:p>
   </w:footnote>
@@ -2152,59 +2118,33 @@
         <w:rPr>
           <w:lang w:val="es-MX"/>
         </w:rPr>
-        <w:t>Artículo 110.- Sanciones administrativas</w:t>
-      </w:r>
-      <w:r>
-        <w:rPr>
-          <w:lang w:val="es-MX"/>
-        </w:rPr>
-        <w:tab/>
-      </w:r>
-      <w:r>
-        <w:rPr>
-          <w:lang w:val="es-MX"/>
-        </w:rPr>
-        <w:br/>
-        <w:t>El órgano resolutivo puede sancionar las infracciones administrativas a que se refiere el artículo 108º con amonestación y multas de hasta cuatrocientos cincuenta (450) Unidades Impositivas Tributarias (UIT), las cuales son calificadas de la siguiente manera:</w:t>
-      </w:r>
-      <w:r>
-        <w:rPr>
-          <w:lang w:val="es-MX"/>
-        </w:rPr>
-        <w:tab/>
-      </w:r>
-      <w:r>
-        <w:rPr>
-          <w:lang w:val="es-MX"/>
-        </w:rPr>
-        <w:br/>
-        <w:t>a. Infracciones leves, con una amonestación o con una multa de hasta cincuenta (50) UIT.</w:t>
-      </w:r>
-      <w:r>
-        <w:rPr>
-          <w:lang w:val="es-MX"/>
-        </w:rPr>
-        <w:tab/>
-      </w:r>
-      <w:r>
-        <w:rPr>
-          <w:lang w:val="es-MX"/>
-        </w:rPr>
-        <w:br/>
-        <w:t>b. Infracciones graves, con una multa de hasta ciento cincuenta (150) UIT.</w:t>
-      </w:r>
-      <w:r>
-        <w:rPr>
-          <w:lang w:val="es-MX"/>
-        </w:rPr>
-        <w:tab/>
-      </w:r>
-      <w:r>
-        <w:rPr>
-          <w:lang w:val="es-MX"/>
-        </w:rPr>
-        <w:br/>
-        <w:t>c. Infracciones muy graves, con una multa de hasta cuatrocientos cincuenta (450) UIT.</w:t>
+        <w:t>Artículo 110.- Sanciones Administrativas</w:t>
+      </w:r>
+      <w:r>
+        <w:rPr>
+          <w:lang w:val="es-MX"/>
+        </w:rPr>
+        <w:tab/>
+      </w:r>
+      <w:r>
+        <w:rPr>
+          <w:lang w:val="es-MX"/>
+        </w:rPr>
+        <w:br/>
+        <w:t>(...)</w:t>
+      </w:r>
+      <w:r>
+        <w:rPr>
+          <w:lang w:val="es-MX"/>
+        </w:rPr>
+        <w:tab/>
+      </w:r>
+      <w:r>
+        <w:rPr>
+          <w:lang w:val="es-MX"/>
+        </w:rPr>
+        <w:br/>
+        <w:t>En el caso de las microempresas, la multa no puede superar el diez por ciento (10%) de las ventas o ingresos brutos percibidos por el infractor, relativos a todas sus actividades económicas, correspondientes al ejercicio inmediato anterior al de la expedición de la resolución de primera instancia, siempre que se haya acreditado dichos ingresos, no se encuentre en una situación de reincidencia y el caso no verse sobre la vida, salud o integridad de los consumidores. Para el caso de las pequeñas empresas, la multa no puede superar el veinte por ciento (20%) de las ventas o ingresos brutos percibidos por el infractor, conforme a los requisitos señalados anteriormente.</w:t>
       </w:r>
       <w:r>
         <w:rPr>
@@ -2243,409 +2183,84 @@
       </w:r>
       <w:r>
         <w:tab/>
-        <w:t>Artículo 114.- Medidas correctivas</w:t>
-      </w:r>
-      <w:r>
-        <w:tab/>
-      </w:r>
-      <w:r>
-        <w:br/>
-      </w:r>
-      <w:r>
-        <w:rPr>
-          <w:lang w:val="es-MX"/>
-        </w:rPr>
-        <w:t>Sin perjuicio de la sanción administrativa que corresponda al proveedor por una infracción al presente Código, el Indecopi puede dictar, en calidad de mandatos, medidas correctivas reparadoras y complementarias.</w:t>
-      </w:r>
-      <w:r>
-        <w:rPr>
-          <w:lang w:val="es-MX"/>
-        </w:rPr>
-        <w:tab/>
-      </w:r>
-      <w:r>
-        <w:rPr>
-          <w:lang w:val="es-MX"/>
-        </w:rPr>
-        <w:br/>
-        <w:t>Las medidas correctivas reparadoras pueden dictarse a pedido de parte o de oficio, siempre y cuando sean expresamente informadas sobre esa posibilidad en la notificación de cargo al proveedor por la autoridad encargada del procedimiento.</w:t>
-      </w:r>
-      <w:r>
-        <w:rPr>
-          <w:lang w:val="es-MX"/>
-        </w:rPr>
-        <w:tab/>
-      </w:r>
-      <w:r>
-        <w:rPr>
-          <w:lang w:val="es-MX"/>
-        </w:rPr>
-        <w:br/>
-        <w:t>Las medidas correctivas complementarias pueden dictarse de oficio o a pedido de parte.</w:t>
-      </w:r>
-      <w:r>
-        <w:rPr>
-          <w:lang w:val="es-MX"/>
-        </w:rPr>
-        <w:tab/>
-      </w:r>
-      <w:r>
-        <w:rPr>
-          <w:lang w:val="es-MX"/>
-        </w:rPr>
-        <w:br/>
-        <w:t>Artículo 115.- Medidas correctivas reparadoras</w:t>
-      </w:r>
-      <w:r>
-        <w:rPr>
-          <w:lang w:val="es-MX"/>
-        </w:rPr>
-        <w:tab/>
-      </w:r>
-      <w:r>
-        <w:rPr>
-          <w:lang w:val="es-MX"/>
-        </w:rPr>
-        <w:br/>
-        <w:t>115.1 Las medidas correctivas reparadoras tienen el objeto de resarcir las consecuencias patrimoniales directas e inmediatas ocasionadas al consumidor por la infracción administrativa a su estado anterior. En caso el órgano resolutivo dicte una o varias medidas correctivas, debe considerar lo acordado por las partes durante la relación de consumo. Las medidas correctivas reparadoras pueden consistir en ordenar al proveedor infractor lo siguiente:</w:t>
-      </w:r>
-      <w:r>
-        <w:rPr>
-          <w:lang w:val="es-MX"/>
-        </w:rPr>
-        <w:tab/>
-      </w:r>
-      <w:r>
-        <w:rPr>
-          <w:lang w:val="es-MX"/>
-        </w:rPr>
-        <w:br/>
-        <w:t>a. Reparar productos.</w:t>
-      </w:r>
-      <w:r>
-        <w:rPr>
-          <w:lang w:val="es-MX"/>
-        </w:rPr>
-        <w:tab/>
-      </w:r>
-      <w:r>
-        <w:rPr>
-          <w:lang w:val="es-MX"/>
-        </w:rPr>
-        <w:br/>
-        <w:t>b. Cambiar productos por otros de idénticas o similares características, cuando la reparación no sea posible o no resulte razonable según las circunstancias.</w:t>
-      </w:r>
-      <w:r>
-        <w:rPr>
-          <w:lang w:val="es-MX"/>
-        </w:rPr>
-        <w:tab/>
-      </w:r>
-      <w:r>
-        <w:rPr>
-          <w:lang w:val="es-MX"/>
-        </w:rPr>
-        <w:br/>
-        <w:t>c. Entregar un producto de idénticas características o, cuando esto no resulte posible, de similares características, en los supuestos de pérdida o deterioro atribuible al proveedor y siempre que exista interés del consumidor.</w:t>
-      </w:r>
-      <w:r>
-        <w:rPr>
-          <w:lang w:val="es-MX"/>
-        </w:rPr>
-        <w:tab/>
-      </w:r>
-      <w:r>
-        <w:rPr>
-          <w:lang w:val="es-MX"/>
-        </w:rPr>
-        <w:br/>
-        <w:t>d. Cumplir con ejecutar la prestación u obligación asumida; y si esto no resulte posible o no sea razonable, otra de efectos equivalentes, incluyendo prestaciones dinerarias.</w:t>
-      </w:r>
-      <w:r>
-        <w:rPr>
-          <w:lang w:val="es-MX"/>
-        </w:rPr>
-        <w:tab/>
-      </w:r>
-      <w:r>
-        <w:rPr>
-          <w:lang w:val="es-MX"/>
-        </w:rPr>
-        <w:br/>
-        <w:t>e. Cumplir con ejecutar otras prestaciones u obligaciones legales o convencionales a su cargo.</w:t>
-      </w:r>
-      <w:r>
-        <w:rPr>
-          <w:lang w:val="es-MX"/>
-        </w:rPr>
-        <w:tab/>
-      </w:r>
-      <w:r>
-        <w:rPr>
-          <w:lang w:val="es-MX"/>
-        </w:rPr>
-        <w:br/>
-        <w:t>f. Devolver la contraprestación pagada por el consumidor, más los intereses legales correspondientes, cuando la reparación, reposición, o cumplimiento de la prestación u obligación, según sea el caso, no resulte posible o no sea razonable según las circunstancias.</w:t>
-      </w:r>
-      <w:r>
-        <w:rPr>
-          <w:lang w:val="es-MX"/>
-        </w:rPr>
-        <w:tab/>
-      </w:r>
-      <w:r>
-        <w:rPr>
-          <w:lang w:val="es-MX"/>
-        </w:rPr>
-        <w:br/>
-        <w:t>g. En los supuestos de pagos indebidos o en exceso, devolver estos montos, más los intereses correspondientes.</w:t>
-      </w:r>
-      <w:r>
-        <w:rPr>
-          <w:lang w:val="es-MX"/>
-        </w:rPr>
-        <w:tab/>
-      </w:r>
-      <w:r>
-        <w:rPr>
-          <w:lang w:val="es-MX"/>
-        </w:rPr>
-        <w:br/>
-        <w:t>Pagar los gastos incurridos por el consumidor para mitigar las consecuencias de la infracción administrativa.</w:t>
-      </w:r>
-      <w:r>
-        <w:rPr>
-          <w:lang w:val="es-MX"/>
-        </w:rPr>
-        <w:tab/>
-      </w:r>
-      <w:r>
-        <w:rPr>
-          <w:lang w:val="es-MX"/>
-        </w:rPr>
-        <w:br/>
-        <w:t>Otras medidas reparadoras análogas de efectos equivalentes a las anteriores.</w:t>
-      </w:r>
-      <w:r>
-        <w:rPr>
-          <w:lang w:val="es-MX"/>
-        </w:rPr>
-        <w:tab/>
-      </w:r>
-      <w:r>
-        <w:rPr>
-          <w:lang w:val="es-MX"/>
-        </w:rPr>
-        <w:br/>
-        <w:t>115.2 Las medidas correctivas reparadoras no pueden ser solicitadas de manera acumulativa conjunta, pudiendo plantearse de manera alternativa o subsidiaria, con excepción de la medida correctiva señalada en el literal h) que puede solicitarse conjuntamente con otra medida correctiva. Cuando los órganos competentes del Indecopi se pronuncian respecto de una medida correctiva reparadora, aplican el principio de congruencia procesal.</w:t>
-      </w:r>
-      <w:r>
-        <w:rPr>
-          <w:lang w:val="es-MX"/>
-        </w:rPr>
-        <w:tab/>
-      </w:r>
-      <w:r>
-        <w:rPr>
-          <w:lang w:val="es-MX"/>
-        </w:rPr>
-        <w:br/>
-        <w:t>115.3 Las medidas correctivas reparadoras pueden solicitarse en cualquier momento hasta antes de la notificación de cargo al proveedor, sin perjuicio de la facultad de secretaría técnica de la comisión de requerir al consumidor que precise la medida correctiva materia de solicitud. El consumidor puede variar su solicitud de medida correctiva hasta antes de la decisión de primera instancia, en cuyo caso se confiere traslado al proveedor para que formule su descargo.</w:t>
-      </w:r>
-      <w:r>
-        <w:rPr>
-          <w:lang w:val="es-MX"/>
-        </w:rPr>
-        <w:tab/>
-      </w:r>
-      <w:r>
-        <w:rPr>
-          <w:lang w:val="es-MX"/>
-        </w:rPr>
-        <w:br/>
-        <w:t>115.4 Corresponde al consumidor que solicita el dictado de la medida correctiva reparadora probar las consecuencias patrimoniales directas e inmediatas causadas por la comisión de la infracción administrativa.</w:t>
-      </w:r>
-      <w:r>
-        <w:rPr>
-          <w:lang w:val="es-MX"/>
-        </w:rPr>
-        <w:tab/>
-      </w:r>
-      <w:r>
-        <w:rPr>
-          <w:lang w:val="es-MX"/>
-        </w:rPr>
-        <w:br/>
-        <w:t>115.5 Los bienes o montos objeto de medidas correctivas reparadoras son entregados por el proveedor directamente al consumidor que los reclama, salvo mandato distinto contenido en la resolución. Aquellos bienes o montos materia de una medida correctiva reparadora, que por algún motivo se encuentran en posesión del Indecopi y deban ser entregados a los consumidores beneficiados, son puestos a disposición de estos.</w:t>
-      </w:r>
-      <w:r>
-        <w:rPr>
-          <w:lang w:val="es-MX"/>
-        </w:rPr>
-        <w:tab/>
-      </w:r>
-      <w:r>
-        <w:rPr>
-          <w:lang w:val="es-MX"/>
-        </w:rPr>
-        <w:br/>
-        <w:t>115.6 El extremo de la resolución final que ordena el cumplimiento de una medida correctiva reparadora a favor del consumidor constituye título ejecutivo conforme con lo dispuesto en el artículo 688 del Código Procesal Civil, una vez que quedan consentidas o causan estado en la vía administrativa. La legitimidad para obrar en los procesos civiles de ejecución corresponde a los consumidores beneficiados con la medida correctiva reparadora.</w:t>
-      </w:r>
-      <w:r>
-        <w:rPr>
-          <w:lang w:val="es-MX"/>
-        </w:rPr>
-        <w:tab/>
-      </w:r>
-      <w:r>
-        <w:rPr>
-          <w:lang w:val="es-MX"/>
-        </w:rPr>
-        <w:br/>
-        <w:t>115.7 Las medidas correctivas reparadoras como mandatos dirigidos a resarcir las consecuencias patrimoniales directas e inmediatas originadas por la infracción buscan corregir la conducta infractora y no tienen naturaleza indemnizatoria; son dictadas sin perjuicio de la indemnización por los daños y perjuicios que el consumidor puede solicitar en la vía judicial o arbitral correspondiente. No obstante, se descuenta de la indemnización patrimonial aquella satisfacción patrimonial deducible que el consumidor haya recibido a consecuencia del dictado de una medida correctiva reparadora en sede administrativa.</w:t>
-      </w:r>
-      <w:r>
-        <w:rPr>
-          <w:lang w:val="es-MX"/>
-        </w:rPr>
-        <w:tab/>
-      </w:r>
-      <w:r>
-        <w:rPr>
-          <w:lang w:val="es-MX"/>
-        </w:rPr>
-        <w:br/>
-        <w:t>Artículo 116.- Medidas correctivas complementarias</w:t>
-      </w:r>
-      <w:r>
-        <w:rPr>
-          <w:lang w:val="es-MX"/>
-        </w:rPr>
-        <w:tab/>
-      </w:r>
-      <w:r>
-        <w:rPr>
-          <w:lang w:val="es-MX"/>
-        </w:rPr>
-        <w:br/>
-        <w:t>Las medidas correctivas complementarias tienen el objeto de revertir los efectos de la conducta infractora o evitar que esta se produzca nuevamente en el futuro y pueden ser, entre otras, las siguientes:</w:t>
-      </w:r>
-      <w:r>
-        <w:rPr>
-          <w:lang w:val="es-MX"/>
-        </w:rPr>
-        <w:tab/>
-      </w:r>
-      <w:r>
-        <w:rPr>
-          <w:lang w:val="es-MX"/>
-        </w:rPr>
-        <w:br/>
-        <w:t>a. Que el proveedor cumpla con atender la solicitud de información requerida por el consumidor, siempre que dicho requerimiento guarde relación con el producto adquirido o servicio contratado.</w:t>
-      </w:r>
-      <w:r>
-        <w:rPr>
-          <w:lang w:val="es-MX"/>
-        </w:rPr>
-        <w:tab/>
-      </w:r>
-      <w:r>
-        <w:rPr>
-          <w:lang w:val="es-MX"/>
-        </w:rPr>
-        <w:br/>
-        <w:t>b. Declarar inexigibles las cláusulas que han sido identificadas como abusivas en el procedimiento.</w:t>
-      </w:r>
-      <w:r>
-        <w:rPr>
-          <w:lang w:val="es-MX"/>
-        </w:rPr>
-        <w:tab/>
-      </w:r>
-      <w:r>
-        <w:rPr>
-          <w:lang w:val="es-MX"/>
-        </w:rPr>
-        <w:br/>
-        <w:t>c. El decomiso y destrucción de la mercadería, envases, envolturas o etiquetas.</w:t>
-      </w:r>
-      <w:r>
-        <w:rPr>
-          <w:lang w:val="es-MX"/>
-        </w:rPr>
-        <w:tab/>
-      </w:r>
-      <w:r>
-        <w:rPr>
-          <w:lang w:val="es-MX"/>
-        </w:rPr>
-        <w:br/>
-        <w:t>d. En caso de infracciones muy graves y de reincidencia o reiterancia:</w:t>
-      </w:r>
-      <w:r>
-        <w:rPr>
-          <w:lang w:val="es-MX"/>
-        </w:rPr>
-        <w:tab/>
-      </w:r>
-      <w:r>
-        <w:rPr>
-          <w:lang w:val="es-MX"/>
-        </w:rPr>
-        <w:br/>
-        <w:t>(i) Solicitar a la autoridad correspondiente la clausura temporal del establecimiento industrial, comercial o de servicios por un plazo máximo de seis (6) meses.</w:t>
-      </w:r>
-      <w:r>
-        <w:rPr>
-          <w:lang w:val="es-MX"/>
-        </w:rPr>
-        <w:tab/>
-      </w:r>
-      <w:r>
-        <w:rPr>
-          <w:lang w:val="es-MX"/>
-        </w:rPr>
-        <w:br/>
-        <w:t>(ii) Solicitar a la autoridad competente la inhabilitación, temporal o permanente, del proveedor en función de los alcances de la infracción sancionada.</w:t>
-      </w:r>
-      <w:r>
-        <w:rPr>
-          <w:lang w:val="es-MX"/>
-        </w:rPr>
-        <w:tab/>
-      </w:r>
-      <w:r>
-        <w:rPr>
-          <w:lang w:val="es-MX"/>
-        </w:rPr>
-        <w:br/>
-        <w:t>e. Publicación de avisos rectificatorios o informativos en la forma que determine el Indecopi, tomando en consideración los medios que resulten idóneos para revertir los efectos que el acto objeto de sanción ha ocasionado.</w:t>
-      </w:r>
-      <w:r>
-        <w:rPr>
-          <w:lang w:val="es-MX"/>
-        </w:rPr>
-        <w:tab/>
-      </w:r>
-      <w:r>
-        <w:rPr>
-          <w:lang w:val="es-MX"/>
-        </w:rPr>
-        <w:br/>
-        <w:t>f. Cualquier otra medida correctiva que tenga el objeto de revertir los efectos de la conducta infractora o evitar que esta se produzca nuevamente en el futuro.</w:t>
-      </w:r>
-      <w:r>
-        <w:rPr>
-          <w:lang w:val="es-MX"/>
-        </w:rPr>
-        <w:tab/>
-      </w:r>
-      <w:r>
-        <w:rPr>
-          <w:lang w:val="es-MX"/>
-        </w:rPr>
-        <w:br/>
-        <w:t>El Indecopi está facultado para solicitar a la autoridad municipal y policial el apoyo respectivo para la ejecución de las medidas correctivas complementarias correspondientes.</w:t>
+        <w:t>LEY N° 29571, CÓDIGO DE PROTECCIÓN Y DEFENSA DEL CONSUMIDOR, publicado el 2 de setiembre de 2010 y modificado por Decreto Legislativo N° 1308</w:t>
+      </w:r>
+      <w:r>
+        <w:tab/>
+      </w:r>
+      <w:r>
+        <w:br/>
+      </w:r>
+      <w:r>
+        <w:rPr>
+          <w:lang w:val="es-MX"/>
+        </w:rPr>
+        <w:t>Artículo 114.- Multas.</w:t>
+      </w:r>
+      <w:r>
+        <w:rPr>
+          <w:lang w:val="es-MX"/>
+        </w:rPr>
+        <w:tab/>
+      </w:r>
+      <w:r>
+        <w:rPr>
+          <w:lang w:val="es-MX"/>
+        </w:rPr>
+        <w:br/>
+        <w:t>El Indecopi puede sancionar las infracciones administrativas a que se refiere el artículo 108 con amonestación y multas de hasta cuatrocientas cincuenta (450) Unidades Impositivas Tributarias (UIT), las cuales son calificadas de la siguiente manera:</w:t>
+      </w:r>
+      <w:r>
+        <w:rPr>
+          <w:lang w:val="es-MX"/>
+        </w:rPr>
+        <w:tab/>
+      </w:r>
+      <w:r>
+        <w:rPr>
+          <w:lang w:val="es-MX"/>
+        </w:rPr>
+        <w:br/>
+        <w:t>1. Infracciones leves, con una amonestación o con una multa de hasta cincuenta (50) UIT.</w:t>
+      </w:r>
+      <w:r>
+        <w:rPr>
+          <w:lang w:val="es-MX"/>
+        </w:rPr>
+        <w:tab/>
+      </w:r>
+      <w:r>
+        <w:rPr>
+          <w:lang w:val="es-MX"/>
+        </w:rPr>
+        <w:br/>
+        <w:t>2. Infracciones graves, con una multa de hasta ciento cincuenta (150) UIT.</w:t>
+      </w:r>
+      <w:r>
+        <w:rPr>
+          <w:lang w:val="es-MX"/>
+        </w:rPr>
+        <w:tab/>
+      </w:r>
+      <w:r>
+        <w:rPr>
+          <w:lang w:val="es-MX"/>
+        </w:rPr>
+        <w:br/>
+        <w:t>3. Infracciones muy graves, con una multa de hasta cuatrocientas cincuenta (450) UIT.</w:t>
+      </w:r>
+      <w:r>
+        <w:rPr>
+          <w:lang w:val="es-MX"/>
+        </w:rPr>
+        <w:tab/>
+      </w:r>
+      <w:r>
+        <w:rPr>
+          <w:lang w:val="es-MX"/>
+        </w:rPr>
+        <w:br/>
+        <w:t>En el caso de las microempresas, la multa no puede superar el diez por ciento (10%) de las ventas o ingresos brutos percibidos por el infractor, relativos a todas sus actividades económicas, correspondientes al ejercicio inmediato anterior al de la expedición de la resolución de primera instancia, siempre que se haya acreditado dichos ingresos, no se encuentre en una situación de reincidencia y el caso no verse sobre la vida, salud o integridad de los consumidores. Para el caso de las pequeñas empresas, la multa no puede superar el veinte por ciento (20%) de las ventas o ingresos brutos percibidos por el infractor, conforme a los requisitos señalados anteriormente.</w:t>
       </w:r>
     </w:p>
   </w:footnote>
@@ -2683,59 +2298,72 @@
         <w:rPr>
           <w:lang w:val="es-MX"/>
         </w:rPr>
-        <w:t>Artículo 112.- Criterios de graduación de las sanciones administrativas</w:t>
-      </w:r>
-      <w:r>
-        <w:rPr>
-          <w:lang w:val="es-MX"/>
-        </w:rPr>
-        <w:tab/>
-      </w:r>
-      <w:r>
-        <w:rPr>
-          <w:lang w:val="es-MX"/>
-        </w:rPr>
-        <w:br/>
-        <w:t>(...)</w:t>
-      </w:r>
-      <w:r>
-        <w:rPr>
-          <w:lang w:val="es-MX"/>
-        </w:rPr>
-        <w:tab/>
-      </w:r>
-      <w:r>
-        <w:rPr>
-          <w:lang w:val="es-MX"/>
-        </w:rPr>
-        <w:br/>
-        <w:t>Se consideran circunstancias atenuantes especiales, las siguientes:</w:t>
-      </w:r>
-      <w:r>
-        <w:rPr>
-          <w:lang w:val="es-MX"/>
-        </w:rPr>
-        <w:tab/>
-      </w:r>
-      <w:r>
-        <w:rPr>
-          <w:lang w:val="es-MX"/>
-        </w:rPr>
-        <w:br/>
-        <w:t>(...)</w:t>
-      </w:r>
-      <w:r>
-        <w:rPr>
-          <w:lang w:val="es-MX"/>
-        </w:rPr>
-        <w:tab/>
-      </w:r>
-      <w:r>
-        <w:rPr>
-          <w:lang w:val="es-MX"/>
-        </w:rPr>
-        <w:br/>
-        <w:t>3. En los procedimientos de oficio promovidos por una denuncia de parte, cuando el proveedor se allana a la denuncia presentada o reconoce las pretensiones en ella contenidas, se da por concluido el procedimiento liminarmente, pudiendo imponerse una amonestación si el allanamiento o reconocimiento se realiza con la presentación de los descargos; caso contrario la sanción a imponer será pecuniaria. En aquellos casos en que el allanamiento o reconocimiento verse sobre controversias referidas a actos de discriminación, actos contrarios a la vida y a la salud y sustancias peligrosas, se considera como un atenuante pero la sanción a imponer será pecuniaria. En todos los supuestos de allanamiento y reconocimiento formulados con la presentación de los descargos, se exonera al denunciado del pago de los costos del procedimiento, pero no de las costas.</w:t>
+        <w:t>Artículo 112.- Criterios de graduación de las sanciones administrativas.</w:t>
+      </w:r>
+      <w:r>
+        <w:rPr>
+          <w:lang w:val="es-MX"/>
+        </w:rPr>
+        <w:tab/>
+      </w:r>
+      <w:r>
+        <w:rPr>
+          <w:lang w:val="es-MX"/>
+        </w:rPr>
+        <w:br/>
+        <w:t>(…)</w:t>
+      </w:r>
+      <w:r>
+        <w:rPr>
+          <w:lang w:val="es-MX"/>
+        </w:rPr>
+        <w:tab/>
+      </w:r>
+      <w:r>
+        <w:rPr>
+          <w:lang w:val="es-MX"/>
+        </w:rPr>
+        <w:br/>
+        <w:t>Para determinar la gravedad de la infracción y la aplicación de las multas correspondientes, se considerarán como circunstancias atenuantes especiales, las siguientes:</w:t>
+      </w:r>
+      <w:r>
+        <w:rPr>
+          <w:lang w:val="es-MX"/>
+        </w:rPr>
+        <w:tab/>
+      </w:r>
+      <w:r>
+        <w:rPr>
+          <w:lang w:val="es-MX"/>
+        </w:rPr>
+        <w:br/>
+        <w:t>a. La presentación por el proveedor de una propuesta de conciliación, que coincida con la medida correctiva ordenada por el Indecopi, o que, a criterio de éste, resulte favorable para el consumidor. Esta atenuante será de aplicación, siempre que la propuesta se haya presentado con anterioridad al vencimiento del plazo para la formulación de los descargos y que, una vez rechazada, quede como constancia en el expediente.</w:t>
+      </w:r>
+      <w:r>
+        <w:rPr>
+          <w:lang w:val="es-MX"/>
+        </w:rPr>
+        <w:tab/>
+      </w:r>
+      <w:r>
+        <w:rPr>
+          <w:lang w:val="es-MX"/>
+        </w:rPr>
+        <w:br/>
+        <w:t>b. Acreditar haber concluido con la conducta ilegal tan pronto el infractor tuvo conocimiento de la misma y haber iniciado las acciones necesarias para resarcir los efectos de la misma, antes de la notificación con la resolución de imputación de cargos.</w:t>
+      </w:r>
+      <w:r>
+        <w:rPr>
+          <w:lang w:val="es-MX"/>
+        </w:rPr>
+        <w:tab/>
+      </w:r>
+      <w:r>
+        <w:rPr>
+          <w:lang w:val="es-MX"/>
+        </w:rPr>
+        <w:br/>
+        <w:t>(…).</w:t>
       </w:r>
     </w:p>
   </w:footnote>
@@ -2761,19 +2389,19 @@
       </w:r>
       <w:r>
         <w:tab/>
-        <w:t>DECRETO LEGISLATIVO Nº 807, LEY SOBRE FACULTADES, NORMAS Y ORGANIZACIÓN DEL INDECOPI FACULTADES DE LAS COMISIONES Y OFICINAS DEL INDECOPI</w:t>
-      </w:r>
-      <w:r>
-        <w:tab/>
-      </w:r>
-      <w:r>
-        <w:br/>
-      </w:r>
-      <w:r>
-        <w:rPr>
-          <w:lang w:val="es-MX"/>
-        </w:rPr>
-        <w:t>Artículo 29.- En cualquier estado del procedimiento, e incluso antes de admitirse a trámite la denuncia, el Secretario Técnico podrá citar a las partes a audiencia de conciliación. La audiencia se desarrollará ante el Secretario Técnico o ante la persona que éste designe. Si ambas partes arribaran a un acuerdo respecto de la denuncia, se levantará un acta donde conste el acuerdo respectivo, el mismo que tendrá efectos de transacción extrajudicial. En cualquier caso, la Comisión podrá continuar de oficio el procedimiento, si del análisis de los hechos denunciados considera que podría estarse afectando intereses de terceros.</w:t>
+        <w:t>LEY SOBRE FACULTADES, NORMAS Y ORGANIZACIÓN DEL INDECOPI, APROBADA POR DECRETO LEGISLATIVO N° 807</w:t>
+      </w:r>
+      <w:r>
+        <w:tab/>
+      </w:r>
+      <w:r>
+        <w:br/>
+      </w:r>
+      <w:r>
+        <w:rPr>
+          <w:lang w:val="es-MX"/>
+        </w:rPr>
+        <w:t>Artículo 29.- En cualquier etapa del procedimiento, e incluso antes de admitirse a trámite la denuncia, el Secretario Técnico de la Comisión, un representante designado por él o la persona o institución a la cual se fije tal atribución conforme al artículo siguiente, podrá citar a las partes a una audiencia de conciliación. El acuerdo al que se llegue en la conciliación tendrá efectos de transacción extrajudicial.</w:t>
       </w:r>
     </w:p>
   </w:footnote>
@@ -2799,7 +2427,368 @@
       </w:r>
       <w:r>
         <w:tab/>
-        <w:t>TEXTO ÚNICO ORDENADO DE LA LEY DEL PROCEDIMIENTO ADMINISTRATIVO GENERAL, aprobado mediante DECRETO SUPREMO N° 006-2026-JUS y publicado el 30 de abril de 2026</w:t>
+        <w:t>LEY N° 29571, CÓDIGO DE PROTECCIÓN Y DEFENSA DEL CONSUMIDOR, publicado el 2 de setiembre de 2010 y modificado por Decreto Legislativo N° 1308</w:t>
+      </w:r>
+      <w:r>
+        <w:tab/>
+      </w:r>
+      <w:r>
+        <w:br/>
+      </w:r>
+      <w:r>
+        <w:rPr>
+          <w:lang w:val="es-MX"/>
+        </w:rPr>
+        <w:t>Artículo 116.- Acuerdos que concluyen el procedimiento</w:t>
+      </w:r>
+      <w:r>
+        <w:rPr>
+          <w:lang w:val="es-MX"/>
+        </w:rPr>
+        <w:tab/>
+      </w:r>
+      <w:r>
+        <w:rPr>
+          <w:lang w:val="es-MX"/>
+        </w:rPr>
+        <w:br/>
+        <w:t>Las partes pueden acordar someter la controversia a arbitraje, conciliación o mediación, o arribar a una transacción, desistimiento, o cualquier otro acuerdo que implique el fin del procedimiento en cualquier etapa del mismo. En este supuesto, la autoridad que conoce del procedimiento procede a su conclusión, correspondiéndole el conocimiento del expediente a la instancia correspondiente, para lo cual tiene en consideración lo establecido en la materia por la ley. Sin perjuicio de lo expuesto y de la naturaleza del acuerdo, la Comisión de Protección al Consumidor podrá, de considerarlo pertinente, continuar de oficio con el procedimiento.</w:t>
+      </w:r>
+      <w:r>
+        <w:rPr>
+          <w:lang w:val="es-MX"/>
+        </w:rPr>
+        <w:tab/>
+      </w:r>
+      <w:r>
+        <w:rPr>
+          <w:lang w:val="es-MX"/>
+        </w:rPr>
+        <w:br/>
+        <w:t>TUO DE LA LEY DEL PROCEDIMIENTO ADMINISTRATIVO GENERAL (DECRETO SUPREMO N° 006-2026-JUS)</w:t>
+      </w:r>
+      <w:r>
+        <w:rPr>
+          <w:lang w:val="es-MX"/>
+        </w:rPr>
+        <w:tab/>
+      </w:r>
+      <w:r>
+        <w:rPr>
+          <w:lang w:val="es-MX"/>
+        </w:rPr>
+        <w:br/>
+        <w:t>Artículo 200.- Desistimiento del procedimiento o de la pretensión</w:t>
+      </w:r>
+      <w:r>
+        <w:rPr>
+          <w:lang w:val="es-MX"/>
+        </w:rPr>
+        <w:tab/>
+      </w:r>
+      <w:r>
+        <w:rPr>
+          <w:lang w:val="es-MX"/>
+        </w:rPr>
+        <w:br/>
+        <w:t>(…)</w:t>
+      </w:r>
+      <w:r>
+        <w:rPr>
+          <w:lang w:val="es-MX"/>
+        </w:rPr>
+        <w:tab/>
+      </w:r>
+      <w:r>
+        <w:rPr>
+          <w:lang w:val="es-MX"/>
+        </w:rPr>
+        <w:br/>
+        <w:t>200.3 El desistimiento de alguna pretensión no implica desistirse del procedimiento, el cual continuará respecto a las demás pretensiones no comprendidas. El desistimiento del procedimiento importará la culminación de los actos procedimentales; pero no impedirá que posteriormente vuelva a plantearse igual pretensión en otro procedimiento.</w:t>
+      </w:r>
+      <w:r>
+        <w:rPr>
+          <w:lang w:val="es-MX"/>
+        </w:rPr>
+        <w:tab/>
+      </w:r>
+      <w:r>
+        <w:rPr>
+          <w:lang w:val="es-MX"/>
+        </w:rPr>
+        <w:br/>
+        <w:t>200.4 El desistimiento sólo afectará a quienes lo hubieren formulado.</w:t>
+      </w:r>
+      <w:r>
+        <w:rPr>
+          <w:lang w:val="es-MX"/>
+        </w:rPr>
+        <w:tab/>
+      </w:r>
+      <w:r>
+        <w:rPr>
+          <w:lang w:val="es-MX"/>
+        </w:rPr>
+        <w:br/>
+        <w:t>200.5 El desistimiento podrá hacerse por cualquier medio que permita su constancia y señalando su contenido y alcance. Debe preceder a la resolución que ponga fin al procedimiento.</w:t>
+      </w:r>
+      <w:r>
+        <w:rPr>
+          <w:lang w:val="es-MX"/>
+        </w:rPr>
+        <w:tab/>
+      </w:r>
+      <w:r>
+        <w:rPr>
+          <w:lang w:val="es-MX"/>
+        </w:rPr>
+        <w:br/>
+        <w:t>(...)</w:t>
+      </w:r>
+    </w:p>
+  </w:footnote>
+  <w:footnote w:id="12">
+    <w:p>
+      <w:pPr>
+        <w:pStyle w:val="Textonotapie"/>
+        <w:spacing w:after="200"/>
+        <w:ind w:left="567" w:hanging="567"/>
+        <w:jc w:val="both"/>
+        <w:rPr>
+          <w:lang w:val="es-MX"/>
+        </w:rPr>
+      </w:pPr>
+      <w:r>
+        <w:rPr>
+          <w:rStyle w:val="Refdenotaalpie"/>
+        </w:rPr>
+        <w:footnoteRef/>
+      </w:r>
+      <w:r>
+        <w:t xml:space="preserve"> </w:t>
+      </w:r>
+      <w:r>
+        <w:tab/>
+        <w:t>RESOLUCIÓN N° 138-2022-INDECOPI-COD</w:t>
+      </w:r>
+      <w:r>
+        <w:tab/>
+      </w:r>
+      <w:r>
+        <w:br/>
+      </w:r>
+      <w:r>
+        <w:rPr>
+          <w:lang w:val="es-MX"/>
+        </w:rPr>
+        <w:t>Artículo 1.- Aprobar la Directiva N° 001-2022-DIR-COD-INDECOPI “Directiva que aprueba el régimen de delegación de facultades y de representación para la participación de audiencias de conciliación, la atención de requerimientos de información y el empleo de casilla electrónica en los procedimientos administrativos que se siguen ante el Indecopi”, que se adjunta y forma parte integrante de la presente Resolución.</w:t>
+      </w:r>
+      <w:r>
+        <w:rPr>
+          <w:lang w:val="es-MX"/>
+        </w:rPr>
+        <w:tab/>
+      </w:r>
+      <w:r>
+        <w:rPr>
+          <w:lang w:val="es-MX"/>
+        </w:rPr>
+        <w:br/>
+        <w:t>(...)</w:t>
+      </w:r>
+      <w:r>
+        <w:rPr>
+          <w:lang w:val="es-MX"/>
+        </w:rPr>
+        <w:tab/>
+      </w:r>
+      <w:r>
+        <w:rPr>
+          <w:lang w:val="es-MX"/>
+        </w:rPr>
+        <w:br/>
+      </w:r>
+      <w:r>
+        <w:rPr>
+          <w:lang w:val="es-MX"/>
+        </w:rPr>
+        <w:tab/>
+      </w:r>
+      <w:r>
+        <w:rPr>
+          <w:lang w:val="es-MX"/>
+        </w:rPr>
+        <w:br/>
+        <w:t>DIRECTIVA QUE APRUEBA EL RÉGIMEN DE DELEGACIÓN DE FACULTADES Y DE REPRESENTACIÓN PARA LA PARTICIPACIÓN EN AUDIENCIAS DE CONCILIACIÓN, LA ATENCIÓN DE REQUERIMIENTOS DE INFORMACIÓN Y EL EMPLEO DE CASILLA ELECTRÓNICA EN LOS PROCEDIMIENTOS ADMINISTRATIVOS QUE SE SIGUEN ANTE EL INDECOPI</w:t>
+      </w:r>
+      <w:r>
+        <w:rPr>
+          <w:lang w:val="es-MX"/>
+        </w:rPr>
+        <w:tab/>
+      </w:r>
+      <w:r>
+        <w:rPr>
+          <w:lang w:val="es-MX"/>
+        </w:rPr>
+        <w:br/>
+        <w:t>DIRECTIVA Nº 001-2022-DIR-COD-INDECOPI</w:t>
+      </w:r>
+      <w:r>
+        <w:rPr>
+          <w:lang w:val="es-MX"/>
+        </w:rPr>
+        <w:tab/>
+      </w:r>
+      <w:r>
+        <w:rPr>
+          <w:lang w:val="es-MX"/>
+        </w:rPr>
+        <w:br/>
+        <w:t>(...)</w:t>
+      </w:r>
+      <w:r>
+        <w:rPr>
+          <w:lang w:val="es-MX"/>
+        </w:rPr>
+        <w:tab/>
+      </w:r>
+      <w:r>
+        <w:rPr>
+          <w:lang w:val="es-MX"/>
+        </w:rPr>
+        <w:br/>
+        <w:t>4. DISPOSICIONES GENERALES</w:t>
+      </w:r>
+      <w:r>
+        <w:rPr>
+          <w:lang w:val="es-MX"/>
+        </w:rPr>
+        <w:tab/>
+      </w:r>
+      <w:r>
+        <w:rPr>
+          <w:lang w:val="es-MX"/>
+        </w:rPr>
+        <w:br/>
+        <w:t>4.1. Formalidad para la presentación de los poderes</w:t>
+      </w:r>
+      <w:r>
+        <w:rPr>
+          <w:lang w:val="es-MX"/>
+        </w:rPr>
+        <w:tab/>
+      </w:r>
+      <w:r>
+        <w:rPr>
+          <w:lang w:val="es-MX"/>
+        </w:rPr>
+        <w:br/>
+        <w:t>El otorgamiento de poderes para el ejercicio de las facultades reguladas en el artículo 115 del CPDC, el artículo 29 del DL 807, la delegación de facultades para absolver requerimientos de información que se efectúen al amparo del artículo 15 del DL 807; así como, para administrar y/o gestionar el buzón asociado a una Casilla Electrónica institucional de conformidad con la Directiva N° 001-2013/TRI-INDECOPI y sus modificatorias, debe ser presentado ante el órgano respectivo dentro del plazo otorgado y estar acompañado de su correspondiente declaración jurada, a fin de que obre en el expediente correspondiente.</w:t>
+      </w:r>
+      <w:r>
+        <w:rPr>
+          <w:lang w:val="es-MX"/>
+        </w:rPr>
+        <w:tab/>
+      </w:r>
+      <w:r>
+        <w:rPr>
+          <w:lang w:val="es-MX"/>
+        </w:rPr>
+        <w:br/>
+        <w:t>Solo en el caso en el que se utilice una carta poder para el otorgamiento de poder, la delegación de facultades y/o representación, el documento que la contiene debe indicar obligatoriamente:</w:t>
+      </w:r>
+      <w:r>
+        <w:rPr>
+          <w:lang w:val="es-MX"/>
+        </w:rPr>
+        <w:tab/>
+      </w:r>
+      <w:r>
+        <w:rPr>
+          <w:lang w:val="es-MX"/>
+        </w:rPr>
+        <w:br/>
+        <w:t>i) Nombre o razón social del poderdante.</w:t>
+      </w:r>
+      <w:r>
+        <w:rPr>
+          <w:lang w:val="es-MX"/>
+        </w:rPr>
+        <w:tab/>
+      </w:r>
+      <w:r>
+        <w:rPr>
+          <w:lang w:val="es-MX"/>
+        </w:rPr>
+        <w:br/>
+        <w:t>ii) Nombre del apoderado.</w:t>
+      </w:r>
+      <w:r>
+        <w:rPr>
+          <w:lang w:val="es-MX"/>
+        </w:rPr>
+        <w:tab/>
+      </w:r>
+      <w:r>
+        <w:rPr>
+          <w:lang w:val="es-MX"/>
+        </w:rPr>
+        <w:br/>
+        <w:t>iii) Domicilio legal del poderdante, correo electrónico y/o número telefónico.</w:t>
+      </w:r>
+      <w:r>
+        <w:rPr>
+          <w:lang w:val="es-MX"/>
+        </w:rPr>
+        <w:tab/>
+      </w:r>
+      <w:r>
+        <w:rPr>
+          <w:lang w:val="es-MX"/>
+        </w:rPr>
+        <w:br/>
+        <w:t>iv) Facultades expresamente otorgadas, indicando claramente la fecha y firma del poderdante.</w:t>
+      </w:r>
+      <w:r>
+        <w:rPr>
+          <w:lang w:val="es-MX"/>
+        </w:rPr>
+        <w:tab/>
+      </w:r>
+      <w:r>
+        <w:rPr>
+          <w:lang w:val="es-MX"/>
+        </w:rPr>
+        <w:br/>
+        <w:t>(...).</w:t>
+      </w:r>
+    </w:p>
+  </w:footnote>
+  <w:footnote w:id="13">
+    <w:p>
+      <w:pPr>
+        <w:pStyle w:val="Textonotapie"/>
+        <w:spacing w:after="200"/>
+        <w:ind w:left="567" w:hanging="567"/>
+        <w:jc w:val="both"/>
+        <w:rPr>
+          <w:lang w:val="es-MX"/>
+        </w:rPr>
+      </w:pPr>
+      <w:r>
+        <w:rPr>
+          <w:rStyle w:val="Refdenotaalpie"/>
+        </w:rPr>
+        <w:footnoteRef/>
+      </w:r>
+      <w:r>
+        <w:t xml:space="preserve"> </w:t>
+      </w:r>
+      <w:r>
+        <w:tab/>
+        <w:t>TUO DE LA LEY DEL PROCEDIMIENTO ADMINISTRATIVO GENERAL (DECRETO SUPREMO N° 006-2026-JUS)</w:t>
       </w:r>
       <w:r>
         <w:tab/>
@@ -2824,33 +2813,162 @@
           <w:lang w:val="es-MX"/>
         </w:rPr>
         <w:br/>
-        <w:t>20.4. El administrado interesado o afectado por el acto que hubiera consignado en su escrito alguna dirección electrónica que conste en el expediente puede ser notificado a través de ese medio siempre que haya dado su autorización expresa para ello. Para este caso no es de aplicación el orden de prelación dispuesto en el numeral 20.1.</w:t>
-      </w:r>
-      <w:r>
-        <w:rPr>
-          <w:lang w:val="es-MX"/>
-        </w:rPr>
-        <w:tab/>
-      </w:r>
-      <w:r>
-        <w:rPr>
-          <w:lang w:val="es-MX"/>
-        </w:rPr>
-        <w:br/>
-        <w:t>La notificación dirigida a la dirección de correo electrónico señalada por el administrado se entiende válidamente efectuada cuando la entidad reciba la respuesta de recepción de la dirección electrónica señalada por el administrado o esta sea generada en forma automática por una plataforma tecnológica o sistema informático que garantice que la notificación ha sido efectuada. La notificación surte efectos el día que conste haber sido recibida, conforme lo previsto en el numeral 2 del artículo 25.</w:t>
-      </w:r>
-      <w:r>
-        <w:rPr>
-          <w:lang w:val="es-MX"/>
-        </w:rPr>
-        <w:tab/>
-      </w:r>
-      <w:r>
-        <w:rPr>
-          <w:lang w:val="es-MX"/>
-        </w:rPr>
-        <w:br/>
-        <w:t>En caso de no recibirse respuesta automática de recepción en un plazo máximo de dos (2) días hábiles contados desde el día siguiente de efectuado el acto de notificación vía correo electrónico, se procede a notificar por cédula conforme al inciso 20.1.1, volviéndose a computar el plazo establecido en el numeral 24.1 del artículo 24.</w:t>
+        <w:t>20.1 Las notificaciones son efectuadas a través de las siguientes modalidades, según este respectivo orden de prelación:</w:t>
+      </w:r>
+      <w:r>
+        <w:rPr>
+          <w:lang w:val="es-MX"/>
+        </w:rPr>
+        <w:tab/>
+      </w:r>
+      <w:r>
+        <w:rPr>
+          <w:lang w:val="es-MX"/>
+        </w:rPr>
+        <w:br/>
+        <w:t>(...)</w:t>
+      </w:r>
+      <w:r>
+        <w:rPr>
+          <w:lang w:val="es-MX"/>
+        </w:rPr>
+        <w:tab/>
+      </w:r>
+      <w:r>
+        <w:rPr>
+          <w:lang w:val="es-MX"/>
+        </w:rPr>
+        <w:br/>
+        <w:t>2. Mediante correo electrónico u otro medio electrónico o telemático que permita comprobar fehacientemente su despacho y su recepción, siempre que el administrado haya autorizado expresamente y por escrito el uso de este medio de notificación o se proceda de conformidad con el numeral 20.4 del presente artículo.</w:t>
+      </w:r>
+      <w:r>
+        <w:rPr>
+          <w:lang w:val="es-MX"/>
+        </w:rPr>
+        <w:tab/>
+      </w:r>
+      <w:r>
+        <w:rPr>
+          <w:lang w:val="es-MX"/>
+        </w:rPr>
+        <w:br/>
+        <w:t>20.4 El administrado e interesado prestan su consentimiento expreso para que la entidad cumpla con notificar cualquier acto administrativo al amparo del presente procedimiento mediante la casilla electrónica administrada por el Ministerio de Transportes y Comunicaciones o la que se establezca por norma expresa. Excepcionalmente y de manera adicional, las entidades notificarán, la resolución que pone fin al procedimiento, mediante el sistema de casilla electrónica o el correo electrónico a que se refiere el numeral 20.1.</w:t>
+      </w:r>
+      <w:r>
+        <w:rPr>
+          <w:lang w:val="es-MX"/>
+        </w:rPr>
+        <w:tab/>
+      </w:r>
+      <w:r>
+        <w:rPr>
+          <w:lang w:val="es-MX"/>
+        </w:rPr>
+        <w:br/>
+        <w:t>(...).</w:t>
+      </w:r>
+    </w:p>
+  </w:footnote>
+  <w:footnote w:id="14">
+    <w:p>
+      <w:pPr>
+        <w:pStyle w:val="Textonotapie"/>
+        <w:spacing w:after="200"/>
+        <w:ind w:left="567" w:hanging="567"/>
+        <w:jc w:val="both"/>
+        <w:rPr>
+          <w:lang w:val="es-MX"/>
+        </w:rPr>
+      </w:pPr>
+      <w:r>
+        <w:rPr>
+          <w:rStyle w:val="Refdenotaalpie"/>
+        </w:rPr>
+        <w:footnoteRef/>
+      </w:r>
+      <w:r>
+        <w:t xml:space="preserve"> </w:t>
+      </w:r>
+      <w:r>
+        <w:tab/>
+        <w:t>DIRECTIVA QUE REGULA EL RÉGIMEN DE NOTIFICACIONES DE LOS ACTOS ADMINISTRATIVOS MEDIANTE EL EMPLEO DEL SISTEMA DE CASILLAS ELECTRÓNICAS DEL INDECOPI</w:t>
+      </w:r>
+      <w:r>
+        <w:tab/>
+      </w:r>
+      <w:r>
+        <w:br/>
+      </w:r>
+      <w:r>
+        <w:rPr>
+          <w:lang w:val="es-MX"/>
+        </w:rPr>
+        <w:t>RESOLUCIÓN Nº 052-2020-INDECOPI-COD</w:t>
+      </w:r>
+      <w:r>
+        <w:rPr>
+          <w:lang w:val="es-MX"/>
+        </w:rPr>
+        <w:tab/>
+      </w:r>
+      <w:r>
+        <w:rPr>
+          <w:lang w:val="es-MX"/>
+        </w:rPr>
+        <w:br/>
+        <w:t>(...)</w:t>
+      </w:r>
+      <w:r>
+        <w:rPr>
+          <w:lang w:val="es-MX"/>
+        </w:rPr>
+        <w:tab/>
+      </w:r>
+      <w:r>
+        <w:rPr>
+          <w:lang w:val="es-MX"/>
+        </w:rPr>
+        <w:br/>
+        <w:t>7.3 Recepción y Acuse de la notificación en la Casilla Electrónica.</w:t>
+      </w:r>
+      <w:r>
+        <w:rPr>
+          <w:lang w:val="es-MX"/>
+        </w:rPr>
+        <w:tab/>
+      </w:r>
+      <w:r>
+        <w:rPr>
+          <w:lang w:val="es-MX"/>
+        </w:rPr>
+        <w:br/>
+        <w:t>Al ingresar a su Casilla Electrónica para acceder al contenido del acto administrativo notificado, el Usuario del Sistema genera automáticamente el Acuse de Recibo en el Sistema de Casillas Electrónicas del Indecopi, por lo que, para todo efecto legal se tendrá por válidamente notificado con la respectiva fecha y hora de emisión del Acuse de Recibo.</w:t>
+      </w:r>
+      <w:r>
+        <w:rPr>
+          <w:lang w:val="es-MX"/>
+        </w:rPr>
+        <w:tab/>
+      </w:r>
+      <w:r>
+        <w:rPr>
+          <w:lang w:val="es-MX"/>
+        </w:rPr>
+        <w:br/>
+        <w:t>En caso que el Usuario del Sistema no acceda al contenido del acto administrativo notificado dentro de los cinco (5) días hábiles siguientes a la fecha de remisión del mismo a su Casilla Electrónica, el Acuse de Recibo se generará de manera automática en el Sistema de Casillas Electrónicas del Indecopi con la fecha y hora de vencimiento del aludido plazo, por lo que, para todo efecto legal se tendrá por válidamente notificado.</w:t>
+      </w:r>
+      <w:r>
+        <w:rPr>
+          <w:lang w:val="es-MX"/>
+        </w:rPr>
+        <w:tab/>
+      </w:r>
+      <w:r>
+        <w:rPr>
+          <w:lang w:val="es-MX"/>
+        </w:rPr>
+        <w:br/>
+        <w:t>(...).</w:t>
       </w:r>
     </w:p>
   </w:footnote>
@@ -4070,31 +4188,31 @@
       </w:pPr>
     </w:lvl>
   </w:abstractNum>
-  <w:num w:numId="1" w16cid:durableId="1984969278">
+  <w:num w:numId="1" w16cid:durableId="614482193">
     <w:abstractNumId w:val="8"/>
   </w:num>
-  <w:num w:numId="2" w16cid:durableId="482428450">
+  <w:num w:numId="2" w16cid:durableId="1692563981">
     <w:abstractNumId w:val="1"/>
   </w:num>
-  <w:num w:numId="3" w16cid:durableId="1192692602">
+  <w:num w:numId="3" w16cid:durableId="703211593">
     <w:abstractNumId w:val="6"/>
   </w:num>
-  <w:num w:numId="4" w16cid:durableId="1065951273">
+  <w:num w:numId="4" w16cid:durableId="1971277311">
     <w:abstractNumId w:val="3"/>
   </w:num>
-  <w:num w:numId="5" w16cid:durableId="1365473051">
+  <w:num w:numId="5" w16cid:durableId="1855875305">
     <w:abstractNumId w:val="7"/>
   </w:num>
-  <w:num w:numId="6" w16cid:durableId="1354528703">
+  <w:num w:numId="6" w16cid:durableId="1113205095">
     <w:abstractNumId w:val="0"/>
   </w:num>
-  <w:num w:numId="7" w16cid:durableId="1065644709">
+  <w:num w:numId="7" w16cid:durableId="390931650">
     <w:abstractNumId w:val="4"/>
   </w:num>
-  <w:num w:numId="8" w16cid:durableId="2145928629">
+  <w:num w:numId="8" w16cid:durableId="1993831009">
     <w:abstractNumId w:val="2"/>
   </w:num>
-  <w:num w:numId="9" w16cid:durableId="387413054">
+  <w:num w:numId="9" w16cid:durableId="405037569">
     <w:abstractNumId w:val="5"/>
   </w:num>
 </w:numbering>

</xml_diff>

<commit_message>
docs: fix metadata horizontally unrolled bug using append_metadata_row
</commit_message>
<xml_diff>
--- a/productos (resoluciones) elaborada por google antigravity/ADM 2142-2026 R2.docx
+++ b/productos (resoluciones) elaborada por google antigravity/ADM 2142-2026 R2.docx
@@ -32,62 +32,6 @@
           <w:rFonts w:ascii="Arial Narrow" w:hAnsi="Arial Narrow"/>
         </w:rPr>
         <w:tab/>
-        <w:t>DENUNCIANTE</w:t>
-      </w:r>
-      <w:r>
-        <w:rPr>
-          <w:rFonts w:ascii="Arial Narrow" w:hAnsi="Arial Narrow"/>
-        </w:rPr>
-        <w:tab/>
-        <w:t>:</w:t>
-      </w:r>
-      <w:r>
-        <w:rPr>
-          <w:rFonts w:ascii="Arial Narrow" w:hAnsi="Arial Narrow"/>
-        </w:rPr>
-        <w:tab/>
-        <w:t>DENUNCIADO</w:t>
-      </w:r>
-      <w:r>
-        <w:rPr>
-          <w:rFonts w:ascii="Arial Narrow" w:hAnsi="Arial Narrow"/>
-        </w:rPr>
-        <w:tab/>
-        <w:t>:</w:t>
-      </w:r>
-      <w:r>
-        <w:rPr>
-          <w:rFonts w:ascii="Arial Narrow" w:hAnsi="Arial Narrow"/>
-        </w:rPr>
-        <w:tab/>
-        <w:t>MATERIAS</w:t>
-      </w:r>
-      <w:r>
-        <w:rPr>
-          <w:rFonts w:ascii="Arial Narrow" w:hAnsi="Arial Narrow"/>
-        </w:rPr>
-        <w:tab/>
-        <w:t>:</w:t>
-      </w:r>
-      <w:r>
-        <w:rPr>
-          <w:rFonts w:ascii="Arial Narrow" w:hAnsi="Arial Narrow"/>
-        </w:rPr>
-        <w:tab/>
-        <w:t>RESOLUCIÓN</w:t>
-      </w:r>
-      <w:r>
-        <w:rPr>
-          <w:rFonts w:ascii="Arial Narrow" w:hAnsi="Arial Narrow"/>
-        </w:rPr>
-        <w:tab/>
-        <w:t>:</w:t>
-      </w:r>
-      <w:r>
-        <w:rPr>
-          <w:rFonts w:ascii="Arial Narrow" w:hAnsi="Arial Narrow"/>
-        </w:rPr>
-        <w:tab/>
         <w:t>2142-2026/CC1</w:t>
       </w:r>
     </w:p>
@@ -107,6 +51,20 @@
         <w:rPr>
           <w:rFonts w:ascii="Arial Narrow" w:hAnsi="Arial Narrow"/>
         </w:rPr>
+        <w:t>DENUNCIANTE</w:t>
+      </w:r>
+      <w:r>
+        <w:rPr>
+          <w:rFonts w:ascii="Arial Narrow" w:hAnsi="Arial Narrow"/>
+        </w:rPr>
+        <w:tab/>
+        <w:t>:</w:t>
+      </w:r>
+      <w:r>
+        <w:rPr>
+          <w:rFonts w:ascii="Arial Narrow" w:hAnsi="Arial Narrow"/>
+        </w:rPr>
+        <w:tab/>
         <w:t>EFRAÍN CORONEL QUISPE (SEÑOR CORONEL)</w:t>
       </w:r>
     </w:p>
@@ -126,6 +84,20 @@
         <w:rPr>
           <w:rFonts w:ascii="Arial Narrow" w:hAnsi="Arial Narrow"/>
         </w:rPr>
+        <w:t>DENUNCIADO</w:t>
+      </w:r>
+      <w:r>
+        <w:rPr>
+          <w:rFonts w:ascii="Arial Narrow" w:hAnsi="Arial Narrow"/>
+        </w:rPr>
+        <w:tab/>
+        <w:t>:</w:t>
+      </w:r>
+      <w:r>
+        <w:rPr>
+          <w:rFonts w:ascii="Arial Narrow" w:hAnsi="Arial Narrow"/>
+        </w:rPr>
+        <w:tab/>
         <w:t>LA POSITIVA SEGUROS Y REASEGUROS S.A.A. (LA POSITIVA)</w:t>
       </w:r>
     </w:p>
@@ -145,6 +117,20 @@
         <w:rPr>
           <w:rFonts w:ascii="Arial Narrow" w:hAnsi="Arial Narrow"/>
         </w:rPr>
+        <w:t>MATERIAS</w:t>
+      </w:r>
+      <w:r>
+        <w:rPr>
+          <w:rFonts w:ascii="Arial Narrow" w:hAnsi="Arial Narrow"/>
+        </w:rPr>
+        <w:tab/>
+        <w:t>:</w:t>
+      </w:r>
+      <w:r>
+        <w:rPr>
+          <w:rFonts w:ascii="Arial Narrow" w:hAnsi="Arial Narrow"/>
+        </w:rPr>
+        <w:tab/>
         <w:t>ADMISIÓN A TRÁMITE</w:t>
       </w:r>
     </w:p>
@@ -190,6 +176,20 @@
         <w:rPr>
           <w:rFonts w:ascii="Arial Narrow" w:hAnsi="Arial Narrow"/>
         </w:rPr>
+        <w:t>RESOLUCIÓN</w:t>
+      </w:r>
+      <w:r>
+        <w:rPr>
+          <w:rFonts w:ascii="Arial Narrow" w:hAnsi="Arial Narrow"/>
+        </w:rPr>
+        <w:tab/>
+        <w:t>:</w:t>
+      </w:r>
+      <w:r>
+        <w:rPr>
+          <w:rFonts w:ascii="Arial Narrow" w:hAnsi="Arial Narrow"/>
+        </w:rPr>
+        <w:tab/>
         <w:t>2</w:t>
       </w:r>
     </w:p>
@@ -1008,14 +1008,7 @@
           <w:rFonts w:ascii="Arial Narrow" w:hAnsi="Arial Narrow"/>
         </w:rPr>
         <w:tab/>
-        <w:t xml:space="preserve">en caso califique como micro empresa o pequeña empresa, presentar los documentos que acrediten su volumen de ventas o ingresos brutos percibidos el año anterior relativo a todas sus actividades </w:t>
-      </w:r>
-      <w:r>
-        <w:rPr>
-          <w:rFonts w:ascii="Arial Narrow" w:hAnsi="Arial Narrow"/>
-        </w:rPr>
-        <w:lastRenderedPageBreak/>
-        <w:t>económicas y el número de trabajadores con el que cuenta</w:t>
+        <w:t>en caso califique como micro empresa o pequeña empresa, presentar los documentos que acrediten su volumen de ventas o ingresos brutos percibidos el año anterior relativo a todas sus actividades económicas y el número de trabajadores con el que cuenta</w:t>
       </w:r>
       <w:r>
         <w:rPr>
@@ -1257,14 +1250,7 @@
         <w:rPr>
           <w:rFonts w:ascii="Arial Narrow" w:hAnsi="Arial Narrow"/>
         </w:rPr>
-        <w:t xml:space="preserve">; asimismo, conforme a lo establecido en la norma, se </w:t>
-      </w:r>
-      <w:r>
-        <w:rPr>
-          <w:rFonts w:ascii="Arial Narrow" w:hAnsi="Arial Narrow"/>
-        </w:rPr>
-        <w:lastRenderedPageBreak/>
-        <w:t>considerará como circunstancia atenuante especial el hecho que la parte denunciada, con anterioridad al vencimiento del plazo conferido para que presente sus descargos, acredite haber solucionado la controversia que dio lugar a la interposición de la denuncia</w:t>
+        <w:t>; asimismo, conforme a lo establecido en la norma, se considerará como circunstancia atenuante especial el hecho que la parte denunciada, con anterioridad al vencimiento del plazo conferido para que presente sus descargos, acredite haber solucionado la controversia que dio lugar a la interposición de la denuncia</w:t>
       </w:r>
       <w:r>
         <w:rPr>
@@ -4188,31 +4174,31 @@
       </w:pPr>
     </w:lvl>
   </w:abstractNum>
-  <w:num w:numId="1" w16cid:durableId="614482193">
+  <w:num w:numId="1" w16cid:durableId="1076711962">
     <w:abstractNumId w:val="8"/>
   </w:num>
-  <w:num w:numId="2" w16cid:durableId="1692563981">
+  <w:num w:numId="2" w16cid:durableId="479926890">
     <w:abstractNumId w:val="1"/>
   </w:num>
-  <w:num w:numId="3" w16cid:durableId="703211593">
+  <w:num w:numId="3" w16cid:durableId="1330862085">
     <w:abstractNumId w:val="6"/>
   </w:num>
-  <w:num w:numId="4" w16cid:durableId="1971277311">
+  <w:num w:numId="4" w16cid:durableId="2112846835">
     <w:abstractNumId w:val="3"/>
   </w:num>
-  <w:num w:numId="5" w16cid:durableId="1855875305">
+  <w:num w:numId="5" w16cid:durableId="1984196668">
     <w:abstractNumId w:val="7"/>
   </w:num>
-  <w:num w:numId="6" w16cid:durableId="1113205095">
+  <w:num w:numId="6" w16cid:durableId="1884439265">
     <w:abstractNumId w:val="0"/>
   </w:num>
-  <w:num w:numId="7" w16cid:durableId="390931650">
+  <w:num w:numId="7" w16cid:durableId="1744333865">
     <w:abstractNumId w:val="4"/>
   </w:num>
-  <w:num w:numId="8" w16cid:durableId="1993831009">
+  <w:num w:numId="8" w16cid:durableId="1812361564">
     <w:abstractNumId w:val="2"/>
   </w:num>
-  <w:num w:numId="9" w16cid:durableId="405037569">
+  <w:num w:numId="9" w16cid:durableId="312830260">
     <w:abstractNumId w:val="5"/>
   </w:num>
 </w:numbering>

</xml_diff>

<commit_message>
docs: fix bold rules for metadata and implement bold footnotes parser
</commit_message>
<xml_diff>
--- a/productos (resoluciones) elaborada por google antigravity/ADM 2142-2026 R2.docx
+++ b/productos (resoluciones) elaborada por google antigravity/ADM 2142-2026 R2.docx
@@ -1693,7 +1693,18 @@
       </w:r>
       <w:r>
         <w:tab/>
-        <w:t>Denuncia remitida a esta Comisión mediante DOCUMENTO DE TRASLADO N° 1452-2026/PS1 de fecha 15 de julio de 2026, recepcionada el 15 de julio de 2026.</w:t>
+      </w:r>
+      <w:r>
+        <w:t xml:space="preserve">Denuncia remitida a esta Comisión mediante </w:t>
+      </w:r>
+      <w:r>
+        <w:rPr>
+          <w:b/>
+        </w:rPr>
+        <w:t>DOCUMENTO DE TRASLADO N° 1452-2026/PS1</w:t>
+      </w:r>
+      <w:r>
+        <w:t xml:space="preserve"> de fecha 15 de julio de 2026, recepcionada el 15 de julio de 2026.</w:t>
       </w:r>
     </w:p>
   </w:footnote>
@@ -1719,7 +1730,15 @@
       </w:r>
       <w:r>
         <w:tab/>
-        <w:t>LEY N° 29571, CÓDIGO DE PROTECCIÓN Y DEFENSA DEL CONSUMIDOR, publicado el 2 de setiembre de 2010 y modificado por Decreto Legislativo N° 1308.</w:t>
+      </w:r>
+      <w:r>
+        <w:rPr>
+          <w:b/>
+        </w:rPr>
+        <w:t>LEY N° 29571, CÓDIGO DE PROTECCIÓN Y DEFENSA DEL CONSUMIDOR</w:t>
+      </w:r>
+      <w:r>
+        <w:t>, publicado el 2 de setiembre de 2010 y modificado por Decreto Legislativo N° 1308.</w:t>
       </w:r>
     </w:p>
   </w:footnote>
@@ -1745,44 +1764,81 @@
       </w:r>
       <w:r>
         <w:tab/>
-        <w:t>LEY N° 29571, CÓDIGO DE PROTECCIÓN Y DEFENSA DEL CONSUMIDOR, publicado el 2 de setiembre de 2010 y modificado por Decreto Legislativo N° 1308</w:t>
-      </w:r>
-      <w:r>
-        <w:tab/>
-      </w:r>
-      <w:r>
-        <w:br/>
-      </w:r>
-      <w:r>
-        <w:rPr>
+      </w:r>
+      <w:r>
+        <w:rPr>
+          <w:b/>
+        </w:rPr>
+        <w:t>LEY N° 29571, CÓDIGO DE PROTECCIÓN Y DEFENSA DEL CONSUMIDOR</w:t>
+      </w:r>
+      <w:r>
+        <w:rPr>
+          <w:b/>
+        </w:rPr>
+        <w:tab/>
+      </w:r>
+      <w:r>
+        <w:rPr>
+          <w:b/>
+        </w:rPr>
+        <w:br/>
+      </w:r>
+      <w:r>
+        <w:rPr>
+          <w:b/>
           <w:lang w:val="es-MX"/>
         </w:rPr>
         <w:t>Artículo 105.- Autoridad competente.</w:t>
       </w:r>
       <w:r>
         <w:rPr>
-          <w:lang w:val="es-MX"/>
-        </w:rPr>
-        <w:tab/>
-      </w:r>
-      <w:r>
-        <w:rPr>
-          <w:lang w:val="es-MX"/>
-        </w:rPr>
-        <w:br/>
-        <w:t>El Instituto Nacional de Defensa de la Competencia y de la Protección de la Propiedad Intelectual (Indecopi) es la autoridad con competencia primaria y de alcance nacional para conocer las presuntas infracciones a las disposiciones contenidas en el presente Código, así como para imponer las sanciones y medidas correctivas establecidas en el presente capítulo, conforme a lo dispuesto en el Decreto Legislativo Núm. 1033, Ley de Organización y Funciones del Indecopi. Dicha competencia solo puede ser negada cuando ella haya sido asignada o se asigne a favor de otro organismo por norma expresa con rango de ley.</w:t>
-      </w:r>
-      <w:r>
-        <w:rPr>
-          <w:lang w:val="es-MX"/>
-        </w:rPr>
-        <w:tab/>
-      </w:r>
-      <w:r>
-        <w:rPr>
-          <w:lang w:val="es-MX"/>
-        </w:rPr>
-        <w:br/>
+          <w:b/>
+          <w:lang w:val="es-MX"/>
+        </w:rPr>
+        <w:tab/>
+      </w:r>
+      <w:r>
+        <w:rPr>
+          <w:b/>
+          <w:lang w:val="es-MX"/>
+        </w:rPr>
+        <w:br/>
+      </w:r>
+      <w:r>
+        <w:rPr>
+          <w:lang w:val="es-MX"/>
+        </w:rPr>
+        <w:t xml:space="preserve">El Instituto Nacional de Defensa de la Competencia y de la Protección de la Propiedad Intelectual (Indecopi) es la autoridad con competencia primaria y de alcance nacional para conocer las presuntas infracciones a las disposiciones contenidas en el presente Código, así como para imponer las sanciones y medidas correctivas establecidas en el presente capítulo, conforme a lo dispuesto en el </w:t>
+      </w:r>
+      <w:r>
+        <w:rPr>
+          <w:b/>
+          <w:lang w:val="es-MX"/>
+        </w:rPr>
+        <w:t>Decreto Legislativo Núm. 1033, Ley de Organización y Funciones del Indecopi</w:t>
+      </w:r>
+      <w:r>
+        <w:rPr>
+          <w:lang w:val="es-MX"/>
+        </w:rPr>
+        <w:t>. Dicha competencia solo puede ser negada cuando ella haya sido asignada o se asigne a favor de otro organismo por norma expresa con rango de ley.</w:t>
+      </w:r>
+      <w:r>
+        <w:rPr>
+          <w:lang w:val="es-MX"/>
+        </w:rPr>
+        <w:tab/>
+      </w:r>
+      <w:r>
+        <w:rPr>
+          <w:lang w:val="es-MX"/>
+        </w:rPr>
+        <w:br/>
+      </w:r>
+      <w:r>
+        <w:rPr>
+          <w:lang w:val="es-MX"/>
+        </w:rPr>
         <w:t>Para los procedimientos de protección al consumidor, se consideran autoridades competentes del Indecopi:</w:t>
       </w:r>
       <w:r>
@@ -1796,6 +1852,11 @@
           <w:lang w:val="es-MX"/>
         </w:rPr>
         <w:br/>
+      </w:r>
+      <w:r>
+        <w:rPr>
+          <w:lang w:val="es-MX"/>
+        </w:rPr>
         <w:t>1. La Comisión de Protección al Consumidor.</w:t>
       </w:r>
       <w:r>
@@ -1809,6 +1870,11 @@
           <w:lang w:val="es-MX"/>
         </w:rPr>
         <w:br/>
+      </w:r>
+      <w:r>
+        <w:rPr>
+          <w:lang w:val="es-MX"/>
+        </w:rPr>
         <w:t>2. Los Órganos Resolutivos de Procedimientos Sumarísimos de Protección al Consumidor adscritos a las sedes de la Comisión de Protección al Consumidor, los cuales son creados por el Consejo Directivo del Indecopi.</w:t>
       </w:r>
       <w:r>
@@ -1822,6 +1888,11 @@
           <w:lang w:val="es-MX"/>
         </w:rPr>
         <w:br/>
+      </w:r>
+      <w:r>
+        <w:rPr>
+          <w:lang w:val="es-MX"/>
+        </w:rPr>
         <w:t>3. El Tribunal de Defensa de la Competencia y de la Protección de la Propiedad Intelectual.</w:t>
       </w:r>
       <w:r>
@@ -1847,32 +1918,53 @@
           <w:lang w:val="es-MX"/>
         </w:rPr>
         <w:br/>
+      </w:r>
+      <w:r>
+        <w:rPr>
+          <w:b/>
+          <w:lang w:val="es-MX"/>
+        </w:rPr>
         <w:t>LEY DE ORGANIZACIÓN Y FUNCIONES DEL INDECOPI (LEY N° 1033)</w:t>
       </w:r>
       <w:r>
         <w:rPr>
-          <w:lang w:val="es-MX"/>
-        </w:rPr>
-        <w:tab/>
-      </w:r>
-      <w:r>
-        <w:rPr>
-          <w:lang w:val="es-MX"/>
-        </w:rPr>
-        <w:br/>
+          <w:b/>
+          <w:lang w:val="es-MX"/>
+        </w:rPr>
+        <w:tab/>
+      </w:r>
+      <w:r>
+        <w:rPr>
+          <w:b/>
+          <w:lang w:val="es-MX"/>
+        </w:rPr>
+        <w:br/>
+      </w:r>
+      <w:r>
+        <w:rPr>
+          <w:b/>
+          <w:lang w:val="es-MX"/>
+        </w:rPr>
         <w:t>Artículo 27.- De las Secretarías Técnicas.</w:t>
       </w:r>
       <w:r>
         <w:rPr>
-          <w:lang w:val="es-MX"/>
-        </w:rPr>
-        <w:tab/>
-      </w:r>
-      <w:r>
-        <w:rPr>
-          <w:lang w:val="es-MX"/>
-        </w:rPr>
-        <w:br/>
+          <w:b/>
+          <w:lang w:val="es-MX"/>
+        </w:rPr>
+        <w:tab/>
+      </w:r>
+      <w:r>
+        <w:rPr>
+          <w:b/>
+          <w:lang w:val="es-MX"/>
+        </w:rPr>
+        <w:br/>
+      </w:r>
+      <w:r>
+        <w:rPr>
+          <w:lang w:val="es-MX"/>
+        </w:rPr>
         <w:t>Las Comisiones y el Tribunal cuentan con Secretarías Técnicas. Éstas proporcionan soporte técnico y administrativo al órgano resolutivo al cual se encuentran adscritas y facilitan el ejercicio de sus funciones. El Consejo Directivo aprueba las directivas que rigen el funcionamiento de las Secretarías Técnicas. Excepcionalmente, el Consejo Directivo podrá disponer que la Secretaría Técnica se encuentre adscrita a más de un órgano resolutivo.</w:t>
       </w:r>
       <w:r>
@@ -1886,6 +1978,11 @@
           <w:lang w:val="es-MX"/>
         </w:rPr>
         <w:br/>
+      </w:r>
+      <w:r>
+        <w:rPr>
+          <w:lang w:val="es-MX"/>
+        </w:rPr>
         <w:t>Los procedimientos que se sigan ante las Comisiones se inician siempre de oficio, sea por propia iniciativa de la Secretaría Técnica o a pedido de parte. En este último supuesto, el Secretario Técnico goza de la facultad de admitir a trámite o de rechazar la denuncia respectiva. Las resoluciones que denieguen el inicio de un procedimiento podrán ser apeladas ante el propio órgano colegiado.</w:t>
       </w:r>
     </w:p>
@@ -1912,31 +2009,50 @@
       </w:r>
       <w:r>
         <w:tab/>
-        <w:t>LEY N° 29571, CÓDIGO DE PROTECCIÓN Y DEFENSA DEL CONSUMIDOR, publicado el 2 de setiembre de 2010 y modificado por Decreto Legislativo N° 1308</w:t>
-      </w:r>
-      <w:r>
-        <w:tab/>
-      </w:r>
-      <w:r>
-        <w:br/>
-      </w:r>
-      <w:r>
-        <w:rPr>
+      </w:r>
+      <w:r>
+        <w:rPr>
+          <w:b/>
+        </w:rPr>
+        <w:t>LEY N° 29571, CÓDIGO DE PROTECCIÓN Y DEFENSA DEL CONSUMIDOR</w:t>
+      </w:r>
+      <w:r>
+        <w:rPr>
+          <w:b/>
+        </w:rPr>
+        <w:tab/>
+      </w:r>
+      <w:r>
+        <w:rPr>
+          <w:b/>
+        </w:rPr>
+        <w:br/>
+      </w:r>
+      <w:r>
+        <w:rPr>
+          <w:b/>
           <w:lang w:val="es-MX"/>
         </w:rPr>
         <w:t>Artículo 56.- Métodos comerciales coercitivos</w:t>
       </w:r>
       <w:r>
         <w:rPr>
-          <w:lang w:val="es-MX"/>
-        </w:rPr>
-        <w:tab/>
-      </w:r>
-      <w:r>
-        <w:rPr>
-          <w:lang w:val="es-MX"/>
-        </w:rPr>
-        <w:br/>
+          <w:b/>
+          <w:lang w:val="es-MX"/>
+        </w:rPr>
+        <w:tab/>
+      </w:r>
+      <w:r>
+        <w:rPr>
+          <w:b/>
+          <w:lang w:val="es-MX"/>
+        </w:rPr>
+        <w:br/>
+      </w:r>
+      <w:r>
+        <w:rPr>
+          <w:lang w:val="es-MX"/>
+        </w:rPr>
         <w:t>(...)</w:t>
       </w:r>
       <w:r>
@@ -1950,6 +2066,11 @@
           <w:lang w:val="es-MX"/>
         </w:rPr>
         <w:br/>
+      </w:r>
+      <w:r>
+        <w:rPr>
+          <w:lang w:val="es-MX"/>
+        </w:rPr>
         <w:t>b. Obligar al consumidor a asumir prestaciones que no ha pactado o a efectuar pagos por productos o servicios que no han sido requeridos previamente. En ningún caso puede interpretarse el silencio del consumidor como aceptación de dichas prestaciones o pagos, salvo que lo haya autorizado expresamente con anterioridad.</w:t>
       </w:r>
       <w:r>
@@ -1963,6 +2084,11 @@
           <w:lang w:val="es-MX"/>
         </w:rPr>
         <w:br/>
+      </w:r>
+      <w:r>
+        <w:rPr>
+          <w:lang w:val="es-MX"/>
+        </w:rPr>
         <w:t>(...).</w:t>
       </w:r>
     </w:p>
@@ -1989,31 +2115,54 @@
       </w:r>
       <w:r>
         <w:tab/>
+      </w:r>
+      <w:r>
+        <w:rPr>
+          <w:b/>
+        </w:rPr>
         <w:t>LEY SOBRE FACULTADES, NORMAS Y ORGANIZACIÓN DEL INDECOPI, APROBADA POR DECRETO LEGISLATIVO N° 807</w:t>
       </w:r>
       <w:r>
-        <w:tab/>
-      </w:r>
-      <w:r>
-        <w:br/>
-      </w:r>
-      <w:r>
-        <w:rPr>
-          <w:lang w:val="es-MX"/>
-        </w:rPr>
-        <w:t>Artículo 24.- El Secretario Técnico se encargará de la tramitación del procedimiento. Para ello, cuenta con las siguientes facultades:</w:t>
-      </w:r>
-      <w:r>
-        <w:rPr>
-          <w:lang w:val="es-MX"/>
-        </w:rPr>
-        <w:tab/>
-      </w:r>
-      <w:r>
-        <w:rPr>
-          <w:lang w:val="es-MX"/>
-        </w:rPr>
-        <w:br/>
+        <w:rPr>
+          <w:b/>
+        </w:rPr>
+        <w:tab/>
+      </w:r>
+      <w:r>
+        <w:rPr>
+          <w:b/>
+        </w:rPr>
+        <w:br/>
+      </w:r>
+      <w:r>
+        <w:rPr>
+          <w:b/>
+          <w:lang w:val="es-MX"/>
+        </w:rPr>
+        <w:t>Artículo 24.-</w:t>
+      </w:r>
+      <w:r>
+        <w:rPr>
+          <w:lang w:val="es-MX"/>
+        </w:rPr>
+        <w:t xml:space="preserve"> El Secretario Técnico se encargará de la tramitación del procedimiento. Para ello, cuenta con las siguientes facultades:</w:t>
+      </w:r>
+      <w:r>
+        <w:rPr>
+          <w:lang w:val="es-MX"/>
+        </w:rPr>
+        <w:tab/>
+      </w:r>
+      <w:r>
+        <w:rPr>
+          <w:lang w:val="es-MX"/>
+        </w:rPr>
+        <w:br/>
+      </w:r>
+      <w:r>
+        <w:rPr>
+          <w:lang w:val="es-MX"/>
+        </w:rPr>
         <w:t>(...)</w:t>
       </w:r>
       <w:r>
@@ -2027,6 +2176,11 @@
           <w:lang w:val="es-MX"/>
         </w:rPr>
         <w:br/>
+      </w:r>
+      <w:r>
+        <w:rPr>
+          <w:lang w:val="es-MX"/>
+        </w:rPr>
         <w:t>c) Admitir denuncias a trámite, en aquellos casos en que la Comisión le haya delegado esta facultad.</w:t>
       </w:r>
       <w:r>
@@ -2040,6 +2194,11 @@
           <w:lang w:val="es-MX"/>
         </w:rPr>
         <w:br/>
+      </w:r>
+      <w:r>
+        <w:rPr>
+          <w:lang w:val="es-MX"/>
+        </w:rPr>
         <w:t>(...).</w:t>
       </w:r>
     </w:p>
@@ -2066,7 +2225,36 @@
       </w:r>
       <w:r>
         <w:tab/>
-        <w:t>El número de trabajadores se atenderá siempre que la empresa haya sido constituida antes de la vigencia de la Ley Nº 30056, publicada el 2 de julio de 2013, que modificó el artículo 5 del Texto Único Ordenado de la Ley de Promoción de la Competitividad, Formalización y Desarrollo de la Micro y Pequeña Empresa y de Acceso al Empleo Decente (LEY MYPE). Ello, en la medida que la Tercera Disposición Complementaria Transitoria de la norma modificatoria precisa que las empresas constituidas antes de la entrada en vigencia de dicha Ley se rigen por los requisitos de acogimiento al régimen de las micro y pequeñas empresas regulados en el Decreto Legislativo 1086.</w:t>
+      </w:r>
+      <w:r>
+        <w:t xml:space="preserve">El número de trabajadores se atenderá siempre que la empresa haya sido constituida antes de la vigencia de la </w:t>
+      </w:r>
+      <w:r>
+        <w:rPr>
+          <w:b/>
+        </w:rPr>
+        <w:t>Ley Nº 30056</w:t>
+      </w:r>
+      <w:r>
+        <w:t xml:space="preserve">, publicada el 2 de julio de 2013, que modificó el artículo 5 del </w:t>
+      </w:r>
+      <w:r>
+        <w:rPr>
+          <w:b/>
+        </w:rPr>
+        <w:t>Texto Único Ordenado de la Ley de Promoción de la Competitividad, Formalización y Desarrollo de la Micro y Pequeña Empresa y de Acceso al Empleo Decente (LEY MYPE)</w:t>
+      </w:r>
+      <w:r>
+        <w:t xml:space="preserve">. Ello, en la medida que la Tercera Disposición Complementaria Transitoria de la norma modificatoria precisa que las empresas constituidas antes de la entrada en vigencia de dicha Ley se rigen por los requisitos de acogimiento al régimen de las micro y pequeñas empresas regulados en el </w:t>
+      </w:r>
+      <w:r>
+        <w:rPr>
+          <w:b/>
+        </w:rPr>
+        <w:t>Decreto Legislativo 1086</w:t>
+      </w:r>
+      <w:r>
+        <w:t>.</w:t>
       </w:r>
     </w:p>
   </w:footnote>
@@ -2092,31 +2280,50 @@
       </w:r>
       <w:r>
         <w:tab/>
-        <w:t>LEY N° 29571, CÓDIGO DE PROTECCIÓN Y DEFENSA DEL CONSUMIDOR, publicado el 2 de setiembre de 2010 y modificado por Decreto Legislativo N° 1308</w:t>
-      </w:r>
-      <w:r>
-        <w:tab/>
-      </w:r>
-      <w:r>
-        <w:br/>
-      </w:r>
-      <w:r>
-        <w:rPr>
+      </w:r>
+      <w:r>
+        <w:rPr>
+          <w:b/>
+        </w:rPr>
+        <w:t>LEY N° 29571, CÓDIGO DE PROTECCIÓN Y DEFENSA DEL CONSUMIDOR</w:t>
+      </w:r>
+      <w:r>
+        <w:rPr>
+          <w:b/>
+        </w:rPr>
+        <w:tab/>
+      </w:r>
+      <w:r>
+        <w:rPr>
+          <w:b/>
+        </w:rPr>
+        <w:br/>
+      </w:r>
+      <w:r>
+        <w:rPr>
+          <w:b/>
           <w:lang w:val="es-MX"/>
         </w:rPr>
         <w:t>Artículo 110.- Sanciones Administrativas</w:t>
       </w:r>
       <w:r>
         <w:rPr>
-          <w:lang w:val="es-MX"/>
-        </w:rPr>
-        <w:tab/>
-      </w:r>
-      <w:r>
-        <w:rPr>
-          <w:lang w:val="es-MX"/>
-        </w:rPr>
-        <w:br/>
+          <w:b/>
+          <w:lang w:val="es-MX"/>
+        </w:rPr>
+        <w:tab/>
+      </w:r>
+      <w:r>
+        <w:rPr>
+          <w:b/>
+          <w:lang w:val="es-MX"/>
+        </w:rPr>
+        <w:br/>
+      </w:r>
+      <w:r>
+        <w:rPr>
+          <w:lang w:val="es-MX"/>
+        </w:rPr>
         <w:t>(...)</w:t>
       </w:r>
       <w:r>
@@ -2130,6 +2337,11 @@
           <w:lang w:val="es-MX"/>
         </w:rPr>
         <w:br/>
+      </w:r>
+      <w:r>
+        <w:rPr>
+          <w:lang w:val="es-MX"/>
+        </w:rPr>
         <w:t>En el caso de las microempresas, la multa no puede superar el diez por ciento (10%) de las ventas o ingresos brutos percibidos por el infractor, relativos a todas sus actividades económicas, correspondientes al ejercicio inmediato anterior al de la expedición de la resolución de primera instancia, siempre que se haya acreditado dichos ingresos, no se encuentre en una situación de reincidencia y el caso no verse sobre la vida, salud o integridad de los consumidores. Para el caso de las pequeñas empresas, la multa no puede superar el veinte por ciento (20%) de las ventas o ingresos brutos percibidos por el infractor, conforme a los requisitos señalados anteriormente.</w:t>
       </w:r>
       <w:r>
@@ -2143,6 +2355,11 @@
           <w:lang w:val="es-MX"/>
         </w:rPr>
         <w:br/>
+      </w:r>
+      <w:r>
+        <w:rPr>
+          <w:lang w:val="es-MX"/>
+        </w:rPr>
         <w:t>(...).</w:t>
       </w:r>
     </w:p>
@@ -2169,31 +2386,50 @@
       </w:r>
       <w:r>
         <w:tab/>
-        <w:t>LEY N° 29571, CÓDIGO DE PROTECCIÓN Y DEFENSA DEL CONSUMIDOR, publicado el 2 de setiembre de 2010 y modificado por Decreto Legislativo N° 1308</w:t>
-      </w:r>
-      <w:r>
-        <w:tab/>
-      </w:r>
-      <w:r>
-        <w:br/>
-      </w:r>
-      <w:r>
-        <w:rPr>
+      </w:r>
+      <w:r>
+        <w:rPr>
+          <w:b/>
+        </w:rPr>
+        <w:t>LEY N° 29571, CÓDIGO DE PROTECCIÓN Y DEFENSA DEL CONSUMIDOR</w:t>
+      </w:r>
+      <w:r>
+        <w:rPr>
+          <w:b/>
+        </w:rPr>
+        <w:tab/>
+      </w:r>
+      <w:r>
+        <w:rPr>
+          <w:b/>
+        </w:rPr>
+        <w:br/>
+      </w:r>
+      <w:r>
+        <w:rPr>
+          <w:b/>
           <w:lang w:val="es-MX"/>
         </w:rPr>
         <w:t>Artículo 114.- Multas.</w:t>
       </w:r>
       <w:r>
         <w:rPr>
-          <w:lang w:val="es-MX"/>
-        </w:rPr>
-        <w:tab/>
-      </w:r>
-      <w:r>
-        <w:rPr>
-          <w:lang w:val="es-MX"/>
-        </w:rPr>
-        <w:br/>
+          <w:b/>
+          <w:lang w:val="es-MX"/>
+        </w:rPr>
+        <w:tab/>
+      </w:r>
+      <w:r>
+        <w:rPr>
+          <w:b/>
+          <w:lang w:val="es-MX"/>
+        </w:rPr>
+        <w:br/>
+      </w:r>
+      <w:r>
+        <w:rPr>
+          <w:lang w:val="es-MX"/>
+        </w:rPr>
         <w:t>El Indecopi puede sancionar las infracciones administrativas a que se refiere el artículo 108 con amonestación y multas de hasta cuatrocientas cincuenta (450) Unidades Impositivas Tributarias (UIT), las cuales son calificadas de la siguiente manera:</w:t>
       </w:r>
       <w:r>
@@ -2207,6 +2443,11 @@
           <w:lang w:val="es-MX"/>
         </w:rPr>
         <w:br/>
+      </w:r>
+      <w:r>
+        <w:rPr>
+          <w:lang w:val="es-MX"/>
+        </w:rPr>
         <w:t>1. Infracciones leves, con una amonestación o con una multa de hasta cincuenta (50) UIT.</w:t>
       </w:r>
       <w:r>
@@ -2220,6 +2461,11 @@
           <w:lang w:val="es-MX"/>
         </w:rPr>
         <w:br/>
+      </w:r>
+      <w:r>
+        <w:rPr>
+          <w:lang w:val="es-MX"/>
+        </w:rPr>
         <w:t>2. Infracciones graves, con una multa de hasta ciento cincuenta (150) UIT.</w:t>
       </w:r>
       <w:r>
@@ -2233,6 +2479,11 @@
           <w:lang w:val="es-MX"/>
         </w:rPr>
         <w:br/>
+      </w:r>
+      <w:r>
+        <w:rPr>
+          <w:lang w:val="es-MX"/>
+        </w:rPr>
         <w:t>3. Infracciones muy graves, con una multa de hasta cuatrocientas cincuenta (450) UIT.</w:t>
       </w:r>
       <w:r>
@@ -2246,6 +2497,11 @@
           <w:lang w:val="es-MX"/>
         </w:rPr>
         <w:br/>
+      </w:r>
+      <w:r>
+        <w:rPr>
+          <w:lang w:val="es-MX"/>
+        </w:rPr>
         <w:t>En el caso de las microempresas, la multa no puede superar el diez por ciento (10%) de las ventas o ingresos brutos percibidos por el infractor, relativos a todas sus actividades económicas, correspondientes al ejercicio inmediato anterior al de la expedición de la resolución de primera instancia, siempre que se haya acreditado dichos ingresos, no se encuentre en una situación de reincidencia y el caso no verse sobre la vida, salud o integridad de los consumidores. Para el caso de las pequeñas empresas, la multa no puede superar el veinte por ciento (20%) de las ventas o ingresos brutos percibidos por el infractor, conforme a los requisitos señalados anteriormente.</w:t>
       </w:r>
     </w:p>
@@ -2272,31 +2528,50 @@
       </w:r>
       <w:r>
         <w:tab/>
-        <w:t>LEY N° 29571, CÓDIGO DE PROTECCIÓN Y DEFENSA DEL CONSUMIDOR, publicado el 2 de setiembre de 2010 y modificado por Decreto Legislativo N° 1308</w:t>
-      </w:r>
-      <w:r>
-        <w:tab/>
-      </w:r>
-      <w:r>
-        <w:br/>
-      </w:r>
-      <w:r>
-        <w:rPr>
+      </w:r>
+      <w:r>
+        <w:rPr>
+          <w:b/>
+        </w:rPr>
+        <w:t>LEY N° 29571, CÓDIGO DE PROTECCIÓN Y DEFENSA DEL CONSUMIDOR</w:t>
+      </w:r>
+      <w:r>
+        <w:rPr>
+          <w:b/>
+        </w:rPr>
+        <w:tab/>
+      </w:r>
+      <w:r>
+        <w:rPr>
+          <w:b/>
+        </w:rPr>
+        <w:br/>
+      </w:r>
+      <w:r>
+        <w:rPr>
+          <w:b/>
           <w:lang w:val="es-MX"/>
         </w:rPr>
         <w:t>Artículo 112.- Criterios de graduación de las sanciones administrativas.</w:t>
       </w:r>
       <w:r>
         <w:rPr>
-          <w:lang w:val="es-MX"/>
-        </w:rPr>
-        <w:tab/>
-      </w:r>
-      <w:r>
-        <w:rPr>
-          <w:lang w:val="es-MX"/>
-        </w:rPr>
-        <w:br/>
+          <w:b/>
+          <w:lang w:val="es-MX"/>
+        </w:rPr>
+        <w:tab/>
+      </w:r>
+      <w:r>
+        <w:rPr>
+          <w:b/>
+          <w:lang w:val="es-MX"/>
+        </w:rPr>
+        <w:br/>
+      </w:r>
+      <w:r>
+        <w:rPr>
+          <w:lang w:val="es-MX"/>
+        </w:rPr>
         <w:t>(…)</w:t>
       </w:r>
       <w:r>
@@ -2310,6 +2585,11 @@
           <w:lang w:val="es-MX"/>
         </w:rPr>
         <w:br/>
+      </w:r>
+      <w:r>
+        <w:rPr>
+          <w:lang w:val="es-MX"/>
+        </w:rPr>
         <w:t>Para determinar la gravedad de la infracción y la aplicación de las multas correspondientes, se considerarán como circunstancias atenuantes especiales, las siguientes:</w:t>
       </w:r>
       <w:r>
@@ -2323,6 +2603,11 @@
           <w:lang w:val="es-MX"/>
         </w:rPr>
         <w:br/>
+      </w:r>
+      <w:r>
+        <w:rPr>
+          <w:lang w:val="es-MX"/>
+        </w:rPr>
         <w:t>a. La presentación por el proveedor de una propuesta de conciliación, que coincida con la medida correctiva ordenada por el Indecopi, o que, a criterio de éste, resulte favorable para el consumidor. Esta atenuante será de aplicación, siempre que la propuesta se haya presentado con anterioridad al vencimiento del plazo para la formulación de los descargos y que, una vez rechazada, quede como constancia en el expediente.</w:t>
       </w:r>
       <w:r>
@@ -2336,6 +2621,11 @@
           <w:lang w:val="es-MX"/>
         </w:rPr>
         <w:br/>
+      </w:r>
+      <w:r>
+        <w:rPr>
+          <w:lang w:val="es-MX"/>
+        </w:rPr>
         <w:t>b. Acreditar haber concluido con la conducta ilegal tan pronto el infractor tuvo conocimiento de la misma y haber iniciado las acciones necesarias para resarcir los efectos de la misma, antes de la notificación con la resolución de imputación de cargos.</w:t>
       </w:r>
       <w:r>
@@ -2349,6 +2639,11 @@
           <w:lang w:val="es-MX"/>
         </w:rPr>
         <w:br/>
+      </w:r>
+      <w:r>
+        <w:rPr>
+          <w:lang w:val="es-MX"/>
+        </w:rPr>
         <w:t>(…).</w:t>
       </w:r>
     </w:p>
@@ -2375,19 +2670,37 @@
       </w:r>
       <w:r>
         <w:tab/>
+      </w:r>
+      <w:r>
+        <w:rPr>
+          <w:b/>
+        </w:rPr>
         <w:t>LEY SOBRE FACULTADES, NORMAS Y ORGANIZACIÓN DEL INDECOPI, APROBADA POR DECRETO LEGISLATIVO N° 807</w:t>
       </w:r>
       <w:r>
-        <w:tab/>
-      </w:r>
-      <w:r>
-        <w:br/>
-      </w:r>
-      <w:r>
-        <w:rPr>
-          <w:lang w:val="es-MX"/>
-        </w:rPr>
-        <w:t>Artículo 29.- En cualquier etapa del procedimiento, e incluso antes de admitirse a trámite la denuncia, el Secretario Técnico de la Comisión, un representante designado por él o la persona o institución a la cual se fije tal atribución conforme al artículo siguiente, podrá citar a las partes a una audiencia de conciliación. El acuerdo al que se llegue en la conciliación tendrá efectos de transacción extrajudicial.</w:t>
+        <w:rPr>
+          <w:b/>
+        </w:rPr>
+        <w:tab/>
+      </w:r>
+      <w:r>
+        <w:rPr>
+          <w:b/>
+        </w:rPr>
+        <w:br/>
+      </w:r>
+      <w:r>
+        <w:rPr>
+          <w:b/>
+          <w:lang w:val="es-MX"/>
+        </w:rPr>
+        <w:t>Artículo 29.-</w:t>
+      </w:r>
+      <w:r>
+        <w:rPr>
+          <w:lang w:val="es-MX"/>
+        </w:rPr>
+        <w:t xml:space="preserve"> En cualquier etapa del procedimiento, e incluso antes de admitirse a trámite la denuncia, el Secretario Técnico de la Comisión, un representante designado por él o la persona o institución a la cual se fije tal atribución conforme al artículo siguiente, podrá citar a las partes a una audiencia de conciliación. El acuerdo al que se llegue en la conciliación tendrá efectos de transacción extrajudicial.</w:t>
       </w:r>
     </w:p>
   </w:footnote>
@@ -2413,31 +2726,50 @@
       </w:r>
       <w:r>
         <w:tab/>
-        <w:t>LEY N° 29571, CÓDIGO DE PROTECCIÓN Y DEFENSA DEL CONSUMIDOR, publicado el 2 de setiembre de 2010 y modificado por Decreto Legislativo N° 1308</w:t>
-      </w:r>
-      <w:r>
-        <w:tab/>
-      </w:r>
-      <w:r>
-        <w:br/>
-      </w:r>
-      <w:r>
-        <w:rPr>
+      </w:r>
+      <w:r>
+        <w:rPr>
+          <w:b/>
+        </w:rPr>
+        <w:t>LEY N° 29571, CÓDIGO DE PROTECCIÓN Y DEFENSA DEL CONSUMIDOR</w:t>
+      </w:r>
+      <w:r>
+        <w:rPr>
+          <w:b/>
+        </w:rPr>
+        <w:tab/>
+      </w:r>
+      <w:r>
+        <w:rPr>
+          <w:b/>
+        </w:rPr>
+        <w:br/>
+      </w:r>
+      <w:r>
+        <w:rPr>
+          <w:b/>
           <w:lang w:val="es-MX"/>
         </w:rPr>
         <w:t>Artículo 116.- Acuerdos que concluyen el procedimiento</w:t>
       </w:r>
       <w:r>
         <w:rPr>
-          <w:lang w:val="es-MX"/>
-        </w:rPr>
-        <w:tab/>
-      </w:r>
-      <w:r>
-        <w:rPr>
-          <w:lang w:val="es-MX"/>
-        </w:rPr>
-        <w:br/>
+          <w:b/>
+          <w:lang w:val="es-MX"/>
+        </w:rPr>
+        <w:tab/>
+      </w:r>
+      <w:r>
+        <w:rPr>
+          <w:b/>
+          <w:lang w:val="es-MX"/>
+        </w:rPr>
+        <w:br/>
+      </w:r>
+      <w:r>
+        <w:rPr>
+          <w:lang w:val="es-MX"/>
+        </w:rPr>
         <w:t>Las partes pueden acordar someter la controversia a arbitraje, conciliación o mediación, o arribar a una transacción, desistimiento, o cualquier otro acuerdo que implique el fin del procedimiento en cualquier etapa del mismo. En este supuesto, la autoridad que conoce del procedimiento procede a su conclusión, correspondiéndole el conocimiento del expediente a la instancia correspondiente, para lo cual tiene en consideración lo establecido en la materia por la ley. Sin perjuicio de lo expuesto y de la naturaleza del acuerdo, la Comisión de Protección al Consumidor podrá, de considerarlo pertinente, continuar de oficio con el procedimiento.</w:t>
       </w:r>
       <w:r>
@@ -2451,32 +2783,65 @@
           <w:lang w:val="es-MX"/>
         </w:rPr>
         <w:br/>
+      </w:r>
+      <w:r>
+        <w:rPr>
+          <w:lang w:val="es-MX"/>
+        </w:rPr>
+        <w:tab/>
+      </w:r>
+      <w:r>
+        <w:rPr>
+          <w:lang w:val="es-MX"/>
+        </w:rPr>
+        <w:br/>
+      </w:r>
+      <w:r>
+        <w:rPr>
+          <w:b/>
+          <w:lang w:val="es-MX"/>
+        </w:rPr>
         <w:t>TUO DE LA LEY DEL PROCEDIMIENTO ADMINISTRATIVO GENERAL (DECRETO SUPREMO N° 006-2026-JUS)</w:t>
       </w:r>
       <w:r>
         <w:rPr>
-          <w:lang w:val="es-MX"/>
-        </w:rPr>
-        <w:tab/>
-      </w:r>
-      <w:r>
-        <w:rPr>
-          <w:lang w:val="es-MX"/>
-        </w:rPr>
-        <w:br/>
+          <w:b/>
+          <w:lang w:val="es-MX"/>
+        </w:rPr>
+        <w:tab/>
+      </w:r>
+      <w:r>
+        <w:rPr>
+          <w:b/>
+          <w:lang w:val="es-MX"/>
+        </w:rPr>
+        <w:br/>
+      </w:r>
+      <w:r>
+        <w:rPr>
+          <w:b/>
+          <w:lang w:val="es-MX"/>
+        </w:rPr>
         <w:t>Artículo 200.- Desistimiento del procedimiento o de la pretensión</w:t>
       </w:r>
       <w:r>
         <w:rPr>
-          <w:lang w:val="es-MX"/>
-        </w:rPr>
-        <w:tab/>
-      </w:r>
-      <w:r>
-        <w:rPr>
-          <w:lang w:val="es-MX"/>
-        </w:rPr>
-        <w:br/>
+          <w:b/>
+          <w:lang w:val="es-MX"/>
+        </w:rPr>
+        <w:tab/>
+      </w:r>
+      <w:r>
+        <w:rPr>
+          <w:b/>
+          <w:lang w:val="es-MX"/>
+        </w:rPr>
+        <w:br/>
+      </w:r>
+      <w:r>
+        <w:rPr>
+          <w:lang w:val="es-MX"/>
+        </w:rPr>
         <w:t>(…)</w:t>
       </w:r>
       <w:r>
@@ -2490,6 +2855,11 @@
           <w:lang w:val="es-MX"/>
         </w:rPr>
         <w:br/>
+      </w:r>
+      <w:r>
+        <w:rPr>
+          <w:lang w:val="es-MX"/>
+        </w:rPr>
         <w:t>200.3 El desistimiento de alguna pretensión no implica desistirse del procedimiento, el cual continuará respecto a las demás pretensiones no comprendidas. El desistimiento del procedimiento importará la culminación de los actos procedimentales; pero no impedirá que posteriormente vuelva a plantearse igual pretensión en otro procedimiento.</w:t>
       </w:r>
       <w:r>
@@ -2503,6 +2873,11 @@
           <w:lang w:val="es-MX"/>
         </w:rPr>
         <w:br/>
+      </w:r>
+      <w:r>
+        <w:rPr>
+          <w:lang w:val="es-MX"/>
+        </w:rPr>
         <w:t>200.4 El desistimiento sólo afectará a quienes lo hubieren formulado.</w:t>
       </w:r>
       <w:r>
@@ -2516,6 +2891,11 @@
           <w:lang w:val="es-MX"/>
         </w:rPr>
         <w:br/>
+      </w:r>
+      <w:r>
+        <w:rPr>
+          <w:lang w:val="es-MX"/>
+        </w:rPr>
         <w:t>200.5 El desistimiento podrá hacerse por cualquier medio que permita su constancia y señalando su contenido y alcance. Debe preceder a la resolución que ponga fin al procedimiento.</w:t>
       </w:r>
       <w:r>
@@ -2529,6 +2909,11 @@
           <w:lang w:val="es-MX"/>
         </w:rPr>
         <w:br/>
+      </w:r>
+      <w:r>
+        <w:rPr>
+          <w:lang w:val="es-MX"/>
+        </w:rPr>
         <w:t>(...)</w:t>
       </w:r>
     </w:p>
@@ -2555,31 +2940,67 @@
       </w:r>
       <w:r>
         <w:tab/>
+      </w:r>
+      <w:r>
+        <w:rPr>
+          <w:b/>
+        </w:rPr>
         <w:t>RESOLUCIÓN N° 138-2022-INDECOPI-COD</w:t>
       </w:r>
       <w:r>
-        <w:tab/>
-      </w:r>
-      <w:r>
-        <w:br/>
-      </w:r>
-      <w:r>
-        <w:rPr>
-          <w:lang w:val="es-MX"/>
-        </w:rPr>
-        <w:t>Artículo 1.- Aprobar la Directiva N° 001-2022-DIR-COD-INDECOPI “Directiva que aprueba el régimen de delegación de facultades y de representación para la participación de audiencias de conciliación, la atención de requerimientos de información y el empleo de casilla electrónica en los procedimientos administrativos que se siguen ante el Indecopi”, que se adjunta y forma parte integrante de la presente Resolución.</w:t>
-      </w:r>
-      <w:r>
-        <w:rPr>
-          <w:lang w:val="es-MX"/>
-        </w:rPr>
-        <w:tab/>
-      </w:r>
-      <w:r>
-        <w:rPr>
-          <w:lang w:val="es-MX"/>
-        </w:rPr>
-        <w:br/>
+        <w:rPr>
+          <w:b/>
+        </w:rPr>
+        <w:tab/>
+      </w:r>
+      <w:r>
+        <w:rPr>
+          <w:b/>
+        </w:rPr>
+        <w:br/>
+      </w:r>
+      <w:r>
+        <w:rPr>
+          <w:b/>
+          <w:lang w:val="es-MX"/>
+        </w:rPr>
+        <w:t>Artículo 1.-</w:t>
+      </w:r>
+      <w:r>
+        <w:rPr>
+          <w:lang w:val="es-MX"/>
+        </w:rPr>
+        <w:t xml:space="preserve"> Aprobar la </w:t>
+      </w:r>
+      <w:r>
+        <w:rPr>
+          <w:b/>
+          <w:lang w:val="es-MX"/>
+        </w:rPr>
+        <w:t>Directiva N° 001-2022-DIR-COD-INDECOPI</w:t>
+      </w:r>
+      <w:r>
+        <w:rPr>
+          <w:lang w:val="es-MX"/>
+        </w:rPr>
+        <w:t xml:space="preserve"> “Directiva que aprueba el régimen de delegación de facultades y de representación para la participación de audiencias de conciliación, la atención de requerimientos de información y el empleo de casilla electrónica en los procedimientos administrativos que se siguen ante el Indecopi”, que se adjunta y forma parte integrante de la presente Resolución.</w:t>
+      </w:r>
+      <w:r>
+        <w:rPr>
+          <w:lang w:val="es-MX"/>
+        </w:rPr>
+        <w:tab/>
+      </w:r>
+      <w:r>
+        <w:rPr>
+          <w:lang w:val="es-MX"/>
+        </w:rPr>
+        <w:br/>
+      </w:r>
+      <w:r>
+        <w:rPr>
+          <w:lang w:val="es-MX"/>
+        </w:rPr>
         <w:t>(...)</w:t>
       </w:r>
       <w:r>
@@ -2605,32 +3026,53 @@
           <w:lang w:val="es-MX"/>
         </w:rPr>
         <w:br/>
+      </w:r>
+      <w:r>
+        <w:rPr>
+          <w:b/>
+          <w:lang w:val="es-MX"/>
+        </w:rPr>
         <w:t>DIRECTIVA QUE APRUEBA EL RÉGIMEN DE DELEGACIÓN DE FACULTADES Y DE REPRESENTACIÓN PARA LA PARTICIPACIÓN EN AUDIENCIAS DE CONCILIACIÓN, LA ATENCIÓN DE REQUERIMIENTOS DE INFORMACIÓN Y EL EMPLEO DE CASILLA ELECTRÓNICA EN LOS PROCEDIMIENTOS ADMINISTRATIVOS QUE SE SIGUEN ANTE EL INDECOPI</w:t>
       </w:r>
       <w:r>
         <w:rPr>
-          <w:lang w:val="es-MX"/>
-        </w:rPr>
-        <w:tab/>
-      </w:r>
-      <w:r>
-        <w:rPr>
-          <w:lang w:val="es-MX"/>
-        </w:rPr>
-        <w:br/>
+          <w:b/>
+          <w:lang w:val="es-MX"/>
+        </w:rPr>
+        <w:tab/>
+      </w:r>
+      <w:r>
+        <w:rPr>
+          <w:b/>
+          <w:lang w:val="es-MX"/>
+        </w:rPr>
+        <w:br/>
+      </w:r>
+      <w:r>
+        <w:rPr>
+          <w:b/>
+          <w:lang w:val="es-MX"/>
+        </w:rPr>
         <w:t>DIRECTIVA Nº 001-2022-DIR-COD-INDECOPI</w:t>
       </w:r>
       <w:r>
         <w:rPr>
-          <w:lang w:val="es-MX"/>
-        </w:rPr>
-        <w:tab/>
-      </w:r>
-      <w:r>
-        <w:rPr>
-          <w:lang w:val="es-MX"/>
-        </w:rPr>
-        <w:br/>
+          <w:b/>
+          <w:lang w:val="es-MX"/>
+        </w:rPr>
+        <w:tab/>
+      </w:r>
+      <w:r>
+        <w:rPr>
+          <w:b/>
+          <w:lang w:val="es-MX"/>
+        </w:rPr>
+        <w:br/>
+      </w:r>
+      <w:r>
+        <w:rPr>
+          <w:lang w:val="es-MX"/>
+        </w:rPr>
         <w:t>(...)</w:t>
       </w:r>
       <w:r>
@@ -2644,32 +3086,53 @@
           <w:lang w:val="es-MX"/>
         </w:rPr>
         <w:br/>
+      </w:r>
+      <w:r>
+        <w:rPr>
+          <w:b/>
+          <w:lang w:val="es-MX"/>
+        </w:rPr>
         <w:t>4. DISPOSICIONES GENERALES</w:t>
       </w:r>
       <w:r>
         <w:rPr>
-          <w:lang w:val="es-MX"/>
-        </w:rPr>
-        <w:tab/>
-      </w:r>
-      <w:r>
-        <w:rPr>
-          <w:lang w:val="es-MX"/>
-        </w:rPr>
-        <w:br/>
+          <w:b/>
+          <w:lang w:val="es-MX"/>
+        </w:rPr>
+        <w:tab/>
+      </w:r>
+      <w:r>
+        <w:rPr>
+          <w:b/>
+          <w:lang w:val="es-MX"/>
+        </w:rPr>
+        <w:br/>
+      </w:r>
+      <w:r>
+        <w:rPr>
+          <w:b/>
+          <w:lang w:val="es-MX"/>
+        </w:rPr>
         <w:t>4.1. Formalidad para la presentación de los poderes</w:t>
       </w:r>
       <w:r>
         <w:rPr>
-          <w:lang w:val="es-MX"/>
-        </w:rPr>
-        <w:tab/>
-      </w:r>
-      <w:r>
-        <w:rPr>
-          <w:lang w:val="es-MX"/>
-        </w:rPr>
-        <w:br/>
+          <w:b/>
+          <w:lang w:val="es-MX"/>
+        </w:rPr>
+        <w:tab/>
+      </w:r>
+      <w:r>
+        <w:rPr>
+          <w:b/>
+          <w:lang w:val="es-MX"/>
+        </w:rPr>
+        <w:br/>
+      </w:r>
+      <w:r>
+        <w:rPr>
+          <w:lang w:val="es-MX"/>
+        </w:rPr>
         <w:t>El otorgamiento de poderes para el ejercicio de las facultades reguladas en el artículo 115 del CPDC, el artículo 29 del DL 807, la delegación de facultades para absolver requerimientos de información que se efectúen al amparo del artículo 15 del DL 807; así como, para administrar y/o gestionar el buzón asociado a una Casilla Electrónica institucional de conformidad con la Directiva N° 001-2013/TRI-INDECOPI y sus modificatorias, debe ser presentado ante el órgano respectivo dentro del plazo otorgado y estar acompañado de su correspondiente declaración jurada, a fin de que obre en el expediente correspondiente.</w:t>
       </w:r>
       <w:r>
@@ -2683,6 +3146,11 @@
           <w:lang w:val="es-MX"/>
         </w:rPr>
         <w:br/>
+      </w:r>
+      <w:r>
+        <w:rPr>
+          <w:lang w:val="es-MX"/>
+        </w:rPr>
         <w:t>Solo en el caso en el que se utilice una carta poder para el otorgamiento de poder, la delegación de facultades y/o representación, el documento que la contiene debe indicar obligatoriamente:</w:t>
       </w:r>
       <w:r>
@@ -2696,6 +3164,11 @@
           <w:lang w:val="es-MX"/>
         </w:rPr>
         <w:br/>
+      </w:r>
+      <w:r>
+        <w:rPr>
+          <w:lang w:val="es-MX"/>
+        </w:rPr>
         <w:t>i) Nombre o razón social del poderdante.</w:t>
       </w:r>
       <w:r>
@@ -2709,6 +3182,11 @@
           <w:lang w:val="es-MX"/>
         </w:rPr>
         <w:br/>
+      </w:r>
+      <w:r>
+        <w:rPr>
+          <w:lang w:val="es-MX"/>
+        </w:rPr>
         <w:t>ii) Nombre del apoderado.</w:t>
       </w:r>
       <w:r>
@@ -2722,6 +3200,11 @@
           <w:lang w:val="es-MX"/>
         </w:rPr>
         <w:br/>
+      </w:r>
+      <w:r>
+        <w:rPr>
+          <w:lang w:val="es-MX"/>
+        </w:rPr>
         <w:t>iii) Domicilio legal del poderdante, correo electrónico y/o número telefónico.</w:t>
       </w:r>
       <w:r>
@@ -2735,6 +3218,11 @@
           <w:lang w:val="es-MX"/>
         </w:rPr>
         <w:br/>
+      </w:r>
+      <w:r>
+        <w:rPr>
+          <w:lang w:val="es-MX"/>
+        </w:rPr>
         <w:t>iv) Facultades expresamente otorgadas, indicando claramente la fecha y firma del poderdante.</w:t>
       </w:r>
       <w:r>
@@ -2748,6 +3236,11 @@
           <w:lang w:val="es-MX"/>
         </w:rPr>
         <w:br/>
+      </w:r>
+      <w:r>
+        <w:rPr>
+          <w:lang w:val="es-MX"/>
+        </w:rPr>
         <w:t>(...).</w:t>
       </w:r>
     </w:p>
@@ -2774,31 +3267,50 @@
       </w:r>
       <w:r>
         <w:tab/>
+      </w:r>
+      <w:r>
+        <w:rPr>
+          <w:b/>
+        </w:rPr>
         <w:t>TUO DE LA LEY DEL PROCEDIMIENTO ADMINISTRATIVO GENERAL (DECRETO SUPREMO N° 006-2026-JUS)</w:t>
       </w:r>
       <w:r>
-        <w:tab/>
-      </w:r>
-      <w:r>
-        <w:br/>
-      </w:r>
-      <w:r>
-        <w:rPr>
+        <w:rPr>
+          <w:b/>
+        </w:rPr>
+        <w:tab/>
+      </w:r>
+      <w:r>
+        <w:rPr>
+          <w:b/>
+        </w:rPr>
+        <w:br/>
+      </w:r>
+      <w:r>
+        <w:rPr>
+          <w:b/>
           <w:lang w:val="es-MX"/>
         </w:rPr>
         <w:t>Artículo 20.- Modalidades de notificación</w:t>
       </w:r>
       <w:r>
         <w:rPr>
-          <w:lang w:val="es-MX"/>
-        </w:rPr>
-        <w:tab/>
-      </w:r>
-      <w:r>
-        <w:rPr>
-          <w:lang w:val="es-MX"/>
-        </w:rPr>
-        <w:br/>
+          <w:b/>
+          <w:lang w:val="es-MX"/>
+        </w:rPr>
+        <w:tab/>
+      </w:r>
+      <w:r>
+        <w:rPr>
+          <w:b/>
+          <w:lang w:val="es-MX"/>
+        </w:rPr>
+        <w:br/>
+      </w:r>
+      <w:r>
+        <w:rPr>
+          <w:lang w:val="es-MX"/>
+        </w:rPr>
         <w:t>20.1 Las notificaciones son efectuadas a través de las siguientes modalidades, según este respectivo orden de prelación:</w:t>
       </w:r>
       <w:r>
@@ -2812,6 +3324,11 @@
           <w:lang w:val="es-MX"/>
         </w:rPr>
         <w:br/>
+      </w:r>
+      <w:r>
+        <w:rPr>
+          <w:lang w:val="es-MX"/>
+        </w:rPr>
         <w:t>(...)</w:t>
       </w:r>
       <w:r>
@@ -2825,6 +3342,11 @@
           <w:lang w:val="es-MX"/>
         </w:rPr>
         <w:br/>
+      </w:r>
+      <w:r>
+        <w:rPr>
+          <w:lang w:val="es-MX"/>
+        </w:rPr>
         <w:t>2. Mediante correo electrónico u otro medio electrónico o telemático que permita comprobar fehacientemente su despacho y su recepción, siempre que el administrado haya autorizado expresamente y por escrito el uso de este medio de notificación o se proceda de conformidad con el numeral 20.4 del presente artículo.</w:t>
       </w:r>
       <w:r>
@@ -2838,6 +3360,11 @@
           <w:lang w:val="es-MX"/>
         </w:rPr>
         <w:br/>
+      </w:r>
+      <w:r>
+        <w:rPr>
+          <w:lang w:val="es-MX"/>
+        </w:rPr>
         <w:t>20.4 El administrado e interesado prestan su consentimiento expreso para que la entidad cumpla con notificar cualquier acto administrativo al amparo del presente procedimiento mediante la casilla electrónica administrada por el Ministerio de Transportes y Comunicaciones o la que se establezca por norma expresa. Excepcionalmente y de manera adicional, las entidades notificarán, la resolución que pone fin al procedimiento, mediante el sistema de casilla electrónica o el correo electrónico a que se refiere el numeral 20.1.</w:t>
       </w:r>
       <w:r>
@@ -2851,6 +3378,11 @@
           <w:lang w:val="es-MX"/>
         </w:rPr>
         <w:br/>
+      </w:r>
+      <w:r>
+        <w:rPr>
+          <w:lang w:val="es-MX"/>
+        </w:rPr>
         <w:t>(...).</w:t>
       </w:r>
     </w:p>
@@ -2877,31 +3409,50 @@
       </w:r>
       <w:r>
         <w:tab/>
+      </w:r>
+      <w:r>
+        <w:rPr>
+          <w:b/>
+        </w:rPr>
         <w:t>DIRECTIVA QUE REGULA EL RÉGIMEN DE NOTIFICACIONES DE LOS ACTOS ADMINISTRATIVOS MEDIANTE EL EMPLEO DEL SISTEMA DE CASILLAS ELECTRÓNICAS DEL INDECOPI</w:t>
       </w:r>
       <w:r>
-        <w:tab/>
-      </w:r>
-      <w:r>
-        <w:br/>
-      </w:r>
-      <w:r>
-        <w:rPr>
+        <w:rPr>
+          <w:b/>
+        </w:rPr>
+        <w:tab/>
+      </w:r>
+      <w:r>
+        <w:rPr>
+          <w:b/>
+        </w:rPr>
+        <w:br/>
+      </w:r>
+      <w:r>
+        <w:rPr>
+          <w:b/>
           <w:lang w:val="es-MX"/>
         </w:rPr>
         <w:t>RESOLUCIÓN Nº 052-2020-INDECOPI-COD</w:t>
       </w:r>
       <w:r>
         <w:rPr>
-          <w:lang w:val="es-MX"/>
-        </w:rPr>
-        <w:tab/>
-      </w:r>
-      <w:r>
-        <w:rPr>
-          <w:lang w:val="es-MX"/>
-        </w:rPr>
-        <w:br/>
+          <w:b/>
+          <w:lang w:val="es-MX"/>
+        </w:rPr>
+        <w:tab/>
+      </w:r>
+      <w:r>
+        <w:rPr>
+          <w:b/>
+          <w:lang w:val="es-MX"/>
+        </w:rPr>
+        <w:br/>
+      </w:r>
+      <w:r>
+        <w:rPr>
+          <w:lang w:val="es-MX"/>
+        </w:rPr>
         <w:t>(...)</w:t>
       </w:r>
       <w:r>
@@ -2915,19 +3466,32 @@
           <w:lang w:val="es-MX"/>
         </w:rPr>
         <w:br/>
+      </w:r>
+      <w:r>
+        <w:rPr>
+          <w:b/>
+          <w:lang w:val="es-MX"/>
+        </w:rPr>
         <w:t>7.3 Recepción y Acuse de la notificación en la Casilla Electrónica.</w:t>
       </w:r>
       <w:r>
         <w:rPr>
-          <w:lang w:val="es-MX"/>
-        </w:rPr>
-        <w:tab/>
-      </w:r>
-      <w:r>
-        <w:rPr>
-          <w:lang w:val="es-MX"/>
-        </w:rPr>
-        <w:br/>
+          <w:b/>
+          <w:lang w:val="es-MX"/>
+        </w:rPr>
+        <w:tab/>
+      </w:r>
+      <w:r>
+        <w:rPr>
+          <w:b/>
+          <w:lang w:val="es-MX"/>
+        </w:rPr>
+        <w:br/>
+      </w:r>
+      <w:r>
+        <w:rPr>
+          <w:lang w:val="es-MX"/>
+        </w:rPr>
         <w:t>Al ingresar a su Casilla Electrónica para acceder al contenido del acto administrativo notificado, el Usuario del Sistema genera automáticamente el Acuse de Recibo en el Sistema de Casillas Electrónicas del Indecopi, por lo que, para todo efecto legal se tendrá por válidamente notificado con la respectiva fecha y hora de emisión del Acuse de Recibo.</w:t>
       </w:r>
       <w:r>
@@ -2941,6 +3505,11 @@
           <w:lang w:val="es-MX"/>
         </w:rPr>
         <w:br/>
+      </w:r>
+      <w:r>
+        <w:rPr>
+          <w:lang w:val="es-MX"/>
+        </w:rPr>
         <w:t>En caso que el Usuario del Sistema no acceda al contenido del acto administrativo notificado dentro de los cinco (5) días hábiles siguientes a la fecha de remisión del mismo a su Casilla Electrónica, el Acuse de Recibo se generará de manera automática en el Sistema de Casillas Electrónicas del Indecopi con la fecha y hora de vencimiento del aludido plazo, por lo que, para todo efecto legal se tendrá por válidamente notificado.</w:t>
       </w:r>
       <w:r>
@@ -2954,6 +3523,11 @@
           <w:lang w:val="es-MX"/>
         </w:rPr>
         <w:br/>
+      </w:r>
+      <w:r>
+        <w:rPr>
+          <w:lang w:val="es-MX"/>
+        </w:rPr>
         <w:t>(...).</w:t>
       </w:r>
     </w:p>
@@ -4174,31 +4748,31 @@
       </w:pPr>
     </w:lvl>
   </w:abstractNum>
-  <w:num w:numId="1" w16cid:durableId="1076711962">
+  <w:num w:numId="1" w16cid:durableId="390470296">
     <w:abstractNumId w:val="8"/>
   </w:num>
-  <w:num w:numId="2" w16cid:durableId="479926890">
+  <w:num w:numId="2" w16cid:durableId="471866762">
     <w:abstractNumId w:val="1"/>
   </w:num>
-  <w:num w:numId="3" w16cid:durableId="1330862085">
+  <w:num w:numId="3" w16cid:durableId="811288249">
     <w:abstractNumId w:val="6"/>
   </w:num>
-  <w:num w:numId="4" w16cid:durableId="2112846835">
+  <w:num w:numId="4" w16cid:durableId="1195801131">
     <w:abstractNumId w:val="3"/>
   </w:num>
-  <w:num w:numId="5" w16cid:durableId="1984196668">
+  <w:num w:numId="5" w16cid:durableId="1220169242">
     <w:abstractNumId w:val="7"/>
   </w:num>
-  <w:num w:numId="6" w16cid:durableId="1884439265">
+  <w:num w:numId="6" w16cid:durableId="1358582651">
     <w:abstractNumId w:val="0"/>
   </w:num>
-  <w:num w:numId="7" w16cid:durableId="1744333865">
+  <w:num w:numId="7" w16cid:durableId="1991905704">
     <w:abstractNumId w:val="4"/>
   </w:num>
-  <w:num w:numId="8" w16cid:durableId="1812361564">
+  <w:num w:numId="8" w16cid:durableId="161969541">
     <w:abstractNumId w:val="2"/>
   </w:num>
-  <w:num w:numId="9" w16cid:durableId="312830260">
+  <w:num w:numId="9" w16cid:durableId="9063154">
     <w:abstractNumId w:val="5"/>
   </w:num>
 </w:numbering>

</xml_diff>